<commit_message>
Fix blue TOC text and add spacing after 目次 title
Removed hyperlink character style (rStyle 'af') from TOC entries.
Added empty paragraph between 目次 title and TOC list.

Co-Authored-By: Claude Opus 4.6 <noreply@anthropic.com>
</commit_message>
<xml_diff>
--- a/template.docx
+++ b/template.docx
@@ -856,6 +856,7 @@
         <w:t>目次</w:t>
       </w:r>
     </w:p>
+    <w:p/>
     <w:p>
       <w:pPr>
         <w:pStyle w:val="10"/>
@@ -869,7 +870,6 @@
       </w:pPr>
       <w:r>
         <w:rPr>
-          <w:rStyle w:val="af"/>
           <w:rFonts w:ascii="ＭＳ Ｐ明朝" w:eastAsia="ＭＳ Ｐ明朝" w:hAnsi="ＭＳ Ｐ明朝" w:cs="Arial Unicode MS"/>
           <w:noProof/>
         </w:rPr>
@@ -913,7 +913,6 @@
       </w:pPr>
       <w:r>
         <w:rPr>
-          <w:rStyle w:val="af"/>
           <w:rFonts w:ascii="ＭＳ Ｐ明朝" w:eastAsia="ＭＳ Ｐ明朝" w:hAnsi="ＭＳ Ｐ明朝" w:cs="Arial"/>
           <w:noProof/>
         </w:rPr>
@@ -957,7 +956,6 @@
       </w:pPr>
       <w:r>
         <w:rPr>
-          <w:rStyle w:val="af"/>
           <w:rFonts w:ascii="ＭＳ Ｐ明朝" w:eastAsia="ＭＳ Ｐ明朝" w:hAnsi="ＭＳ Ｐ明朝" w:cs="Arial"/>
           <w:noProof/>
         </w:rPr>
@@ -1001,7 +999,6 @@
       </w:pPr>
       <w:r>
         <w:rPr>
-          <w:rStyle w:val="af"/>
           <w:rFonts w:ascii="ＭＳ Ｐ明朝" w:eastAsia="ＭＳ Ｐ明朝" w:hAnsi="ＭＳ Ｐ明朝" w:cs="Arial"/>
           <w:noProof/>
         </w:rPr>
@@ -1045,7 +1042,6 @@
       </w:pPr>
       <w:r>
         <w:rPr>
-          <w:rStyle w:val="af"/>
           <w:rFonts w:ascii="ＭＳ Ｐ明朝" w:eastAsia="ＭＳ Ｐ明朝" w:hAnsi="ＭＳ Ｐ明朝" w:cs="Arial"/>
           <w:noProof/>
         </w:rPr>
@@ -1089,7 +1085,6 @@
       </w:pPr>
       <w:r>
         <w:rPr>
-          <w:rStyle w:val="af"/>
           <w:rFonts w:ascii="ＭＳ Ｐ明朝" w:eastAsia="ＭＳ Ｐ明朝" w:hAnsi="ＭＳ Ｐ明朝" w:cs="Arial"/>
           <w:noProof/>
         </w:rPr>
@@ -1133,7 +1128,6 @@
       </w:pPr>
       <w:r>
         <w:rPr>
-          <w:rStyle w:val="af"/>
           <w:rFonts w:ascii="ＭＳ Ｐ明朝" w:eastAsia="ＭＳ Ｐ明朝" w:hAnsi="ＭＳ Ｐ明朝" w:cs="Arial"/>
           <w:noProof/>
         </w:rPr>
@@ -1177,7 +1171,6 @@
       </w:pPr>
       <w:r>
         <w:rPr>
-          <w:rStyle w:val="af"/>
           <w:rFonts w:ascii="ＭＳ Ｐ明朝" w:eastAsia="ＭＳ Ｐ明朝" w:hAnsi="ＭＳ Ｐ明朝" w:cs="Arial"/>
           <w:noProof/>
         </w:rPr>
@@ -1221,7 +1214,6 @@
       </w:pPr>
       <w:r>
         <w:rPr>
-          <w:rStyle w:val="af"/>
           <w:rFonts w:ascii="ＭＳ Ｐ明朝" w:eastAsia="ＭＳ Ｐ明朝" w:hAnsi="ＭＳ Ｐ明朝"/>
           <w:noProof/>
         </w:rPr>
@@ -1229,7 +1221,6 @@
       </w:r>
       <w:r>
         <w:rPr>
-          <w:rStyle w:val="af"/>
           <w:rFonts w:ascii="ＭＳ Ｐ明朝" w:eastAsia="ＭＳ Ｐ明朝" w:hAnsi="ＭＳ Ｐ明朝" w:cs="Arial"/>
           <w:noProof/>
         </w:rPr>
@@ -1269,7 +1260,6 @@
       </w:pPr>
       <w:r>
         <w:rPr>
-          <w:rStyle w:val="af"/>
           <w:rFonts w:ascii="ＭＳ Ｐ明朝" w:eastAsia="ＭＳ Ｐ明朝" w:hAnsi="ＭＳ Ｐ明朝" w:cs="ＭＳ ゴシック"/>
           <w:noProof/>
         </w:rPr>
@@ -1277,7 +1267,6 @@
       </w:r>
       <w:r>
         <w:rPr>
-          <w:rStyle w:val="af"/>
           <w:rFonts w:ascii="ＭＳ Ｐ明朝" w:eastAsia="ＭＳ Ｐ明朝" w:hAnsi="ＭＳ Ｐ明朝" w:cs="Arial"/>
           <w:noProof/>
         </w:rPr>
@@ -1321,7 +1310,6 @@
       </w:pPr>
       <w:r>
         <w:rPr>
-          <w:rStyle w:val="af"/>
           <w:rFonts w:ascii="ＭＳ Ｐ明朝" w:eastAsia="ＭＳ Ｐ明朝" w:hAnsi="ＭＳ Ｐ明朝" w:cs="Arial"/>
           <w:noProof/>
         </w:rPr>
@@ -1365,7 +1353,6 @@
       </w:pPr>
       <w:r>
         <w:rPr>
-          <w:rStyle w:val="af"/>
           <w:rFonts w:ascii="ＭＳ Ｐ明朝" w:eastAsia="ＭＳ Ｐ明朝" w:hAnsi="ＭＳ Ｐ明朝" w:cs="Arial"/>
           <w:noProof/>
         </w:rPr>
@@ -1405,7 +1392,6 @@
       </w:pPr>
       <w:r>
         <w:rPr>
-          <w:rStyle w:val="af"/>
           <w:rFonts w:ascii="ＭＳ Ｐ明朝" w:eastAsia="ＭＳ Ｐ明朝" w:hAnsi="ＭＳ Ｐ明朝" w:cs="ＭＳ ゴシック"/>
           <w:noProof/>
         </w:rPr>
@@ -1413,7 +1399,6 @@
       </w:r>
       <w:r>
         <w:rPr>
-          <w:rStyle w:val="af"/>
           <w:rFonts w:ascii="ＭＳ Ｐ明朝" w:eastAsia="ＭＳ Ｐ明朝" w:hAnsi="ＭＳ Ｐ明朝"/>
           <w:noProof/>
         </w:rPr>

</xml_diff>

<commit_message>
Fix Ibbotson report version: 2026年1月末版 -> 2025年12月末版
Co-Authored-By: Claude Opus 4.6 <noreply@anthropic.com>
</commit_message>
<xml_diff>
--- a/template.docx
+++ b/template.docx
@@ -4654,7 +4654,7 @@
                 <w:sz w:val="21"/>
                 <w:szCs w:val="21"/>
               </w:rPr>
-              <w:t>6</w:t>
+              <w:t>5</w:t>
             </w:r>
             <w:r>
               <w:rPr>
@@ -4670,7 +4670,7 @@
                 <w:sz w:val="21"/>
                 <w:szCs w:val="21"/>
               </w:rPr>
-              <w:t>1月</w:t>
+              <w:t>12</w:t>
             </w:r>
             <w:r>
               <w:rPr>
@@ -4678,7 +4678,7 @@
                 <w:sz w:val="21"/>
                 <w:szCs w:val="21"/>
               </w:rPr>
-              <w:t>末</w:t>
+              <w:t>月</w:t>
             </w:r>
             <w:r>
               <w:rPr>
@@ -4686,7 +4686,7 @@
                 <w:sz w:val="21"/>
                 <w:szCs w:val="21"/>
               </w:rPr>
-              <w:t>版)」 J</w:t>
+              <w:t xml:space="preserve">末版)」 </w:t>
             </w:r>
             <w:r>
               <w:rPr>
@@ -4694,7 +4694,7 @@
                 <w:sz w:val="21"/>
                 <w:szCs w:val="21"/>
               </w:rPr>
-              <w:t>apan L</w:t>
+              <w:t xml:space="preserve">Japan </w:t>
             </w:r>
             <w:r>
               <w:rPr>
@@ -4702,7 +4702,7 @@
                 <w:sz w:val="21"/>
                 <w:szCs w:val="21"/>
               </w:rPr>
-              <w:t>ong-</w:t>
+              <w:t>Long</w:t>
             </w:r>
             <w:r>
               <w:rPr>
@@ -4710,7 +4710,7 @@
                 <w:sz w:val="21"/>
                 <w:szCs w:val="21"/>
               </w:rPr>
-              <w:t>Horizon Equity R</w:t>
+              <w:t xml:space="preserve">-Horizon Equity </w:t>
             </w:r>
             <w:r>
               <w:rPr>
@@ -4718,7 +4718,7 @@
                 <w:sz w:val="21"/>
                 <w:szCs w:val="21"/>
               </w:rPr>
-              <w:t>isk Premia (</w:t>
+              <w:t xml:space="preserve">Risk Premia </w:t>
             </w:r>
             <w:r>
               <w:rPr>
@@ -4726,7 +4726,7 @@
                 <w:sz w:val="21"/>
                 <w:szCs w:val="21"/>
               </w:rPr>
-              <w:t>1</w:t>
+              <w:t>(</w:t>
             </w:r>
             <w:r>
               <w:rPr>
@@ -4734,7 +4734,7 @@
                 <w:sz w:val="21"/>
                 <w:szCs w:val="21"/>
               </w:rPr>
-              <w:t>952.1</w:t>
+              <w:t>1952.</w:t>
             </w:r>
             <w:r>
               <w:rPr>
@@ -4742,7 +4742,7 @@
                 <w:sz w:val="21"/>
                 <w:szCs w:val="21"/>
               </w:rPr>
-              <w:t>～</w:t>
+              <w:t>1</w:t>
             </w:r>
             <w:r>
               <w:rPr>
@@ -4750,7 +4750,7 @@
                 <w:sz w:val="21"/>
                 <w:szCs w:val="21"/>
               </w:rPr>
-              <w:t>2</w:t>
+              <w:t>～</w:t>
             </w:r>
             <w:r>
               <w:rPr>
@@ -4758,7 +4758,7 @@
                 <w:sz w:val="21"/>
                 <w:szCs w:val="21"/>
               </w:rPr>
-              <w:t>025</w:t>
+              <w:t>202</w:t>
             </w:r>
             <w:r>
               <w:rPr>
@@ -4766,7 +4766,7 @@
                 <w:sz w:val="21"/>
                 <w:szCs w:val="21"/>
               </w:rPr>
-              <w:t>.</w:t>
+              <w:t>5</w:t>
             </w:r>
             <w:r>
               <w:rPr>
@@ -4774,7 +4774,7 @@
                 <w:sz w:val="21"/>
                 <w:szCs w:val="21"/>
               </w:rPr>
-              <w:t>1</w:t>
+              <w:t>.</w:t>
             </w:r>
             <w:r>
               <w:rPr>
@@ -4782,7 +4782,7 @@
                 <w:sz w:val="21"/>
                 <w:szCs w:val="21"/>
               </w:rPr>
-              <w:t>2)</w:t>
+              <w:t>12</w:t>
             </w:r>
             <w:r>
               <w:rPr>
@@ -4790,7 +4790,7 @@
                 <w:sz w:val="21"/>
                 <w:szCs w:val="21"/>
               </w:rPr>
-              <w:t>。C</w:t>
+              <w:t>)。</w:t>
             </w:r>
             <w:r>
               <w:rPr>
@@ -4798,7 +4798,7 @@
                 <w:sz w:val="21"/>
                 <w:szCs w:val="21"/>
               </w:rPr>
-              <w:t>opyright © 2</w:t>
+              <w:t xml:space="preserve">Copyright © </w:t>
             </w:r>
             <w:r>
               <w:rPr>
@@ -4806,7 +4806,7 @@
                 <w:sz w:val="21"/>
                 <w:szCs w:val="21"/>
               </w:rPr>
-              <w:t xml:space="preserve">026 </w:t>
+              <w:t>2026</w:t>
             </w:r>
             <w:r>
               <w:rPr>
@@ -4814,7 +4814,7 @@
                 <w:sz w:val="21"/>
                 <w:szCs w:val="21"/>
               </w:rPr>
-              <w:t>I</w:t>
+              <w:t xml:space="preserve"> </w:t>
             </w:r>
             <w:r>
               <w:rPr>
@@ -4822,7 +4822,7 @@
                 <w:sz w:val="21"/>
                 <w:szCs w:val="21"/>
               </w:rPr>
-              <w:t>bbotson Associates Japan, Inc.(</w:t>
+              <w:t>Ibbotson Associates Japan, Inc.</w:t>
             </w:r>
             <w:r>
               <w:rPr>
@@ -4830,23 +4830,23 @@
                 <w:sz w:val="22"/>
                 <w:szCs w:val="22"/>
               </w:rPr>
-              <w:t>もしくは C</w:t>
-            </w:r>
-            <w:r>
-              <w:rPr>
-                <w:rFonts w:ascii="ＭＳ Ｐ明朝" w:eastAsia="ＭＳ Ｐ明朝" w:hAnsi="ＭＳ Ｐ明朝" w:cs="Arial"/>
-                <w:sz w:val="22"/>
-                <w:szCs w:val="22"/>
-              </w:rPr>
-              <w:t>opyright © 2</w:t>
-            </w:r>
-            <w:r>
-              <w:rPr>
-                <w:rFonts w:ascii="ＭＳ Ｐ明朝" w:eastAsia="ＭＳ Ｐ明朝" w:hAnsi="ＭＳ Ｐ明朝" w:cs="Arial"/>
-                <w:sz w:val="22"/>
-                <w:szCs w:val="22"/>
-              </w:rPr>
-              <w:t>026イ</w:t>
+              <w:t xml:space="preserve">(もしくは </w:t>
+            </w:r>
+            <w:r>
+              <w:rPr>
+                <w:rFonts w:ascii="ＭＳ Ｐ明朝" w:eastAsia="ＭＳ Ｐ明朝" w:hAnsi="ＭＳ Ｐ明朝" w:cs="Arial"/>
+                <w:sz w:val="22"/>
+                <w:szCs w:val="22"/>
+              </w:rPr>
+              <w:t xml:space="preserve">Copyright © </w:t>
+            </w:r>
+            <w:r>
+              <w:rPr>
+                <w:rFonts w:ascii="ＭＳ Ｐ明朝" w:eastAsia="ＭＳ Ｐ明朝" w:hAnsi="ＭＳ Ｐ明朝" w:cs="Arial"/>
+                <w:sz w:val="22"/>
+                <w:szCs w:val="22"/>
+              </w:rPr>
+              <w:t>2026</w:t>
             </w:r>
             <w:r>
               <w:rPr>
@@ -4854,23 +4854,23 @@
                 <w:sz w:val="22"/>
                 <w:szCs w:val="22"/>
               </w:rPr>
+              <w:t>イ</w:t>
+            </w:r>
+            <w:r>
+              <w:rPr>
+                <w:rFonts w:ascii="ＭＳ Ｐ明朝" w:eastAsia="ＭＳ Ｐ明朝" w:hAnsi="ＭＳ Ｐ明朝" w:cs="Times" w:hint="eastAsia"/>
+                <w:sz w:val="22"/>
+                <w:szCs w:val="22"/>
+              </w:rPr>
               <w:t>ボ</w:t>
             </w:r>
             <w:r>
               <w:rPr>
-                <w:rFonts w:ascii="ＭＳ Ｐ明朝" w:eastAsia="ＭＳ Ｐ明朝" w:hAnsi="ＭＳ Ｐ明朝" w:cs="Times" w:hint="eastAsia"/>
-                <w:sz w:val="22"/>
-                <w:szCs w:val="22"/>
-              </w:rPr>
-              <w:t>ッ</w:t>
-            </w:r>
-            <w:r>
-              <w:rPr>
                 <w:rFonts w:ascii="ＭＳ Ｐ明朝" w:eastAsia="ＭＳ Ｐ明朝" w:hAnsi="ＭＳ Ｐ明朝" w:cs="ＭＳ 明朝" w:hint="eastAsia"/>
                 <w:sz w:val="22"/>
                 <w:szCs w:val="22"/>
               </w:rPr>
-              <w:t>トソン・アソシエイツ・ジャパン株式会社)</w:t>
+              <w:t>ットソン・アソシエイツ・ジャパン株式会社</w:t>
             </w:r>
             <w:r>
               <w:rPr>
@@ -4878,7 +4878,7 @@
                 <w:sz w:val="22"/>
                 <w:szCs w:val="22"/>
               </w:rPr>
-              <w:t>全ての著作権等の権利を有する同社からの許諾を得て使用。</w:t>
+              <w:t>)全ての著作権等の権利を有する同社からの許諾を得て使用。</w:t>
             </w:r>
           </w:p>
           <w:p>

</xml_diff>

<commit_message>
Preserve TOC field codes and hyperlinks in template
- Keep fldChar, instrText, and hyperlink structure for TOC updates
- Only remove rStyle (blue text) from hyperlinks
- Fix Ibbotson version: 2025年1月末版 -> 2025年12月末版

Co-Authored-By: Claude Opus 4.6 <noreply@anthropic.com>
</commit_message>
<xml_diff>
--- a/template.docx
+++ b/template.docx
@@ -196,50 +196,7 @@
           <w:szCs w:val="52"/>
           <w:lang w:eastAsia="zh-CN"/>
         </w:rPr>
-      </w:pPr>
-    </w:p>
-    <w:p>
-      <w:pPr>
-        <w:rPr>
-          <w:rFonts w:ascii="ＭＳ Ｐ明朝" w:eastAsia="ＭＳ Ｐ明朝" w:hAnsi="ＭＳ Ｐ明朝" w:cs="Arial"/>
-          <w:b/>
-          <w:sz w:val="52"/>
-          <w:szCs w:val="52"/>
-          <w:lang w:eastAsia="zh-CN"/>
-        </w:rPr>
-      </w:pPr>
-    </w:p>
-    <w:p>
-      <w:pPr>
-        <w:rPr>
-          <w:rFonts w:ascii="ＭＳ Ｐ明朝" w:eastAsia="ＭＳ Ｐ明朝" w:hAnsi="ＭＳ Ｐ明朝" w:cs="Arial"/>
-          <w:b/>
-          <w:sz w:val="52"/>
-          <w:szCs w:val="52"/>
-          <w:lang w:eastAsia="zh-CN"/>
-        </w:rPr>
-      </w:pPr>
-    </w:p>
-    <w:p>
-      <w:pPr>
-        <w:rPr>
-          <w:rFonts w:ascii="ＭＳ Ｐ明朝" w:eastAsia="ＭＳ Ｐ明朝" w:hAnsi="ＭＳ Ｐ明朝" w:cs="Arial"/>
-          <w:b/>
-          <w:sz w:val="52"/>
-          <w:szCs w:val="52"/>
-          <w:lang w:eastAsia="zh-CN"/>
-        </w:rPr>
-      </w:pPr>
-    </w:p>
-    <w:p>
-      <w:pPr>
-        <w:rPr>
-          <w:rFonts w:ascii="ＭＳ Ｐ明朝" w:eastAsia="ＭＳ Ｐ明朝" w:hAnsi="ＭＳ Ｐ明朝" w:cs="Arial"/>
-          <w:b/>
-          <w:sz w:val="52"/>
-          <w:szCs w:val="52"/>
-          <w:lang w:eastAsia="zh-CN"/>
-        </w:rPr>
+        <w:pageBreakBefore/>
       </w:pPr>
     </w:p>
     <w:p>
@@ -333,7 +290,6 @@
         <w:rPr>
           <w:rFonts w:ascii="ＭＳ Ｐ明朝" w:eastAsia="ＭＳ Ｐ明朝" w:hAnsi="ＭＳ Ｐ明朝" w:cs="Arial"/>
         </w:rPr>
-        <w:pageBreakBefore/>
       </w:pPr>
     </w:p>
     <w:p>
@@ -349,6 +305,8 @@
         <w:rPr>
           <w:rFonts w:ascii="ＭＳ Ｐ明朝" w:eastAsia="ＭＳ Ｐ明朝" w:hAnsi="ＭＳ Ｐ明朝" w:cs="Arial"/>
           <w:lang w:eastAsia="zh-CN"/>
+          <w:sz w:val="22"/>
+          <w:szCs w:val="22"/>
         </w:rPr>
         <w:t>2026</w:t>
       </w:r>
@@ -356,6 +314,8 @@
         <w:rPr>
           <w:rFonts w:ascii="ＭＳ Ｐ明朝" w:eastAsia="ＭＳ Ｐ明朝" w:hAnsi="ＭＳ Ｐ明朝" w:cs="Arial" w:hint="eastAsia"/>
           <w:lang w:eastAsia="zh-CN"/>
+          <w:sz w:val="22"/>
+          <w:szCs w:val="22"/>
         </w:rPr>
         <w:t>年</w:t>
       </w:r>
@@ -363,6 +323,8 @@
         <w:rPr>
           <w:rFonts w:ascii="ＭＳ Ｐ明朝" w:eastAsia="ＭＳ Ｐ明朝" w:hAnsi="ＭＳ Ｐ明朝" w:cs="Arial"/>
           <w:lang w:eastAsia="zh-CN"/>
+          <w:sz w:val="22"/>
+          <w:szCs w:val="22"/>
         </w:rPr>
         <w:t>3</w:t>
       </w:r>
@@ -370,6 +332,8 @@
         <w:rPr>
           <w:rFonts w:ascii="ＭＳ Ｐ明朝" w:eastAsia="ＭＳ Ｐ明朝" w:hAnsi="ＭＳ Ｐ明朝" w:cs="Arial" w:hint="eastAsia"/>
           <w:lang w:eastAsia="zh-CN"/>
+          <w:sz w:val="22"/>
+          <w:szCs w:val="22"/>
         </w:rPr>
         <w:t>月</w:t>
       </w:r>
@@ -377,6 +341,8 @@
         <w:rPr>
           <w:rFonts w:ascii="ＭＳ Ｐ明朝" w:eastAsia="ＭＳ Ｐ明朝" w:hAnsi="ＭＳ Ｐ明朝" w:cs="Arial"/>
           <w:lang w:eastAsia="zh-CN"/>
+          <w:sz w:val="22"/>
+          <w:szCs w:val="22"/>
         </w:rPr>
         <w:t>2</w:t>
       </w:r>
@@ -384,6 +350,8 @@
         <w:rPr>
           <w:rFonts w:ascii="ＭＳ Ｐ明朝" w:eastAsia="ＭＳ Ｐ明朝" w:hAnsi="ＭＳ Ｐ明朝" w:cs="Arial"/>
           <w:lang w:eastAsia="zh-CN"/>
+          <w:sz w:val="22"/>
+          <w:szCs w:val="22"/>
         </w:rPr>
         <w:t>日</w:t>
       </w:r>
@@ -407,6 +375,8 @@
         <w:rPr>
           <w:rFonts w:ascii="ＭＳ Ｐ明朝" w:eastAsia="ＭＳ Ｐ明朝" w:hAnsi="ＭＳ Ｐ明朝" w:cs="Arial" w:hint="eastAsia"/>
           <w:lang w:eastAsia="zh-CN"/>
+          <w:sz w:val="22"/>
+          <w:szCs w:val="22"/>
         </w:rPr>
         <w:t>株式会社</w:t>
       </w:r>
@@ -414,6 +384,8 @@
         <w:rPr>
           <w:rFonts w:ascii="ＭＳ Ｐ明朝" w:eastAsia="ＭＳ Ｐ明朝" w:hAnsi="ＭＳ Ｐ明朝" w:cs="Arial" w:hint="eastAsia"/>
           <w:lang w:eastAsia="zh-CN"/>
+          <w:sz w:val="22"/>
+          <w:szCs w:val="22"/>
         </w:rPr>
         <w:t>ジェリービーンズグループ</w:t>
       </w:r>
@@ -429,6 +401,8 @@
         <w:rPr>
           <w:rFonts w:ascii="ＭＳ Ｐ明朝" w:eastAsia="ＭＳ Ｐ明朝" w:hAnsi="ＭＳ Ｐ明朝" w:cs="Arial" w:hint="eastAsia"/>
           <w:lang w:eastAsia="zh-CN"/>
+          <w:sz w:val="22"/>
+          <w:szCs w:val="22"/>
         </w:rPr>
         <w:t>代表</w:t>
       </w:r>
@@ -436,18 +410,24 @@
         <w:rPr>
           <w:rFonts w:ascii="ＭＳ Ｐ明朝" w:eastAsia="ＭＳ Ｐ明朝" w:hAnsi="ＭＳ Ｐ明朝" w:cs="Arial"/>
           <w:lang w:eastAsia="zh-CN"/>
+          <w:sz w:val="22"/>
+          <w:szCs w:val="22"/>
         </w:rPr>
         <w:t>取締役</w:t>
       </w:r>
       <w:r>
         <w:rPr>
           <w:rFonts w:ascii="ＭＳ Ｐ明朝" w:eastAsia="ＭＳ Ｐ明朝" w:hAnsi="ＭＳ Ｐ明朝" w:cs="Arial" w:hint="eastAsia"/>
+          <w:sz w:val="22"/>
+          <w:szCs w:val="22"/>
         </w:rPr>
         <w:t xml:space="preserve">社長　</w:t>
       </w:r>
       <w:r>
         <w:rPr>
           <w:rFonts w:ascii="ＭＳ Ｐ明朝" w:eastAsia="ＭＳ Ｐ明朝" w:hAnsi="ＭＳ Ｐ明朝" w:cs="Arial" w:hint="eastAsia"/>
+          <w:sz w:val="22"/>
+          <w:szCs w:val="22"/>
         </w:rPr>
         <w:t xml:space="preserve">宮崎　明　</w:t>
       </w:r>
@@ -456,6 +436,8 @@
           <w:rFonts w:ascii="ＭＳ Ｐ明朝" w:eastAsia="ＭＳ Ｐ明朝" w:hAnsi="ＭＳ Ｐ明朝" w:cs="Arial" w:hint="eastAsia"/>
           <w:color w:val="000000"/>
           <w:lang w:eastAsia="zh-CN"/>
+          <w:sz w:val="22"/>
+          <w:szCs w:val="22"/>
         </w:rPr>
         <w:t>殿</w:t>
       </w:r>
@@ -463,6 +445,8 @@
         <w:rPr>
           <w:rFonts w:ascii="ＭＳ Ｐ明朝" w:eastAsia="ＭＳ Ｐ明朝" w:hAnsi="ＭＳ Ｐ明朝" w:cs="Arial"/>
           <w:lang w:eastAsia="zh-CN"/>
+          <w:sz w:val="22"/>
+          <w:szCs w:val="22"/>
         </w:rPr>
       </w:r>
     </w:p>
@@ -487,6 +471,8 @@
         <w:rPr>
           <w:rFonts w:ascii="ＭＳ Ｐ明朝" w:eastAsia="ＭＳ Ｐ明朝" w:hAnsi="ＭＳ Ｐ明朝" w:cs="Arial"/>
           <w:lang w:eastAsia="zh-CN"/>
+          <w:sz w:val="22"/>
+          <w:szCs w:val="22"/>
         </w:rPr>
         <w:t>東京都千代田区永田町1丁目11番28号</w:t>
       </w:r>
@@ -502,18 +488,24 @@
       <w:r>
         <w:rPr>
           <w:rFonts w:ascii="ＭＳ Ｐ明朝" w:eastAsia="ＭＳ Ｐ明朝" w:hAnsi="ＭＳ Ｐ明朝" w:cs="Arial" w:hint="eastAsia"/>
+          <w:sz w:val="22"/>
+          <w:szCs w:val="22"/>
         </w:rPr>
         <w:t>合人社東京</w:t>
       </w:r>
       <w:r>
         <w:rPr>
           <w:rFonts w:ascii="ＭＳ Ｐ明朝" w:eastAsia="ＭＳ Ｐ明朝" w:hAnsi="ＭＳ Ｐ明朝" w:cs="Arial" w:hint="eastAsia"/>
+          <w:sz w:val="22"/>
+          <w:szCs w:val="22"/>
         </w:rPr>
         <w:t>永田町</w:t>
       </w:r>
       <w:r>
         <w:rPr>
           <w:rFonts w:ascii="ＭＳ Ｐ明朝" w:eastAsia="ＭＳ Ｐ明朝" w:hAnsi="ＭＳ Ｐ明朝" w:cs="Arial"/>
+          <w:sz w:val="22"/>
+          <w:szCs w:val="22"/>
         </w:rPr>
         <w:t>ビル9階</w:t>
       </w:r>
@@ -529,6 +521,8 @@
         <w:rPr>
           <w:rFonts w:ascii="ＭＳ Ｐ明朝" w:eastAsia="ＭＳ Ｐ明朝" w:hAnsi="ＭＳ Ｐ明朝" w:cs="Arial"/>
           <w:spacing w:val="1"/>
+          <w:sz w:val="22"/>
+          <w:szCs w:val="22"/>
         </w:rPr>
         <w:t>東京フィナンシャル・アドバイザーズ株式会社</w:t>
       </w:r>
@@ -544,30 +538,40 @@
       <w:r>
         <w:rPr>
           <w:rFonts w:ascii="ＭＳ Ｐ明朝" w:eastAsia="ＭＳ Ｐ明朝" w:hAnsi="ＭＳ Ｐ明朝" w:cs="Arial"/>
+          <w:sz w:val="22"/>
+          <w:szCs w:val="22"/>
         </w:rPr>
         <w:t>代表取締役　 能</w:t>
       </w:r>
       <w:r>
         <w:rPr>
           <w:rFonts w:ascii="ＭＳ Ｐ明朝" w:eastAsia="ＭＳ Ｐ明朝" w:hAnsi="ＭＳ Ｐ明朝" w:cs="Arial" w:hint="eastAsia"/>
+          <w:sz w:val="22"/>
+          <w:szCs w:val="22"/>
         </w:rPr>
         <w:t xml:space="preserve">　</w:t>
       </w:r>
       <w:r>
         <w:rPr>
           <w:rFonts w:ascii="ＭＳ Ｐ明朝" w:eastAsia="ＭＳ Ｐ明朝" w:hAnsi="ＭＳ Ｐ明朝" w:cs="Arial"/>
+          <w:sz w:val="22"/>
+          <w:szCs w:val="22"/>
         </w:rPr>
         <w:t>勢</w:t>
       </w:r>
       <w:r>
         <w:rPr>
           <w:rFonts w:ascii="ＭＳ Ｐ明朝" w:eastAsia="ＭＳ Ｐ明朝" w:hAnsi="ＭＳ Ｐ明朝" w:cs="Arial" w:hint="eastAsia"/>
+          <w:sz w:val="22"/>
+          <w:szCs w:val="22"/>
         </w:rPr>
         <w:t xml:space="preserve">　　</w:t>
       </w:r>
       <w:r>
         <w:rPr>
           <w:rFonts w:ascii="ＭＳ Ｐ明朝" w:eastAsia="ＭＳ Ｐ明朝" w:hAnsi="ＭＳ Ｐ明朝" w:cs="Arial"/>
+          <w:sz w:val="22"/>
+          <w:szCs w:val="22"/>
         </w:rPr>
         <w:t>元</w:t>
       </w:r>
@@ -839,7 +843,6 @@
     <w:p>
       <w:pPr>
         <w:ind w:firstLineChars="100" w:firstLine="220"/>
-        <w:jc w:val="center"/>
         <w:rPr>
           <w:rFonts w:ascii="ＭＳ Ｐ明朝" w:eastAsia="ＭＳ Ｐ明朝" w:hAnsi="ＭＳ Ｐ明朝" w:cs="Arial"/>
           <w:sz w:val="22"/>
@@ -847,16 +850,7 @@
         </w:rPr>
         <w:pageBreakBefore/>
       </w:pPr>
-      <w:r>
-        <w:rPr>
-          <w:rFonts w:ascii="ＭＳ Ｐ明朝" w:hAnsi="ＭＳ Ｐ明朝" w:eastAsia="ＭＳ Ｐ明朝"/>
-          <w:b/>
-          <w:sz w:val="32"/>
-        </w:rPr>
-        <w:t>目次</w:t>
-      </w:r>
     </w:p>
-    <w:p/>
     <w:p>
       <w:pPr>
         <w:pStyle w:val="10"/>
@@ -870,31 +864,85 @@
       </w:pPr>
       <w:r>
         <w:rPr>
-          <w:rFonts w:ascii="ＭＳ Ｐ明朝" w:eastAsia="ＭＳ Ｐ明朝" w:hAnsi="ＭＳ Ｐ明朝" w:cs="Arial Unicode MS"/>
-          <w:noProof/>
-        </w:rPr>
-        <w:t>Ⅰ　新株予約権の評価概要</w:t>
-      </w:r>
-      <w:r>
-        <w:rPr>
-          <w:noProof/>
-          <w:webHidden/>
-        </w:rPr>
-        <w:tab/>
-      </w:r>
-      <w:r>
-        <w:rPr>
-          <w:noProof/>
-          <w:webHidden/>
-        </w:rPr>
-      </w:r>
-      <w:r>
-        <w:rPr>
-          <w:noProof/>
-          <w:webHidden/>
-        </w:rPr>
-        <w:t>1</w:t>
-      </w:r>
+          <w:rFonts w:ascii="ＭＳ Ｐ明朝" w:eastAsia="ＭＳ Ｐ明朝" w:hAnsi="ＭＳ Ｐ明朝" w:cs="メイリオ"/>
+          <w:sz w:val="22"/>
+          <w:szCs w:val="22"/>
+        </w:rPr>
+        <w:fldChar w:fldCharType="begin"/>
+      </w:r>
+      <w:r>
+        <w:rPr>
+          <w:rFonts w:ascii="ＭＳ Ｐ明朝" w:eastAsia="ＭＳ Ｐ明朝" w:hAnsi="ＭＳ Ｐ明朝" w:cs="メイリオ"/>
+          <w:sz w:val="22"/>
+          <w:szCs w:val="22"/>
+        </w:rPr>
+        <w:instrText xml:space="preserve"> TOC \o "1-2" \h \z \u </w:instrText>
+      </w:r>
+      <w:r>
+        <w:rPr>
+          <w:rFonts w:ascii="ＭＳ Ｐ明朝" w:eastAsia="ＭＳ Ｐ明朝" w:hAnsi="ＭＳ Ｐ明朝" w:cs="メイリオ"/>
+          <w:sz w:val="22"/>
+          <w:szCs w:val="22"/>
+        </w:rPr>
+        <w:fldChar w:fldCharType="separate"/>
+      </w:r>
+      <w:hyperlink w:anchor="_Toc223971637" w:history="1">
+        <w:r>
+          <w:rPr>
+            <w:rFonts w:ascii="ＭＳ Ｐ明朝" w:eastAsia="ＭＳ Ｐ明朝" w:hAnsi="ＭＳ Ｐ明朝" w:cs="Arial Unicode MS"/>
+            <w:noProof/>
+          </w:rPr>
+          <w:t>Ⅰ　新株予約権の評価概要</w:t>
+        </w:r>
+        <w:r>
+          <w:rPr>
+            <w:noProof/>
+            <w:webHidden/>
+          </w:rPr>
+          <w:tab/>
+        </w:r>
+        <w:r>
+          <w:rPr>
+            <w:noProof/>
+            <w:webHidden/>
+          </w:rPr>
+          <w:fldChar w:fldCharType="begin"/>
+        </w:r>
+        <w:r>
+          <w:rPr>
+            <w:noProof/>
+            <w:webHidden/>
+          </w:rPr>
+          <w:instrText xml:space="preserve"> PAGEREF _Toc223971637 \h </w:instrText>
+        </w:r>
+        <w:r>
+          <w:rPr>
+            <w:noProof/>
+            <w:webHidden/>
+          </w:rPr>
+        </w:r>
+        <w:r>
+          <w:rPr>
+            <w:noProof/>
+            <w:webHidden/>
+          </w:rPr>
+          <w:fldChar w:fldCharType="separate"/>
+        </w:r>
+        <w:r>
+          <w:rPr>
+            <w:noProof/>
+            <w:webHidden/>
+          </w:rPr>
+          <w:t>1</w:t>
+        </w:r>
+        <w:r>
+          <w:rPr>
+            <w:noProof/>
+            <w:webHidden/>
+          </w:rPr>
+          <w:fldChar w:fldCharType="end"/>
+        </w:r>
+      </w:hyperlink>
     </w:p>
     <w:p>
       <w:pPr>
@@ -911,33 +959,63 @@
           <w14:ligatures w14:val="standardContextual"/>
         </w:rPr>
       </w:pPr>
-      <w:r>
-        <w:rPr>
-          <w:rFonts w:ascii="ＭＳ Ｐ明朝" w:eastAsia="ＭＳ Ｐ明朝" w:hAnsi="ＭＳ Ｐ明朝" w:cs="Arial"/>
-          <w:noProof/>
-        </w:rPr>
-        <w:t>1. 新株予約権の評価額</w:t>
-      </w:r>
-      <w:r>
-        <w:rPr>
-          <w:noProof/>
-          <w:webHidden/>
-        </w:rPr>
-        <w:tab/>
-      </w:r>
-      <w:r>
-        <w:rPr>
-          <w:noProof/>
-          <w:webHidden/>
-        </w:rPr>
-      </w:r>
-      <w:r>
-        <w:rPr>
-          <w:noProof/>
-          <w:webHidden/>
-        </w:rPr>
-        <w:t>1</w:t>
-      </w:r>
+      <w:hyperlink w:anchor="_Toc223971638" w:history="1">
+        <w:r>
+          <w:rPr>
+            <w:rFonts w:ascii="ＭＳ Ｐ明朝" w:eastAsia="ＭＳ Ｐ明朝" w:hAnsi="ＭＳ Ｐ明朝" w:cs="Arial"/>
+            <w:noProof/>
+          </w:rPr>
+          <w:t>1. 新株予約権の評価額</w:t>
+        </w:r>
+        <w:r>
+          <w:rPr>
+            <w:noProof/>
+            <w:webHidden/>
+          </w:rPr>
+          <w:tab/>
+        </w:r>
+        <w:r>
+          <w:rPr>
+            <w:noProof/>
+            <w:webHidden/>
+          </w:rPr>
+          <w:fldChar w:fldCharType="begin"/>
+        </w:r>
+        <w:r>
+          <w:rPr>
+            <w:noProof/>
+            <w:webHidden/>
+          </w:rPr>
+          <w:instrText xml:space="preserve"> PAGEREF _Toc223971638 \h </w:instrText>
+        </w:r>
+        <w:r>
+          <w:rPr>
+            <w:noProof/>
+            <w:webHidden/>
+          </w:rPr>
+        </w:r>
+        <w:r>
+          <w:rPr>
+            <w:noProof/>
+            <w:webHidden/>
+          </w:rPr>
+          <w:fldChar w:fldCharType="separate"/>
+        </w:r>
+        <w:r>
+          <w:rPr>
+            <w:noProof/>
+            <w:webHidden/>
+          </w:rPr>
+          <w:t>1</w:t>
+        </w:r>
+        <w:r>
+          <w:rPr>
+            <w:noProof/>
+            <w:webHidden/>
+          </w:rPr>
+          <w:fldChar w:fldCharType="end"/>
+        </w:r>
+      </w:hyperlink>
     </w:p>
     <w:p>
       <w:pPr>
@@ -954,33 +1032,63 @@
           <w14:ligatures w14:val="standardContextual"/>
         </w:rPr>
       </w:pPr>
-      <w:r>
-        <w:rPr>
-          <w:rFonts w:ascii="ＭＳ Ｐ明朝" w:eastAsia="ＭＳ Ｐ明朝" w:hAnsi="ＭＳ Ｐ明朝" w:cs="Arial"/>
-          <w:noProof/>
-        </w:rPr>
-        <w:t>2. 新株予約権の評価額の算定方法</w:t>
-      </w:r>
-      <w:r>
-        <w:rPr>
-          <w:noProof/>
-          <w:webHidden/>
-        </w:rPr>
-        <w:tab/>
-      </w:r>
-      <w:r>
-        <w:rPr>
-          <w:noProof/>
-          <w:webHidden/>
-        </w:rPr>
-      </w:r>
-      <w:r>
-        <w:rPr>
-          <w:noProof/>
-          <w:webHidden/>
-        </w:rPr>
-        <w:t>2</w:t>
-      </w:r>
+      <w:hyperlink w:anchor="_Toc223971639" w:history="1">
+        <w:r>
+          <w:rPr>
+            <w:rFonts w:ascii="ＭＳ Ｐ明朝" w:eastAsia="ＭＳ Ｐ明朝" w:hAnsi="ＭＳ Ｐ明朝" w:cs="Arial"/>
+            <w:noProof/>
+          </w:rPr>
+          <w:t>2. 新株予約権の評価額の算定方法</w:t>
+        </w:r>
+        <w:r>
+          <w:rPr>
+            <w:noProof/>
+            <w:webHidden/>
+          </w:rPr>
+          <w:tab/>
+        </w:r>
+        <w:r>
+          <w:rPr>
+            <w:noProof/>
+            <w:webHidden/>
+          </w:rPr>
+          <w:fldChar w:fldCharType="begin"/>
+        </w:r>
+        <w:r>
+          <w:rPr>
+            <w:noProof/>
+            <w:webHidden/>
+          </w:rPr>
+          <w:instrText xml:space="preserve"> PAGEREF _Toc223971639 \h </w:instrText>
+        </w:r>
+        <w:r>
+          <w:rPr>
+            <w:noProof/>
+            <w:webHidden/>
+          </w:rPr>
+        </w:r>
+        <w:r>
+          <w:rPr>
+            <w:noProof/>
+            <w:webHidden/>
+          </w:rPr>
+          <w:fldChar w:fldCharType="separate"/>
+        </w:r>
+        <w:r>
+          <w:rPr>
+            <w:noProof/>
+            <w:webHidden/>
+          </w:rPr>
+          <w:t>2</w:t>
+        </w:r>
+        <w:r>
+          <w:rPr>
+            <w:noProof/>
+            <w:webHidden/>
+          </w:rPr>
+          <w:fldChar w:fldCharType="end"/>
+        </w:r>
+      </w:hyperlink>
     </w:p>
     <w:p>
       <w:pPr>
@@ -997,33 +1105,63 @@
           <w14:ligatures w14:val="standardContextual"/>
         </w:rPr>
       </w:pPr>
-      <w:r>
-        <w:rPr>
-          <w:rFonts w:ascii="ＭＳ Ｐ明朝" w:eastAsia="ＭＳ Ｐ明朝" w:hAnsi="ＭＳ Ｐ明朝" w:cs="Arial"/>
-          <w:noProof/>
-        </w:rPr>
-        <w:t>3. 新株予約権の評価額の算定基準日</w:t>
-      </w:r>
-      <w:r>
-        <w:rPr>
-          <w:noProof/>
-          <w:webHidden/>
-        </w:rPr>
-        <w:tab/>
-      </w:r>
-      <w:r>
-        <w:rPr>
-          <w:noProof/>
-          <w:webHidden/>
-        </w:rPr>
-      </w:r>
-      <w:r>
-        <w:rPr>
-          <w:noProof/>
-          <w:webHidden/>
-        </w:rPr>
-        <w:t>2</w:t>
-      </w:r>
+      <w:hyperlink w:anchor="_Toc223971640" w:history="1">
+        <w:r>
+          <w:rPr>
+            <w:rFonts w:ascii="ＭＳ Ｐ明朝" w:eastAsia="ＭＳ Ｐ明朝" w:hAnsi="ＭＳ Ｐ明朝" w:cs="Arial"/>
+            <w:noProof/>
+          </w:rPr>
+          <w:t>3. 新株予約権の評価額の算定基準日</w:t>
+        </w:r>
+        <w:r>
+          <w:rPr>
+            <w:noProof/>
+            <w:webHidden/>
+          </w:rPr>
+          <w:tab/>
+        </w:r>
+        <w:r>
+          <w:rPr>
+            <w:noProof/>
+            <w:webHidden/>
+          </w:rPr>
+          <w:fldChar w:fldCharType="begin"/>
+        </w:r>
+        <w:r>
+          <w:rPr>
+            <w:noProof/>
+            <w:webHidden/>
+          </w:rPr>
+          <w:instrText xml:space="preserve"> PAGEREF _Toc223971640 \h </w:instrText>
+        </w:r>
+        <w:r>
+          <w:rPr>
+            <w:noProof/>
+            <w:webHidden/>
+          </w:rPr>
+        </w:r>
+        <w:r>
+          <w:rPr>
+            <w:noProof/>
+            <w:webHidden/>
+          </w:rPr>
+          <w:fldChar w:fldCharType="separate"/>
+        </w:r>
+        <w:r>
+          <w:rPr>
+            <w:noProof/>
+            <w:webHidden/>
+          </w:rPr>
+          <w:t>2</w:t>
+        </w:r>
+        <w:r>
+          <w:rPr>
+            <w:noProof/>
+            <w:webHidden/>
+          </w:rPr>
+          <w:fldChar w:fldCharType="end"/>
+        </w:r>
+      </w:hyperlink>
     </w:p>
     <w:p>
       <w:pPr>
@@ -1040,33 +1178,63 @@
           <w14:ligatures w14:val="standardContextual"/>
         </w:rPr>
       </w:pPr>
-      <w:r>
-        <w:rPr>
-          <w:rFonts w:ascii="ＭＳ Ｐ明朝" w:eastAsia="ＭＳ Ｐ明朝" w:hAnsi="ＭＳ Ｐ明朝" w:cs="Arial"/>
-          <w:noProof/>
-        </w:rPr>
-        <w:t>4. 新株予約権評価の目的</w:t>
-      </w:r>
-      <w:r>
-        <w:rPr>
-          <w:noProof/>
-          <w:webHidden/>
-        </w:rPr>
-        <w:tab/>
-      </w:r>
-      <w:r>
-        <w:rPr>
-          <w:noProof/>
-          <w:webHidden/>
-        </w:rPr>
-      </w:r>
-      <w:r>
-        <w:rPr>
-          <w:noProof/>
-          <w:webHidden/>
-        </w:rPr>
-        <w:t>2</w:t>
-      </w:r>
+      <w:hyperlink w:anchor="_Toc223971641" w:history="1">
+        <w:r>
+          <w:rPr>
+            <w:rFonts w:ascii="ＭＳ Ｐ明朝" w:eastAsia="ＭＳ Ｐ明朝" w:hAnsi="ＭＳ Ｐ明朝" w:cs="Arial"/>
+            <w:noProof/>
+          </w:rPr>
+          <w:t>4. 新株予約権評価の目的</w:t>
+        </w:r>
+        <w:r>
+          <w:rPr>
+            <w:noProof/>
+            <w:webHidden/>
+          </w:rPr>
+          <w:tab/>
+        </w:r>
+        <w:r>
+          <w:rPr>
+            <w:noProof/>
+            <w:webHidden/>
+          </w:rPr>
+          <w:fldChar w:fldCharType="begin"/>
+        </w:r>
+        <w:r>
+          <w:rPr>
+            <w:noProof/>
+            <w:webHidden/>
+          </w:rPr>
+          <w:instrText xml:space="preserve"> PAGEREF _Toc223971641 \h </w:instrText>
+        </w:r>
+        <w:r>
+          <w:rPr>
+            <w:noProof/>
+            <w:webHidden/>
+          </w:rPr>
+        </w:r>
+        <w:r>
+          <w:rPr>
+            <w:noProof/>
+            <w:webHidden/>
+          </w:rPr>
+          <w:fldChar w:fldCharType="separate"/>
+        </w:r>
+        <w:r>
+          <w:rPr>
+            <w:noProof/>
+            <w:webHidden/>
+          </w:rPr>
+          <w:t>2</w:t>
+        </w:r>
+        <w:r>
+          <w:rPr>
+            <w:noProof/>
+            <w:webHidden/>
+          </w:rPr>
+          <w:fldChar w:fldCharType="end"/>
+        </w:r>
+      </w:hyperlink>
     </w:p>
     <w:p>
       <w:pPr>
@@ -1083,33 +1251,63 @@
           <w14:ligatures w14:val="standardContextual"/>
         </w:rPr>
       </w:pPr>
-      <w:r>
-        <w:rPr>
-          <w:rFonts w:ascii="ＭＳ Ｐ明朝" w:eastAsia="ＭＳ Ｐ明朝" w:hAnsi="ＭＳ Ｐ明朝" w:cs="Arial"/>
-          <w:noProof/>
-        </w:rPr>
-        <w:t>5. 新株予約権の評価額の算定に当たって採用した変数</w:t>
-      </w:r>
-      <w:r>
-        <w:rPr>
-          <w:noProof/>
-          <w:webHidden/>
-        </w:rPr>
-        <w:tab/>
-      </w:r>
-      <w:r>
-        <w:rPr>
-          <w:noProof/>
-          <w:webHidden/>
-        </w:rPr>
-      </w:r>
-      <w:r>
-        <w:rPr>
-          <w:noProof/>
-          <w:webHidden/>
-        </w:rPr>
-        <w:t>3</w:t>
-      </w:r>
+      <w:hyperlink w:anchor="_Toc223971642" w:history="1">
+        <w:r>
+          <w:rPr>
+            <w:rFonts w:ascii="ＭＳ Ｐ明朝" w:eastAsia="ＭＳ Ｐ明朝" w:hAnsi="ＭＳ Ｐ明朝" w:cs="Arial"/>
+            <w:noProof/>
+          </w:rPr>
+          <w:t>5. 新株予約権の評価額の算定に当たって採用した変数</w:t>
+        </w:r>
+        <w:r>
+          <w:rPr>
+            <w:noProof/>
+            <w:webHidden/>
+          </w:rPr>
+          <w:tab/>
+        </w:r>
+        <w:r>
+          <w:rPr>
+            <w:noProof/>
+            <w:webHidden/>
+          </w:rPr>
+          <w:fldChar w:fldCharType="begin"/>
+        </w:r>
+        <w:r>
+          <w:rPr>
+            <w:noProof/>
+            <w:webHidden/>
+          </w:rPr>
+          <w:instrText xml:space="preserve"> PAGEREF _Toc223971642 \h </w:instrText>
+        </w:r>
+        <w:r>
+          <w:rPr>
+            <w:noProof/>
+            <w:webHidden/>
+          </w:rPr>
+        </w:r>
+        <w:r>
+          <w:rPr>
+            <w:noProof/>
+            <w:webHidden/>
+          </w:rPr>
+          <w:fldChar w:fldCharType="separate"/>
+        </w:r>
+        <w:r>
+          <w:rPr>
+            <w:noProof/>
+            <w:webHidden/>
+          </w:rPr>
+          <w:t>3</w:t>
+        </w:r>
+        <w:r>
+          <w:rPr>
+            <w:noProof/>
+            <w:webHidden/>
+          </w:rPr>
+          <w:fldChar w:fldCharType="end"/>
+        </w:r>
+      </w:hyperlink>
     </w:p>
     <w:p>
       <w:pPr>
@@ -1126,33 +1324,63 @@
           <w14:ligatures w14:val="standardContextual"/>
         </w:rPr>
       </w:pPr>
-      <w:r>
-        <w:rPr>
-          <w:rFonts w:ascii="ＭＳ Ｐ明朝" w:eastAsia="ＭＳ Ｐ明朝" w:hAnsi="ＭＳ Ｐ明朝" w:cs="Arial"/>
-          <w:noProof/>
-        </w:rPr>
-        <w:t>6. 新株予約権の評価額の算定に当たって採用した仮定</w:t>
-      </w:r>
-      <w:r>
-        <w:rPr>
-          <w:noProof/>
-          <w:webHidden/>
-        </w:rPr>
-        <w:tab/>
-      </w:r>
-      <w:r>
-        <w:rPr>
-          <w:noProof/>
-          <w:webHidden/>
-        </w:rPr>
-      </w:r>
-      <w:r>
-        <w:rPr>
-          <w:noProof/>
-          <w:webHidden/>
-        </w:rPr>
-        <w:t>5</w:t>
-      </w:r>
+      <w:hyperlink w:anchor="_Toc223971643" w:history="1">
+        <w:r>
+          <w:rPr>
+            <w:rFonts w:ascii="ＭＳ Ｐ明朝" w:eastAsia="ＭＳ Ｐ明朝" w:hAnsi="ＭＳ Ｐ明朝" w:cs="Arial"/>
+            <w:noProof/>
+          </w:rPr>
+          <w:t>6. 新株予約権の評価額の算定に当たって採用した仮定</w:t>
+        </w:r>
+        <w:r>
+          <w:rPr>
+            <w:noProof/>
+            <w:webHidden/>
+          </w:rPr>
+          <w:tab/>
+        </w:r>
+        <w:r>
+          <w:rPr>
+            <w:noProof/>
+            <w:webHidden/>
+          </w:rPr>
+          <w:fldChar w:fldCharType="begin"/>
+        </w:r>
+        <w:r>
+          <w:rPr>
+            <w:noProof/>
+            <w:webHidden/>
+          </w:rPr>
+          <w:instrText xml:space="preserve"> PAGEREF _Toc223971643 \h </w:instrText>
+        </w:r>
+        <w:r>
+          <w:rPr>
+            <w:noProof/>
+            <w:webHidden/>
+          </w:rPr>
+        </w:r>
+        <w:r>
+          <w:rPr>
+            <w:noProof/>
+            <w:webHidden/>
+          </w:rPr>
+          <w:fldChar w:fldCharType="separate"/>
+        </w:r>
+        <w:r>
+          <w:rPr>
+            <w:noProof/>
+            <w:webHidden/>
+          </w:rPr>
+          <w:t>5</w:t>
+        </w:r>
+        <w:r>
+          <w:rPr>
+            <w:noProof/>
+            <w:webHidden/>
+          </w:rPr>
+          <w:fldChar w:fldCharType="end"/>
+        </w:r>
+      </w:hyperlink>
     </w:p>
     <w:p>
       <w:pPr>
@@ -1169,33 +1397,63 @@
           <w14:ligatures w14:val="standardContextual"/>
         </w:rPr>
       </w:pPr>
-      <w:r>
-        <w:rPr>
-          <w:rFonts w:ascii="ＭＳ Ｐ明朝" w:eastAsia="ＭＳ Ｐ明朝" w:hAnsi="ＭＳ Ｐ明朝" w:cs="Arial"/>
-          <w:noProof/>
-        </w:rPr>
-        <w:t>7. 評価対象企業の概要（基準日現在）</w:t>
-      </w:r>
-      <w:r>
-        <w:rPr>
-          <w:noProof/>
-          <w:webHidden/>
-        </w:rPr>
-        <w:tab/>
-      </w:r>
-      <w:r>
-        <w:rPr>
-          <w:noProof/>
-          <w:webHidden/>
-        </w:rPr>
-      </w:r>
-      <w:r>
-        <w:rPr>
-          <w:noProof/>
-          <w:webHidden/>
-        </w:rPr>
-        <w:t>6</w:t>
-      </w:r>
+      <w:hyperlink w:anchor="_Toc223971644" w:history="1">
+        <w:r>
+          <w:rPr>
+            <w:rFonts w:ascii="ＭＳ Ｐ明朝" w:eastAsia="ＭＳ Ｐ明朝" w:hAnsi="ＭＳ Ｐ明朝" w:cs="Arial"/>
+            <w:noProof/>
+          </w:rPr>
+          <w:t>7. 評価対象企業の概要（基準日現在）</w:t>
+        </w:r>
+        <w:r>
+          <w:rPr>
+            <w:noProof/>
+            <w:webHidden/>
+          </w:rPr>
+          <w:tab/>
+        </w:r>
+        <w:r>
+          <w:rPr>
+            <w:noProof/>
+            <w:webHidden/>
+          </w:rPr>
+          <w:fldChar w:fldCharType="begin"/>
+        </w:r>
+        <w:r>
+          <w:rPr>
+            <w:noProof/>
+            <w:webHidden/>
+          </w:rPr>
+          <w:instrText xml:space="preserve"> PAGEREF _Toc223971644 \h </w:instrText>
+        </w:r>
+        <w:r>
+          <w:rPr>
+            <w:noProof/>
+            <w:webHidden/>
+          </w:rPr>
+        </w:r>
+        <w:r>
+          <w:rPr>
+            <w:noProof/>
+            <w:webHidden/>
+          </w:rPr>
+          <w:fldChar w:fldCharType="separate"/>
+        </w:r>
+        <w:r>
+          <w:rPr>
+            <w:noProof/>
+            <w:webHidden/>
+          </w:rPr>
+          <w:t>6</w:t>
+        </w:r>
+        <w:r>
+          <w:rPr>
+            <w:noProof/>
+            <w:webHidden/>
+          </w:rPr>
+          <w:fldChar w:fldCharType="end"/>
+        </w:r>
+      </w:hyperlink>
     </w:p>
     <w:p>
       <w:pPr>
@@ -1212,40 +1470,70 @@
           <w14:ligatures w14:val="standardContextual"/>
         </w:rPr>
       </w:pPr>
-      <w:r>
-        <w:rPr>
-          <w:rFonts w:ascii="ＭＳ Ｐ明朝" w:eastAsia="ＭＳ Ｐ明朝" w:hAnsi="ＭＳ Ｐ明朝"/>
-          <w:noProof/>
-        </w:rPr>
-        <w:t xml:space="preserve">8. </w:t>
-      </w:r>
-      <w:r>
-        <w:rPr>
-          <w:rFonts w:ascii="ＭＳ Ｐ明朝" w:eastAsia="ＭＳ Ｐ明朝" w:hAnsi="ＭＳ Ｐ明朝" w:cs="Arial"/>
-          <w:noProof/>
-        </w:rPr>
-        <w:t>新株予約権の概要</w:t>
-      </w:r>
-      <w:r>
-        <w:rPr>
-          <w:noProof/>
-          <w:webHidden/>
-        </w:rPr>
-        <w:tab/>
-      </w:r>
-      <w:r>
-        <w:rPr>
-          <w:noProof/>
-          <w:webHidden/>
-        </w:rPr>
-      </w:r>
-      <w:r>
-        <w:rPr>
-          <w:noProof/>
-          <w:webHidden/>
-        </w:rPr>
-        <w:t>7</w:t>
-      </w:r>
+      <w:hyperlink w:anchor="_Toc223971645" w:history="1">
+        <w:r>
+          <w:rPr>
+            <w:rFonts w:ascii="ＭＳ Ｐ明朝" w:eastAsia="ＭＳ Ｐ明朝" w:hAnsi="ＭＳ Ｐ明朝"/>
+            <w:noProof/>
+          </w:rPr>
+          <w:t xml:space="preserve">8. </w:t>
+        </w:r>
+        <w:r>
+          <w:rPr>
+            <w:rFonts w:ascii="ＭＳ Ｐ明朝" w:eastAsia="ＭＳ Ｐ明朝" w:hAnsi="ＭＳ Ｐ明朝" w:cs="Arial"/>
+            <w:noProof/>
+          </w:rPr>
+          <w:t>新株予約権の概要</w:t>
+        </w:r>
+        <w:r>
+          <w:rPr>
+            <w:noProof/>
+            <w:webHidden/>
+          </w:rPr>
+          <w:tab/>
+        </w:r>
+        <w:r>
+          <w:rPr>
+            <w:noProof/>
+            <w:webHidden/>
+          </w:rPr>
+          <w:fldChar w:fldCharType="begin"/>
+        </w:r>
+        <w:r>
+          <w:rPr>
+            <w:noProof/>
+            <w:webHidden/>
+          </w:rPr>
+          <w:instrText xml:space="preserve"> PAGEREF _Toc223971645 \h </w:instrText>
+        </w:r>
+        <w:r>
+          <w:rPr>
+            <w:noProof/>
+            <w:webHidden/>
+          </w:rPr>
+        </w:r>
+        <w:r>
+          <w:rPr>
+            <w:noProof/>
+            <w:webHidden/>
+          </w:rPr>
+          <w:fldChar w:fldCharType="separate"/>
+        </w:r>
+        <w:r>
+          <w:rPr>
+            <w:noProof/>
+            <w:webHidden/>
+          </w:rPr>
+          <w:t>7</w:t>
+        </w:r>
+        <w:r>
+          <w:rPr>
+            <w:noProof/>
+            <w:webHidden/>
+          </w:rPr>
+          <w:fldChar w:fldCharType="end"/>
+        </w:r>
+      </w:hyperlink>
     </w:p>
     <w:p>
       <w:pPr>
@@ -1258,40 +1546,70 @@
           <w14:ligatures w14:val="standardContextual"/>
         </w:rPr>
       </w:pPr>
-      <w:r>
-        <w:rPr>
-          <w:rFonts w:ascii="ＭＳ Ｐ明朝" w:eastAsia="ＭＳ Ｐ明朝" w:hAnsi="ＭＳ Ｐ明朝" w:cs="ＭＳ ゴシック"/>
-          <w:noProof/>
-        </w:rPr>
-        <w:t>Ⅱ</w:t>
-      </w:r>
-      <w:r>
-        <w:rPr>
-          <w:rFonts w:ascii="ＭＳ Ｐ明朝" w:eastAsia="ＭＳ Ｐ明朝" w:hAnsi="ＭＳ Ｐ明朝" w:cs="Arial"/>
-          <w:noProof/>
-        </w:rPr>
-        <w:t xml:space="preserve">　新株予約権の評価額算定の内容</w:t>
-      </w:r>
-      <w:r>
-        <w:rPr>
-          <w:noProof/>
-          <w:webHidden/>
-        </w:rPr>
-        <w:tab/>
-      </w:r>
-      <w:r>
-        <w:rPr>
-          <w:noProof/>
-          <w:webHidden/>
-        </w:rPr>
-      </w:r>
-      <w:r>
-        <w:rPr>
-          <w:noProof/>
-          <w:webHidden/>
-        </w:rPr>
-        <w:t>8</w:t>
-      </w:r>
+      <w:hyperlink w:anchor="_Toc223971646" w:history="1">
+        <w:r>
+          <w:rPr>
+            <w:rFonts w:ascii="ＭＳ Ｐ明朝" w:eastAsia="ＭＳ Ｐ明朝" w:hAnsi="ＭＳ Ｐ明朝" w:cs="ＭＳ ゴシック"/>
+            <w:noProof/>
+          </w:rPr>
+          <w:t>Ⅱ</w:t>
+        </w:r>
+        <w:r>
+          <w:rPr>
+            <w:rFonts w:ascii="ＭＳ Ｐ明朝" w:eastAsia="ＭＳ Ｐ明朝" w:hAnsi="ＭＳ Ｐ明朝" w:cs="Arial"/>
+            <w:noProof/>
+          </w:rPr>
+          <w:t xml:space="preserve">　新株予約権の評価額算定の内容</w:t>
+        </w:r>
+        <w:r>
+          <w:rPr>
+            <w:noProof/>
+            <w:webHidden/>
+          </w:rPr>
+          <w:tab/>
+        </w:r>
+        <w:r>
+          <w:rPr>
+            <w:noProof/>
+            <w:webHidden/>
+          </w:rPr>
+          <w:fldChar w:fldCharType="begin"/>
+        </w:r>
+        <w:r>
+          <w:rPr>
+            <w:noProof/>
+            <w:webHidden/>
+          </w:rPr>
+          <w:instrText xml:space="preserve"> PAGEREF _Toc223971646 \h </w:instrText>
+        </w:r>
+        <w:r>
+          <w:rPr>
+            <w:noProof/>
+            <w:webHidden/>
+          </w:rPr>
+        </w:r>
+        <w:r>
+          <w:rPr>
+            <w:noProof/>
+            <w:webHidden/>
+          </w:rPr>
+          <w:fldChar w:fldCharType="separate"/>
+        </w:r>
+        <w:r>
+          <w:rPr>
+            <w:noProof/>
+            <w:webHidden/>
+          </w:rPr>
+          <w:t>8</w:t>
+        </w:r>
+        <w:r>
+          <w:rPr>
+            <w:noProof/>
+            <w:webHidden/>
+          </w:rPr>
+          <w:fldChar w:fldCharType="end"/>
+        </w:r>
+      </w:hyperlink>
     </w:p>
     <w:p>
       <w:pPr>
@@ -1308,33 +1626,63 @@
           <w14:ligatures w14:val="standardContextual"/>
         </w:rPr>
       </w:pPr>
-      <w:r>
-        <w:rPr>
-          <w:rFonts w:ascii="ＭＳ Ｐ明朝" w:eastAsia="ＭＳ Ｐ明朝" w:hAnsi="ＭＳ Ｐ明朝" w:cs="Arial"/>
-          <w:noProof/>
-        </w:rPr>
-        <w:t>1. 算定方法の選択</w:t>
-      </w:r>
-      <w:r>
-        <w:rPr>
-          <w:noProof/>
-          <w:webHidden/>
-        </w:rPr>
-        <w:tab/>
-      </w:r>
-      <w:r>
-        <w:rPr>
-          <w:noProof/>
-          <w:webHidden/>
-        </w:rPr>
-      </w:r>
-      <w:r>
-        <w:rPr>
-          <w:noProof/>
-          <w:webHidden/>
-        </w:rPr>
-        <w:t>8</w:t>
-      </w:r>
+      <w:hyperlink w:anchor="_Toc223971647" w:history="1">
+        <w:r>
+          <w:rPr>
+            <w:rFonts w:ascii="ＭＳ Ｐ明朝" w:eastAsia="ＭＳ Ｐ明朝" w:hAnsi="ＭＳ Ｐ明朝" w:cs="Arial"/>
+            <w:noProof/>
+          </w:rPr>
+          <w:t>1. 算定方法の選択</w:t>
+        </w:r>
+        <w:r>
+          <w:rPr>
+            <w:noProof/>
+            <w:webHidden/>
+          </w:rPr>
+          <w:tab/>
+        </w:r>
+        <w:r>
+          <w:rPr>
+            <w:noProof/>
+            <w:webHidden/>
+          </w:rPr>
+          <w:fldChar w:fldCharType="begin"/>
+        </w:r>
+        <w:r>
+          <w:rPr>
+            <w:noProof/>
+            <w:webHidden/>
+          </w:rPr>
+          <w:instrText xml:space="preserve"> PAGEREF _Toc223971647 \h </w:instrText>
+        </w:r>
+        <w:r>
+          <w:rPr>
+            <w:noProof/>
+            <w:webHidden/>
+          </w:rPr>
+        </w:r>
+        <w:r>
+          <w:rPr>
+            <w:noProof/>
+            <w:webHidden/>
+          </w:rPr>
+          <w:fldChar w:fldCharType="separate"/>
+        </w:r>
+        <w:r>
+          <w:rPr>
+            <w:noProof/>
+            <w:webHidden/>
+          </w:rPr>
+          <w:t>8</w:t>
+        </w:r>
+        <w:r>
+          <w:rPr>
+            <w:noProof/>
+            <w:webHidden/>
+          </w:rPr>
+          <w:fldChar w:fldCharType="end"/>
+        </w:r>
+      </w:hyperlink>
     </w:p>
     <w:p>
       <w:pPr>
@@ -1351,33 +1699,63 @@
           <w14:ligatures w14:val="standardContextual"/>
         </w:rPr>
       </w:pPr>
-      <w:r>
-        <w:rPr>
-          <w:rFonts w:ascii="ＭＳ Ｐ明朝" w:eastAsia="ＭＳ Ｐ明朝" w:hAnsi="ＭＳ Ｐ明朝" w:cs="Arial"/>
-          <w:noProof/>
-        </w:rPr>
-        <w:t>2. モンテカルロ・シミュレーションによる算定方法</w:t>
-      </w:r>
-      <w:r>
-        <w:rPr>
-          <w:noProof/>
-          <w:webHidden/>
-        </w:rPr>
-        <w:tab/>
-      </w:r>
-      <w:r>
-        <w:rPr>
-          <w:noProof/>
-          <w:webHidden/>
-        </w:rPr>
-      </w:r>
-      <w:r>
-        <w:rPr>
-          <w:noProof/>
-          <w:webHidden/>
-        </w:rPr>
-        <w:t>9</w:t>
-      </w:r>
+      <w:hyperlink w:anchor="_Toc223971648" w:history="1">
+        <w:r>
+          <w:rPr>
+            <w:rFonts w:ascii="ＭＳ Ｐ明朝" w:eastAsia="ＭＳ Ｐ明朝" w:hAnsi="ＭＳ Ｐ明朝" w:cs="Arial"/>
+            <w:noProof/>
+          </w:rPr>
+          <w:t>2. モンテカルロ・シミュレーションによる算定方法</w:t>
+        </w:r>
+        <w:r>
+          <w:rPr>
+            <w:noProof/>
+            <w:webHidden/>
+          </w:rPr>
+          <w:tab/>
+        </w:r>
+        <w:r>
+          <w:rPr>
+            <w:noProof/>
+            <w:webHidden/>
+          </w:rPr>
+          <w:fldChar w:fldCharType="begin"/>
+        </w:r>
+        <w:r>
+          <w:rPr>
+            <w:noProof/>
+            <w:webHidden/>
+          </w:rPr>
+          <w:instrText xml:space="preserve"> PAGEREF _Toc223971648 \h </w:instrText>
+        </w:r>
+        <w:r>
+          <w:rPr>
+            <w:noProof/>
+            <w:webHidden/>
+          </w:rPr>
+        </w:r>
+        <w:r>
+          <w:rPr>
+            <w:noProof/>
+            <w:webHidden/>
+          </w:rPr>
+          <w:fldChar w:fldCharType="separate"/>
+        </w:r>
+        <w:r>
+          <w:rPr>
+            <w:noProof/>
+            <w:webHidden/>
+          </w:rPr>
+          <w:t>9</w:t>
+        </w:r>
+        <w:r>
+          <w:rPr>
+            <w:noProof/>
+            <w:webHidden/>
+          </w:rPr>
+          <w:fldChar w:fldCharType="end"/>
+        </w:r>
+      </w:hyperlink>
     </w:p>
     <w:p>
       <w:pPr>
@@ -1390,54 +1768,104 @@
           <w14:ligatures w14:val="standardContextual"/>
         </w:rPr>
       </w:pPr>
-      <w:r>
-        <w:rPr>
-          <w:rFonts w:ascii="ＭＳ Ｐ明朝" w:eastAsia="ＭＳ Ｐ明朝" w:hAnsi="ＭＳ Ｐ明朝" w:cs="ＭＳ ゴシック"/>
-          <w:noProof/>
-        </w:rPr>
-        <w:t>Ⅲ</w:t>
-      </w:r>
-      <w:r>
-        <w:rPr>
-          <w:rFonts w:ascii="ＭＳ Ｐ明朝" w:eastAsia="ＭＳ Ｐ明朝" w:hAnsi="ＭＳ Ｐ明朝"/>
-          <w:noProof/>
-        </w:rPr>
-        <w:t xml:space="preserve">　本報告書の利用に当たっての留意事項</w:t>
-      </w:r>
-      <w:r>
-        <w:rPr>
-          <w:noProof/>
-          <w:webHidden/>
-        </w:rPr>
-        <w:tab/>
-      </w:r>
-      <w:r>
-        <w:rPr>
-          <w:noProof/>
-          <w:webHidden/>
-        </w:rPr>
-      </w:r>
-      <w:r>
-        <w:rPr>
-          <w:noProof/>
-          <w:webHidden/>
-        </w:rPr>
-        <w:t>11</w:t>
-      </w:r>
+      <w:hyperlink w:anchor="_Toc223971649" w:history="1">
+        <w:r>
+          <w:rPr>
+            <w:rFonts w:ascii="ＭＳ Ｐ明朝" w:eastAsia="ＭＳ Ｐ明朝" w:hAnsi="ＭＳ Ｐ明朝" w:cs="ＭＳ ゴシック"/>
+            <w:noProof/>
+          </w:rPr>
+          <w:t>Ⅲ</w:t>
+        </w:r>
+        <w:r>
+          <w:rPr>
+            <w:rFonts w:ascii="ＭＳ Ｐ明朝" w:eastAsia="ＭＳ Ｐ明朝" w:hAnsi="ＭＳ Ｐ明朝"/>
+            <w:noProof/>
+          </w:rPr>
+          <w:t xml:space="preserve">　本報告書の利用に当たっての留意事項</w:t>
+        </w:r>
+        <w:r>
+          <w:rPr>
+            <w:noProof/>
+            <w:webHidden/>
+          </w:rPr>
+          <w:tab/>
+        </w:r>
+        <w:r>
+          <w:rPr>
+            <w:noProof/>
+            <w:webHidden/>
+          </w:rPr>
+          <w:fldChar w:fldCharType="begin"/>
+        </w:r>
+        <w:r>
+          <w:rPr>
+            <w:noProof/>
+            <w:webHidden/>
+          </w:rPr>
+          <w:instrText xml:space="preserve"> PAGEREF _Toc223971649 \h </w:instrText>
+        </w:r>
+        <w:r>
+          <w:rPr>
+            <w:noProof/>
+            <w:webHidden/>
+          </w:rPr>
+        </w:r>
+        <w:r>
+          <w:rPr>
+            <w:noProof/>
+            <w:webHidden/>
+          </w:rPr>
+          <w:fldChar w:fldCharType="separate"/>
+        </w:r>
+        <w:r>
+          <w:rPr>
+            <w:noProof/>
+            <w:webHidden/>
+          </w:rPr>
+          <w:t>11</w:t>
+        </w:r>
+        <w:r>
+          <w:rPr>
+            <w:noProof/>
+            <w:webHidden/>
+          </w:rPr>
+          <w:fldChar w:fldCharType="end"/>
+        </w:r>
+      </w:hyperlink>
     </w:p>
     <w:p>
       <w:pPr>
+        <w:ind w:left="240" w:firstLineChars="50" w:firstLine="110"/>
+        <w:rPr>
+          <w:rFonts w:ascii="ＭＳ Ｐ明朝" w:eastAsia="ＭＳ Ｐ明朝" w:hAnsi="ＭＳ Ｐ明朝" w:cs="メイリオ"/>
+          <w:sz w:val="22"/>
+          <w:szCs w:val="22"/>
+        </w:rPr>
+        <w:pageBreakBefore/>
+      </w:pPr>
+      <w:r>
+        <w:rPr>
+          <w:rFonts w:ascii="ＭＳ Ｐ明朝" w:eastAsia="ＭＳ Ｐ明朝" w:hAnsi="ＭＳ Ｐ明朝" w:cs="メイリオ"/>
+          <w:sz w:val="22"/>
+          <w:szCs w:val="22"/>
+        </w:rPr>
+        <w:fldChar w:fldCharType="end"/>
+      </w:r>
+    </w:p>
+    <w:p>
+      <w:pPr>
         <w:pStyle w:val="1"/>
         <w:rPr>
           <w:rFonts w:ascii="ＭＳ Ｐ明朝" w:eastAsia="ＭＳ Ｐ明朝" w:hAnsi="ＭＳ Ｐ明朝" w:cs="Arial Unicode MS"/>
         </w:rPr>
-        <w:pageBreakBefore/>
       </w:pPr>
       <w:bookmarkStart w:id="0" w:name="_Toc179738835"/>
       <w:bookmarkStart w:id="1" w:name="_Toc223971637"/>
       <w:r>
         <w:rPr>
           <w:rFonts w:ascii="ＭＳ Ｐ明朝" w:eastAsia="ＭＳ Ｐ明朝" w:hAnsi="ＭＳ Ｐ明朝" w:cs="Arial Unicode MS" w:hint="eastAsia"/>
+          <w:sz w:val="22"/>
+          <w:szCs w:val="22"/>
         </w:rPr>
         <w:lastRenderedPageBreak/>
         <w:t>Ⅰ</w:t>
@@ -1445,6 +1873,8 @@
       <w:r>
         <w:rPr>
           <w:rFonts w:ascii="ＭＳ Ｐ明朝" w:eastAsia="ＭＳ Ｐ明朝" w:hAnsi="ＭＳ Ｐ明朝" w:cs="Arial Unicode MS"/>
+          <w:sz w:val="22"/>
+          <w:szCs w:val="22"/>
         </w:rPr>
         <w:t xml:space="preserve">　新株予約権の評価</w:t>
       </w:r>
@@ -1452,6 +1882,8 @@
       <w:r>
         <w:rPr>
           <w:rFonts w:ascii="ＭＳ Ｐ明朝" w:eastAsia="ＭＳ Ｐ明朝" w:hAnsi="ＭＳ Ｐ明朝" w:cs="Arial Unicode MS" w:hint="eastAsia"/>
+          <w:sz w:val="22"/>
+          <w:szCs w:val="22"/>
         </w:rPr>
         <w:t>概要</w:t>
       </w:r>
@@ -1472,6 +1904,8 @@
       <w:r>
         <w:rPr>
           <w:rFonts w:ascii="ＭＳ Ｐ明朝" w:eastAsia="ＭＳ Ｐ明朝" w:hAnsi="ＭＳ Ｐ明朝" w:cs="Arial" w:hint="eastAsia"/>
+          <w:sz w:val="22"/>
+          <w:szCs w:val="22"/>
         </w:rPr>
         <w:t xml:space="preserve">1. </w:t>
       </w:r>
@@ -1511,6 +1945,8 @@
           <w:rFonts w:ascii="ＭＳ Ｐ明朝" w:eastAsia="ＭＳ Ｐ明朝" w:hAnsi="ＭＳ Ｐ明朝" w:cs="Arial"/>
           <w:b/>
           <w:u w:val="single"/>
+          <w:sz w:val="22"/>
+          <w:szCs w:val="22"/>
         </w:rPr>
         <w:t>公</w:t>
       </w:r>
@@ -1520,6 +1956,8 @@
           <w:b/>
           <w:color w:val="000000"/>
           <w:u w:val="single"/>
+          <w:sz w:val="22"/>
+          <w:szCs w:val="22"/>
         </w:rPr>
         <w:t>正価値</w:t>
       </w:r>
@@ -1529,6 +1967,8 @@
           <w:b/>
           <w:color w:val="000000"/>
           <w:u w:val="single"/>
+          <w:sz w:val="22"/>
+          <w:szCs w:val="22"/>
         </w:rPr>
         <w:t>：</w:t>
       </w:r>
@@ -1538,6 +1978,8 @@
           <w:b/>
           <w:color w:val="000000"/>
           <w:u w:val="single"/>
+          <w:sz w:val="22"/>
+          <w:szCs w:val="22"/>
         </w:rPr>
         <w:t>●</w:t>
       </w:r>
@@ -1547,6 +1989,8 @@
           <w:b/>
           <w:color w:val="000000"/>
           <w:u w:val="single"/>
+          <w:sz w:val="22"/>
+          <w:szCs w:val="22"/>
         </w:rPr>
         <w:t>円</w:t>
       </w:r>
@@ -1556,6 +2000,8 @@
           <w:b/>
           <w:color w:val="000000"/>
           <w:u w:val="single"/>
+          <w:sz w:val="22"/>
+          <w:szCs w:val="22"/>
         </w:rPr>
         <w:t>（</w:t>
       </w:r>
@@ -1565,6 +2011,8 @@
           <w:b/>
           <w:color w:val="000000"/>
           <w:u w:val="single"/>
+          <w:sz w:val="22"/>
+          <w:szCs w:val="22"/>
         </w:rPr>
         <w:t>●</w:t>
       </w:r>
@@ -1574,6 +2022,8 @@
           <w:b/>
           <w:color w:val="000000"/>
           <w:u w:val="single"/>
+          <w:sz w:val="22"/>
+          <w:szCs w:val="22"/>
         </w:rPr>
         <w:t>円/株　当初株価の</w:t>
       </w:r>
@@ -1583,6 +2033,8 @@
           <w:b/>
           <w:color w:val="000000"/>
           <w:u w:val="single"/>
+          <w:sz w:val="22"/>
+          <w:szCs w:val="22"/>
         </w:rPr>
         <w:t>●</w:t>
       </w:r>
@@ -1592,6 +2044,8 @@
           <w:b/>
           <w:color w:val="000000"/>
           <w:u w:val="single"/>
+          <w:sz w:val="22"/>
+          <w:szCs w:val="22"/>
         </w:rPr>
         <w:t>%</w:t>
       </w:r>
@@ -1601,6 +2055,8 @@
           <w:b/>
           <w:color w:val="000000"/>
           <w:u w:val="single"/>
+          <w:sz w:val="22"/>
+          <w:szCs w:val="22"/>
         </w:rPr>
         <w:t>）</w:t>
       </w:r>
@@ -2122,6 +2578,17 @@
     </w:p>
     <w:p>
       <w:pPr>
+        <w:ind w:left="360" w:firstLineChars="75" w:firstLine="165"/>
+        <w:rPr>
+          <w:rFonts w:ascii="ＭＳ Ｐ明朝" w:eastAsia="ＭＳ Ｐ明朝" w:hAnsi="ＭＳ Ｐ明朝" w:cs="Arial"/>
+          <w:sz w:val="22"/>
+          <w:szCs w:val="22"/>
+        </w:rPr>
+        <w:pageBreakBefore/>
+      </w:pPr>
+    </w:p>
+    <w:p>
+      <w:pPr>
         <w:pStyle w:val="2"/>
         <w:ind w:firstLineChars="100" w:firstLine="220"/>
         <w:rPr>
@@ -2129,7 +2596,6 @@
           <w:sz w:val="22"/>
           <w:szCs w:val="22"/>
         </w:rPr>
-        <w:pageBreakBefore/>
       </w:pPr>
       <w:bookmarkStart w:id="8" w:name="_Toc223971642"/>
       <w:r>
@@ -4670,7 +5136,7 @@
                 <w:sz w:val="21"/>
                 <w:szCs w:val="21"/>
               </w:rPr>
-              <w:t>12</w:t>
+              <w:t>12月</w:t>
             </w:r>
             <w:r>
               <w:rPr>
@@ -4678,7 +5144,7 @@
                 <w:sz w:val="21"/>
                 <w:szCs w:val="21"/>
               </w:rPr>
-              <w:t>月</w:t>
+              <w:t>末</w:t>
             </w:r>
             <w:r>
               <w:rPr>
@@ -4686,7 +5152,7 @@
                 <w:sz w:val="21"/>
                 <w:szCs w:val="21"/>
               </w:rPr>
-              <w:t xml:space="preserve">末版)」 </w:t>
+              <w:t>版)」 J</w:t>
             </w:r>
             <w:r>
               <w:rPr>
@@ -4694,7 +5160,7 @@
                 <w:sz w:val="21"/>
                 <w:szCs w:val="21"/>
               </w:rPr>
-              <w:t xml:space="preserve">Japan </w:t>
+              <w:t>apan L</w:t>
             </w:r>
             <w:r>
               <w:rPr>
@@ -4702,7 +5168,7 @@
                 <w:sz w:val="21"/>
                 <w:szCs w:val="21"/>
               </w:rPr>
-              <w:t>Long</w:t>
+              <w:t>ong-</w:t>
             </w:r>
             <w:r>
               <w:rPr>
@@ -4710,7 +5176,7 @@
                 <w:sz w:val="21"/>
                 <w:szCs w:val="21"/>
               </w:rPr>
-              <w:t xml:space="preserve">-Horizon Equity </w:t>
+              <w:t>Horizon Equity R</w:t>
             </w:r>
             <w:r>
               <w:rPr>
@@ -4718,7 +5184,7 @@
                 <w:sz w:val="21"/>
                 <w:szCs w:val="21"/>
               </w:rPr>
-              <w:t xml:space="preserve">Risk Premia </w:t>
+              <w:t>isk Premia (</w:t>
             </w:r>
             <w:r>
               <w:rPr>
@@ -4726,7 +5192,7 @@
                 <w:sz w:val="21"/>
                 <w:szCs w:val="21"/>
               </w:rPr>
-              <w:t>(</w:t>
+              <w:t>1</w:t>
             </w:r>
             <w:r>
               <w:rPr>
@@ -4734,7 +5200,7 @@
                 <w:sz w:val="21"/>
                 <w:szCs w:val="21"/>
               </w:rPr>
-              <w:t>1952.</w:t>
+              <w:t>952.1</w:t>
             </w:r>
             <w:r>
               <w:rPr>
@@ -4742,7 +5208,7 @@
                 <w:sz w:val="21"/>
                 <w:szCs w:val="21"/>
               </w:rPr>
-              <w:t>1</w:t>
+              <w:t>～</w:t>
             </w:r>
             <w:r>
               <w:rPr>
@@ -4750,7 +5216,7 @@
                 <w:sz w:val="21"/>
                 <w:szCs w:val="21"/>
               </w:rPr>
-              <w:t>～</w:t>
+              <w:t>2</w:t>
             </w:r>
             <w:r>
               <w:rPr>
@@ -4758,7 +5224,7 @@
                 <w:sz w:val="21"/>
                 <w:szCs w:val="21"/>
               </w:rPr>
-              <w:t>202</w:t>
+              <w:t>025</w:t>
             </w:r>
             <w:r>
               <w:rPr>
@@ -4766,7 +5232,7 @@
                 <w:sz w:val="21"/>
                 <w:szCs w:val="21"/>
               </w:rPr>
-              <w:t>5</w:t>
+              <w:t>.</w:t>
             </w:r>
             <w:r>
               <w:rPr>
@@ -4774,7 +5240,7 @@
                 <w:sz w:val="21"/>
                 <w:szCs w:val="21"/>
               </w:rPr>
-              <w:t>.</w:t>
+              <w:t>1</w:t>
             </w:r>
             <w:r>
               <w:rPr>
@@ -4782,7 +5248,7 @@
                 <w:sz w:val="21"/>
                 <w:szCs w:val="21"/>
               </w:rPr>
-              <w:t>12</w:t>
+              <w:t>2)</w:t>
             </w:r>
             <w:r>
               <w:rPr>
@@ -4790,7 +5256,7 @@
                 <w:sz w:val="21"/>
                 <w:szCs w:val="21"/>
               </w:rPr>
-              <w:t>)。</w:t>
+              <w:t>。C</w:t>
             </w:r>
             <w:r>
               <w:rPr>
@@ -4798,7 +5264,7 @@
                 <w:sz w:val="21"/>
                 <w:szCs w:val="21"/>
               </w:rPr>
-              <w:t xml:space="preserve">Copyright © </w:t>
+              <w:t>opyright © 2</w:t>
             </w:r>
             <w:r>
               <w:rPr>
@@ -4806,7 +5272,7 @@
                 <w:sz w:val="21"/>
                 <w:szCs w:val="21"/>
               </w:rPr>
-              <w:t>2026</w:t>
+              <w:t xml:space="preserve">026 </w:t>
             </w:r>
             <w:r>
               <w:rPr>
@@ -4814,7 +5280,7 @@
                 <w:sz w:val="21"/>
                 <w:szCs w:val="21"/>
               </w:rPr>
-              <w:t xml:space="preserve"> </w:t>
+              <w:t>I</w:t>
             </w:r>
             <w:r>
               <w:rPr>
@@ -4822,7 +5288,7 @@
                 <w:sz w:val="21"/>
                 <w:szCs w:val="21"/>
               </w:rPr>
-              <w:t>Ibbotson Associates Japan, Inc.</w:t>
+              <w:t>bbotson Associates Japan, Inc.(</w:t>
             </w:r>
             <w:r>
               <w:rPr>
@@ -4830,23 +5296,23 @@
                 <w:sz w:val="22"/>
                 <w:szCs w:val="22"/>
               </w:rPr>
-              <w:t xml:space="preserve">(もしくは </w:t>
-            </w:r>
-            <w:r>
-              <w:rPr>
-                <w:rFonts w:ascii="ＭＳ Ｐ明朝" w:eastAsia="ＭＳ Ｐ明朝" w:hAnsi="ＭＳ Ｐ明朝" w:cs="Arial"/>
-                <w:sz w:val="22"/>
-                <w:szCs w:val="22"/>
-              </w:rPr>
-              <w:t xml:space="preserve">Copyright © </w:t>
-            </w:r>
-            <w:r>
-              <w:rPr>
-                <w:rFonts w:ascii="ＭＳ Ｐ明朝" w:eastAsia="ＭＳ Ｐ明朝" w:hAnsi="ＭＳ Ｐ明朝" w:cs="Arial"/>
-                <w:sz w:val="22"/>
-                <w:szCs w:val="22"/>
-              </w:rPr>
-              <w:t>2026</w:t>
+              <w:t>もしくは C</w:t>
+            </w:r>
+            <w:r>
+              <w:rPr>
+                <w:rFonts w:ascii="ＭＳ Ｐ明朝" w:eastAsia="ＭＳ Ｐ明朝" w:hAnsi="ＭＳ Ｐ明朝" w:cs="Arial"/>
+                <w:sz w:val="22"/>
+                <w:szCs w:val="22"/>
+              </w:rPr>
+              <w:t>opyright © 2</w:t>
+            </w:r>
+            <w:r>
+              <w:rPr>
+                <w:rFonts w:ascii="ＭＳ Ｐ明朝" w:eastAsia="ＭＳ Ｐ明朝" w:hAnsi="ＭＳ Ｐ明朝" w:cs="Arial"/>
+                <w:sz w:val="22"/>
+                <w:szCs w:val="22"/>
+              </w:rPr>
+              <w:t>026イ</w:t>
             </w:r>
             <w:r>
               <w:rPr>
@@ -4854,7 +5320,7 @@
                 <w:sz w:val="22"/>
                 <w:szCs w:val="22"/>
               </w:rPr>
-              <w:t>イ</w:t>
+              <w:t>ボ</w:t>
             </w:r>
             <w:r>
               <w:rPr>
@@ -4862,7 +5328,7 @@
                 <w:sz w:val="22"/>
                 <w:szCs w:val="22"/>
               </w:rPr>
-              <w:t>ボ</w:t>
+              <w:t>ッ</w:t>
             </w:r>
             <w:r>
               <w:rPr>
@@ -4870,7 +5336,7 @@
                 <w:sz w:val="22"/>
                 <w:szCs w:val="22"/>
               </w:rPr>
-              <w:t>ットソン・アソシエイツ・ジャパン株式会社</w:t>
+              <w:t>トソン・アソシエイツ・ジャパン株式会社)</w:t>
             </w:r>
             <w:r>
               <w:rPr>
@@ -4878,7 +5344,7 @@
                 <w:sz w:val="22"/>
                 <w:szCs w:val="22"/>
               </w:rPr>
-              <w:t>)全ての著作権等の権利を有する同社からの許諾を得て使用。</w:t>
+              <w:t>全ての著作権等の権利を有する同社からの許諾を得て使用。</w:t>
             </w:r>
           </w:p>
           <w:p>
@@ -5516,6 +5982,17 @@
     </w:p>
     <w:p>
       <w:pPr>
+        <w:ind w:leftChars="342" w:left="821" w:firstLineChars="75" w:firstLine="165"/>
+        <w:rPr>
+          <w:rFonts w:ascii="ＭＳ Ｐ明朝" w:eastAsia="ＭＳ Ｐ明朝" w:hAnsi="ＭＳ Ｐ明朝" w:cs="Arial"/>
+          <w:sz w:val="22"/>
+          <w:szCs w:val="22"/>
+        </w:rPr>
+        <w:pageBreakBefore/>
+      </w:pPr>
+    </w:p>
+    <w:p>
+      <w:pPr>
         <w:pStyle w:val="2"/>
         <w:ind w:firstLineChars="100" w:firstLine="220"/>
         <w:rPr>
@@ -5523,10 +6000,9 @@
           <w:sz w:val="22"/>
           <w:szCs w:val="22"/>
         </w:rPr>
-        <w:pageBreakBefore/>
-      </w:pPr>
-      <w:bookmarkStart w:id="9" w:name="_Toc179738840"/>
-      <w:bookmarkStart w:id="10" w:name="_Toc223971643"/>
+      </w:pPr>
+      <w:bookmarkStart w:id="9" w:name="_Toc223971643"/>
+      <w:bookmarkStart w:id="10" w:name="_Toc179738840"/>
       <w:r>
         <w:rPr>
           <w:rFonts w:ascii="ＭＳ Ｐ明朝" w:eastAsia="ＭＳ Ｐ明朝" w:hAnsi="ＭＳ Ｐ明朝" w:cs="Arial"/>
@@ -5560,7 +6036,7 @@
         </w:rPr>
         <w:t>仮定</w:t>
       </w:r>
-      <w:bookmarkEnd w:id="10"/>
+      <w:bookmarkEnd w:id="9"/>
     </w:p>
     <w:p>
       <w:pPr>
@@ -6031,6 +6507,15 @@
     </w:p>
     <w:p>
       <w:pPr>
+        <w:ind w:firstLine="210"/>
+        <w:rPr>
+          <w:rFonts w:ascii="ＭＳ Ｐ明朝" w:eastAsia="ＭＳ Ｐ明朝" w:hAnsi="ＭＳ Ｐ明朝"/>
+        </w:rPr>
+        <w:pageBreakBefore/>
+      </w:pPr>
+    </w:p>
+    <w:p>
+      <w:pPr>
         <w:pStyle w:val="2"/>
         <w:ind w:firstLineChars="100" w:firstLine="220"/>
         <w:rPr>
@@ -6038,7 +6523,6 @@
           <w:sz w:val="22"/>
           <w:szCs w:val="22"/>
         </w:rPr>
-        <w:pageBreakBefore/>
       </w:pPr>
       <w:bookmarkStart w:id="11" w:name="_Toc223971644"/>
       <w:r>
@@ -6090,7 +6574,7 @@
         </w:rPr>
         <w:t>現在）</w:t>
       </w:r>
-      <w:bookmarkEnd w:id="9"/>
+      <w:bookmarkEnd w:id="10"/>
       <w:bookmarkEnd w:id="11"/>
     </w:p>
     <w:p>
@@ -6553,6 +7037,17 @@
     </w:p>
     <w:p>
       <w:pPr>
+        <w:ind w:leftChars="-1" w:left="-2" w:firstLineChars="363" w:firstLine="799"/>
+        <w:rPr>
+          <w:rFonts w:ascii="ＭＳ Ｐ明朝" w:eastAsia="ＭＳ Ｐ明朝" w:hAnsi="ＭＳ Ｐ明朝" w:cs="Arial"/>
+          <w:sz w:val="22"/>
+          <w:szCs w:val="22"/>
+        </w:rPr>
+        <w:pageBreakBefore/>
+      </w:pPr>
+    </w:p>
+    <w:p>
+      <w:pPr>
         <w:pStyle w:val="2"/>
         <w:ind w:firstLineChars="100" w:firstLine="240"/>
         <w:rPr>
@@ -6560,17 +7055,21 @@
           <w:sz w:val="22"/>
           <w:szCs w:val="22"/>
         </w:rPr>
-        <w:pageBreakBefore/>
       </w:pPr>
       <w:r>
         <w:rPr>
           <w:rFonts w:ascii="ＭＳ Ｐ明朝" w:eastAsia="ＭＳ Ｐ明朝" w:hAnsi="ＭＳ Ｐ明朝"/>
-        </w:rPr>
+          <w:sz w:val="22"/>
+          <w:szCs w:val="22"/>
+        </w:rPr>
+        <w:br w:type="page"/>
       </w:r>
       <w:bookmarkStart w:id="12" w:name="_Toc223971645"/>
       <w:r>
         <w:rPr>
           <w:rFonts w:ascii="ＭＳ Ｐ明朝" w:eastAsia="ＭＳ Ｐ明朝" w:hAnsi="ＭＳ Ｐ明朝" w:hint="eastAsia"/>
+          <w:sz w:val="22"/>
+          <w:szCs w:val="22"/>
         </w:rPr>
         <w:lastRenderedPageBreak/>
         <w:t>8</w:t>
@@ -6578,6 +7077,8 @@
       <w:r>
         <w:rPr>
           <w:rFonts w:ascii="ＭＳ Ｐ明朝" w:eastAsia="ＭＳ Ｐ明朝" w:hAnsi="ＭＳ Ｐ明朝" w:hint="eastAsia"/>
+          <w:sz w:val="22"/>
+          <w:szCs w:val="22"/>
         </w:rPr>
         <w:t xml:space="preserve">. </w:t>
       </w:r>
@@ -7287,16 +7788,28 @@
     </w:tbl>
     <w:p>
       <w:pPr>
+        <w:rPr>
+          <w:rFonts w:ascii="ＭＳ Ｐ明朝" w:eastAsia="ＭＳ Ｐ明朝" w:hAnsi="ＭＳ Ｐ明朝"/>
+          <w:sz w:val="21"/>
+          <w:szCs w:val="21"/>
+        </w:rPr>
+        <w:pageBreakBefore/>
+      </w:pPr>
+      <w:bookmarkStart w:id="13" w:name="_Toc179738843"/>
+    </w:p>
+    <w:p>
+      <w:pPr>
         <w:pStyle w:val="1"/>
         <w:rPr>
           <w:rFonts w:ascii="ＭＳ Ｐ明朝" w:eastAsia="ＭＳ Ｐ明朝" w:hAnsi="ＭＳ Ｐ明朝" w:cs="Arial"/>
         </w:rPr>
-        <w:pageBreakBefore/>
       </w:pPr>
       <w:bookmarkStart w:id="14" w:name="_Toc223971646"/>
       <w:r>
         <w:rPr>
           <w:rFonts w:ascii="ＭＳ Ｐ明朝" w:eastAsia="ＭＳ Ｐ明朝" w:hAnsi="ＭＳ Ｐ明朝" w:cs="ＭＳ ゴシック" w:hint="eastAsia"/>
+          <w:sz w:val="22"/>
+          <w:szCs w:val="22"/>
         </w:rPr>
         <w:lastRenderedPageBreak/>
         <w:t>Ⅱ</w:t>
@@ -7304,12 +7817,16 @@
       <w:r>
         <w:rPr>
           <w:rFonts w:ascii="ＭＳ Ｐ明朝" w:eastAsia="ＭＳ Ｐ明朝" w:hAnsi="ＭＳ Ｐ明朝" w:cs="Arial"/>
+          <w:sz w:val="22"/>
+          <w:szCs w:val="22"/>
         </w:rPr>
         <w:t xml:space="preserve">　新株予約権の評価額</w:t>
       </w:r>
       <w:r>
         <w:rPr>
           <w:rFonts w:ascii="ＭＳ Ｐ明朝" w:eastAsia="ＭＳ Ｐ明朝" w:hAnsi="ＭＳ Ｐ明朝" w:cs="Arial"/>
+          <w:sz w:val="22"/>
+          <w:szCs w:val="22"/>
         </w:rPr>
         <w:t>算定の内容</w:t>
       </w:r>
@@ -8062,7 +8579,7 @@
           <w:sz w:val="22"/>
           <w:szCs w:val="22"/>
         </w:rPr>
-        <w:object w:dxaOrig="3260" w:dyaOrig="640" w14:anchorId="610B483B">
+        <w:object w:dxaOrig="3260" w:dyaOrig="640" w14:anchorId="5FDB6589">
           <v:shapetype id="_x0000_t75" coordsize="21600,21600" o:spt="75" o:preferrelative="t" path="m@4@5l@4@11@9@11@9@5xe" filled="f" stroked="f">
             <v:stroke joinstyle="miter"/>
             <v:formulas>
@@ -8085,7 +8602,7 @@
           <v:shape id="_x0000_i1027" type="#_x0000_t75" alt="" style="width:163pt;height:31pt;mso-width-percent:0;mso-height-percent:0;mso-width-percent:0;mso-height-percent:0" o:ole="">
             <v:imagedata r:id="rId13" o:title=""/>
           </v:shape>
-          <o:OLEObject Type="Embed" ProgID="Equation.3" ShapeID="_x0000_i1027" DrawAspect="Content" ObjectID="_1834584540" r:id="rId14"/>
+          <o:OLEObject Type="Embed" ProgID="Equation.3" ShapeID="_x0000_i1027" DrawAspect="Content" ObjectID="_1834591869" r:id="rId14"/>
         </w:object>
       </w:r>
     </w:p>
@@ -8720,6 +9237,8 @@
           <w:rFonts w:ascii="ＭＳ Ｐ明朝" w:eastAsia="ＭＳ Ｐ明朝" w:hAnsi="ＭＳ Ｐ明朝" w:cs="Arial" w:hint="eastAsia"/>
           <w:iCs/>
           <w:noProof/>
+          <w:sz w:val="22"/>
+          <w:szCs w:val="22"/>
         </w:rPr>
         <w:t xml:space="preserve"> </w:t>
       </w:r>
@@ -8756,6 +9275,8 @@
         <w:rPr>
           <w:rFonts w:ascii="ＭＳ Ｐ明朝" w:eastAsia="ＭＳ Ｐ明朝" w:hAnsi="ＭＳ Ｐ明朝" w:cs="Arial" w:hint="eastAsia"/>
           <w:iCs/>
+          <w:sz w:val="22"/>
+          <w:szCs w:val="22"/>
         </w:rPr>
         <w:t xml:space="preserve"> </w:t>
       </w:r>
@@ -9559,6 +10080,7 @@
           <w:sz w:val="22"/>
           <w:szCs w:val="22"/>
         </w:rPr>
+        <w:pageBreakBefore/>
       </w:pPr>
       <w:r>
         <w:rPr>
@@ -9568,11 +10090,11 @@
           <w:sz w:val="22"/>
           <w:szCs w:val="22"/>
         </w:rPr>
-        <w:object w:dxaOrig="13" w:dyaOrig="13" w14:anchorId="21754F30">
+        <w:object w:dxaOrig="13" w:dyaOrig="13" w14:anchorId="5C98AF11">
           <v:shape id="_x0000_i1026" type="#_x0000_t75" alt="" style="width:1pt;height:1pt;mso-width-percent:0;mso-height-percent:0;mso-width-percent:0;mso-height-percent:0" o:ole="">
             <v:imagedata r:id="rId15" o:title=""/>
           </v:shape>
-          <o:OLEObject Type="Embed" ProgID="Equation.3" ShapeID="_x0000_i1026" DrawAspect="Content" ObjectID="_1834584541" r:id="rId16"/>
+          <o:OLEObject Type="Embed" ProgID="Equation.3" ShapeID="_x0000_i1026" DrawAspect="Content" ObjectID="_1834591870" r:id="rId16"/>
         </w:object>
       </w:r>
       <w:r>
@@ -9583,11 +10105,11 @@
           <w:sz w:val="22"/>
           <w:szCs w:val="22"/>
         </w:rPr>
-        <w:object w:dxaOrig="13" w:dyaOrig="13" w14:anchorId="3F2C4B38">
+        <w:object w:dxaOrig="13" w:dyaOrig="13" w14:anchorId="3D63DD3E">
           <v:shape id="_x0000_i1025" type="#_x0000_t75" alt="" style="width:1pt;height:1pt;mso-width-percent:0;mso-height-percent:0;mso-width-percent:0;mso-height-percent:0" o:ole="">
             <v:imagedata r:id="rId17" o:title=""/>
           </v:shape>
-          <o:OLEObject Type="Embed" ProgID="Equation.3" ShapeID="_x0000_i1025" DrawAspect="Content" ObjectID="_1834584542" r:id="rId18"/>
+          <o:OLEObject Type="Embed" ProgID="Equation.3" ShapeID="_x0000_i1025" DrawAspect="Content" ObjectID="_1834591871" r:id="rId18"/>
         </w:object>
       </w:r>
     </w:p>
@@ -9637,11 +10159,21 @@
     </w:p>
     <w:p>
       <w:pPr>
+        <w:ind w:firstLineChars="100" w:firstLine="220"/>
+        <w:rPr>
+          <w:rFonts w:ascii="ＭＳ Ｐ明朝" w:eastAsia="ＭＳ Ｐ明朝" w:hAnsi="ＭＳ Ｐ明朝" w:cs="Arial"/>
+          <w:sz w:val="22"/>
+          <w:szCs w:val="22"/>
+        </w:rPr>
+        <w:pageBreakBefore/>
+      </w:pPr>
+    </w:p>
+    <w:p>
+      <w:pPr>
         <w:pStyle w:val="1"/>
         <w:rPr>
           <w:rFonts w:ascii="ＭＳ Ｐ明朝" w:eastAsia="ＭＳ Ｐ明朝" w:hAnsi="ＭＳ Ｐ明朝"/>
         </w:rPr>
-        <w:pageBreakBefore/>
       </w:pPr>
       <w:bookmarkStart w:id="21" w:name="_Toc179738849"/>
       <w:bookmarkStart w:id="22" w:name="_Toc179738850"/>
@@ -9662,6 +10194,8 @@
       <w:r>
         <w:rPr>
           <w:rFonts w:ascii="ＭＳ Ｐ明朝" w:eastAsia="ＭＳ Ｐ明朝" w:hAnsi="ＭＳ Ｐ明朝" w:cs="ＭＳ ゴシック" w:hint="eastAsia"/>
+          <w:sz w:val="22"/>
+          <w:szCs w:val="22"/>
         </w:rPr>
         <w:lastRenderedPageBreak/>
         <w:t>Ⅲ</w:t>
@@ -9669,6 +10203,8 @@
       <w:r>
         <w:rPr>
           <w:rFonts w:ascii="ＭＳ Ｐ明朝" w:eastAsia="ＭＳ Ｐ明朝" w:hAnsi="ＭＳ Ｐ明朝"/>
+          <w:sz w:val="22"/>
+          <w:szCs w:val="22"/>
         </w:rPr>
         <w:t xml:space="preserve">　本報告書の利用に当たっての留意事項</w:t>
       </w:r>
@@ -9733,6 +10269,17 @@
         </w:rPr>
         <w:t>以　上</w:t>
       </w:r>
+    </w:p>
+    <w:p>
+      <w:pPr>
+        <w:ind w:left="240" w:firstLineChars="50" w:firstLine="110"/>
+        <w:rPr>
+          <w:rFonts w:ascii="ＭＳ Ｐ明朝" w:eastAsia="ＭＳ Ｐ明朝" w:hAnsi="ＭＳ Ｐ明朝" w:cs="Arial"/>
+          <w:sz w:val="22"/>
+          <w:szCs w:val="22"/>
+        </w:rPr>
+        <w:pageBreakBefore/>
+      </w:pPr>
     </w:p>
     <w:sectPr>
       <w:headerReference w:type="even" r:id="rId19"/>
@@ -9890,7 +10437,7 @@
       <w:rPr>
         <w:noProof/>
       </w:rPr>
-      <w:pict w14:anchorId="65F466BF">
+      <w:pict w14:anchorId="41EE3317">
         <v:shapetype id="_x0000_t136" coordsize="21600,21600" o:spt="136" adj="10800" path="m@7,l@8,m@5,21600l@6,21600e">
           <v:formulas>
             <v:f eqn="sum #0 0 10800"/>
@@ -9936,7 +10483,7 @@
       <w:rPr>
         <w:noProof/>
       </w:rPr>
-      <w:pict w14:anchorId="4AEB168F">
+      <w:pict w14:anchorId="63E27442">
         <v:shapetype id="_x0000_t136" coordsize="21600,21600" o:spt="136" adj="10800" path="m@7,l@8,m@5,21600l@6,21600e">
           <v:formulas>
             <v:f eqn="sum #0 0 10800"/>
@@ -10006,7 +10553,7 @@
       <w:rPr>
         <w:noProof/>
       </w:rPr>
-      <w:pict w14:anchorId="14EE537D">
+      <w:pict w14:anchorId="2EBBE74F">
         <v:shapetype id="_x0000_t136" coordsize="21600,21600" o:spt="136" adj="10800" path="m@7,l@8,m@5,21600l@6,21600e">
           <v:formulas>
             <v:f eqn="sum #0 0 10800"/>
@@ -10052,7 +10599,7 @@
       <w:rPr>
         <w:noProof/>
       </w:rPr>
-      <w:pict w14:anchorId="7F8219A3">
+      <w:pict w14:anchorId="1C7B4D21">
         <v:shapetype id="_x0000_t136" coordsize="21600,21600" o:spt="136" adj="10800" path="m@7,l@8,m@5,21600l@6,21600e">
           <v:formulas>
             <v:f eqn="sum #0 0 10800"/>
@@ -10098,7 +10645,7 @@
       <w:rPr>
         <w:noProof/>
       </w:rPr>
-      <w:pict w14:anchorId="47524EB7">
+      <w:pict w14:anchorId="458F8BD0">
         <v:shapetype id="_x0000_t136" coordsize="21600,21600" o:spt="136" adj="10800" path="m@7,l@8,m@5,21600l@6,21600e">
           <v:formulas>
             <v:f eqn="sum #0 0 10800"/>
@@ -10168,7 +10715,7 @@
       <w:rPr>
         <w:noProof/>
       </w:rPr>
-      <w:pict w14:anchorId="3E0618C1">
+      <w:pict w14:anchorId="466A574F">
         <v:shapetype id="_x0000_t136" coordsize="21600,21600" o:spt="136" adj="10800" path="m@7,l@8,m@5,21600l@6,21600e">
           <v:formulas>
             <v:f eqn="sum #0 0 10800"/>

</xml_diff>

<commit_message>
Restore template layout with TOC field codes preserved
- Used old template layout (correct page breaks, logo position)
- Transplanted TOC hyperlinks and field codes from source document
- No duplicate page breaks, no blue text, Ibbotson 2025年12月末版

Co-Authored-By: Claude Opus 4.6 <noreply@anthropic.com>
</commit_message>
<xml_diff>
--- a/template.docx
+++ b/template.docx
@@ -196,7 +196,50 @@
           <w:szCs w:val="52"/>
           <w:lang w:eastAsia="zh-CN"/>
         </w:rPr>
-        <w:pageBreakBefore/>
+      </w:pPr>
+    </w:p>
+    <w:p>
+      <w:pPr>
+        <w:rPr>
+          <w:rFonts w:ascii="ＭＳ Ｐ明朝" w:eastAsia="ＭＳ Ｐ明朝" w:hAnsi="ＭＳ Ｐ明朝" w:cs="Arial"/>
+          <w:b/>
+          <w:sz w:val="52"/>
+          <w:szCs w:val="52"/>
+          <w:lang w:eastAsia="zh-CN"/>
+        </w:rPr>
+      </w:pPr>
+    </w:p>
+    <w:p>
+      <w:pPr>
+        <w:rPr>
+          <w:rFonts w:ascii="ＭＳ Ｐ明朝" w:eastAsia="ＭＳ Ｐ明朝" w:hAnsi="ＭＳ Ｐ明朝" w:cs="Arial"/>
+          <w:b/>
+          <w:sz w:val="52"/>
+          <w:szCs w:val="52"/>
+          <w:lang w:eastAsia="zh-CN"/>
+        </w:rPr>
+      </w:pPr>
+    </w:p>
+    <w:p>
+      <w:pPr>
+        <w:rPr>
+          <w:rFonts w:ascii="ＭＳ Ｐ明朝" w:eastAsia="ＭＳ Ｐ明朝" w:hAnsi="ＭＳ Ｐ明朝" w:cs="Arial"/>
+          <w:b/>
+          <w:sz w:val="52"/>
+          <w:szCs w:val="52"/>
+          <w:lang w:eastAsia="zh-CN"/>
+        </w:rPr>
+      </w:pPr>
+    </w:p>
+    <w:p>
+      <w:pPr>
+        <w:rPr>
+          <w:rFonts w:ascii="ＭＳ Ｐ明朝" w:eastAsia="ＭＳ Ｐ明朝" w:hAnsi="ＭＳ Ｐ明朝" w:cs="Arial"/>
+          <w:b/>
+          <w:sz w:val="52"/>
+          <w:szCs w:val="52"/>
+          <w:lang w:eastAsia="zh-CN"/>
+        </w:rPr>
       </w:pPr>
     </w:p>
     <w:p>
@@ -290,6 +333,7 @@
         <w:rPr>
           <w:rFonts w:ascii="ＭＳ Ｐ明朝" w:eastAsia="ＭＳ Ｐ明朝" w:hAnsi="ＭＳ Ｐ明朝" w:cs="Arial"/>
         </w:rPr>
+        <w:pageBreakBefore/>
       </w:pPr>
     </w:p>
     <w:p>
@@ -305,8 +349,6 @@
         <w:rPr>
           <w:rFonts w:ascii="ＭＳ Ｐ明朝" w:eastAsia="ＭＳ Ｐ明朝" w:hAnsi="ＭＳ Ｐ明朝" w:cs="Arial"/>
           <w:lang w:eastAsia="zh-CN"/>
-          <w:sz w:val="22"/>
-          <w:szCs w:val="22"/>
         </w:rPr>
         <w:t>2026</w:t>
       </w:r>
@@ -314,8 +356,6 @@
         <w:rPr>
           <w:rFonts w:ascii="ＭＳ Ｐ明朝" w:eastAsia="ＭＳ Ｐ明朝" w:hAnsi="ＭＳ Ｐ明朝" w:cs="Arial" w:hint="eastAsia"/>
           <w:lang w:eastAsia="zh-CN"/>
-          <w:sz w:val="22"/>
-          <w:szCs w:val="22"/>
         </w:rPr>
         <w:t>年</w:t>
       </w:r>
@@ -323,8 +363,6 @@
         <w:rPr>
           <w:rFonts w:ascii="ＭＳ Ｐ明朝" w:eastAsia="ＭＳ Ｐ明朝" w:hAnsi="ＭＳ Ｐ明朝" w:cs="Arial"/>
           <w:lang w:eastAsia="zh-CN"/>
-          <w:sz w:val="22"/>
-          <w:szCs w:val="22"/>
         </w:rPr>
         <w:t>3</w:t>
       </w:r>
@@ -332,8 +370,6 @@
         <w:rPr>
           <w:rFonts w:ascii="ＭＳ Ｐ明朝" w:eastAsia="ＭＳ Ｐ明朝" w:hAnsi="ＭＳ Ｐ明朝" w:cs="Arial" w:hint="eastAsia"/>
           <w:lang w:eastAsia="zh-CN"/>
-          <w:sz w:val="22"/>
-          <w:szCs w:val="22"/>
         </w:rPr>
         <w:t>月</w:t>
       </w:r>
@@ -341,8 +377,6 @@
         <w:rPr>
           <w:rFonts w:ascii="ＭＳ Ｐ明朝" w:eastAsia="ＭＳ Ｐ明朝" w:hAnsi="ＭＳ Ｐ明朝" w:cs="Arial"/>
           <w:lang w:eastAsia="zh-CN"/>
-          <w:sz w:val="22"/>
-          <w:szCs w:val="22"/>
         </w:rPr>
         <w:t>2</w:t>
       </w:r>
@@ -350,8 +384,6 @@
         <w:rPr>
           <w:rFonts w:ascii="ＭＳ Ｐ明朝" w:eastAsia="ＭＳ Ｐ明朝" w:hAnsi="ＭＳ Ｐ明朝" w:cs="Arial"/>
           <w:lang w:eastAsia="zh-CN"/>
-          <w:sz w:val="22"/>
-          <w:szCs w:val="22"/>
         </w:rPr>
         <w:t>日</w:t>
       </w:r>
@@ -375,8 +407,6 @@
         <w:rPr>
           <w:rFonts w:ascii="ＭＳ Ｐ明朝" w:eastAsia="ＭＳ Ｐ明朝" w:hAnsi="ＭＳ Ｐ明朝" w:cs="Arial" w:hint="eastAsia"/>
           <w:lang w:eastAsia="zh-CN"/>
-          <w:sz w:val="22"/>
-          <w:szCs w:val="22"/>
         </w:rPr>
         <w:t>株式会社</w:t>
       </w:r>
@@ -384,8 +414,6 @@
         <w:rPr>
           <w:rFonts w:ascii="ＭＳ Ｐ明朝" w:eastAsia="ＭＳ Ｐ明朝" w:hAnsi="ＭＳ Ｐ明朝" w:cs="Arial" w:hint="eastAsia"/>
           <w:lang w:eastAsia="zh-CN"/>
-          <w:sz w:val="22"/>
-          <w:szCs w:val="22"/>
         </w:rPr>
         <w:t>ジェリービーンズグループ</w:t>
       </w:r>
@@ -401,8 +429,6 @@
         <w:rPr>
           <w:rFonts w:ascii="ＭＳ Ｐ明朝" w:eastAsia="ＭＳ Ｐ明朝" w:hAnsi="ＭＳ Ｐ明朝" w:cs="Arial" w:hint="eastAsia"/>
           <w:lang w:eastAsia="zh-CN"/>
-          <w:sz w:val="22"/>
-          <w:szCs w:val="22"/>
         </w:rPr>
         <w:t>代表</w:t>
       </w:r>
@@ -410,24 +436,18 @@
         <w:rPr>
           <w:rFonts w:ascii="ＭＳ Ｐ明朝" w:eastAsia="ＭＳ Ｐ明朝" w:hAnsi="ＭＳ Ｐ明朝" w:cs="Arial"/>
           <w:lang w:eastAsia="zh-CN"/>
-          <w:sz w:val="22"/>
-          <w:szCs w:val="22"/>
         </w:rPr>
         <w:t>取締役</w:t>
       </w:r>
       <w:r>
         <w:rPr>
           <w:rFonts w:ascii="ＭＳ Ｐ明朝" w:eastAsia="ＭＳ Ｐ明朝" w:hAnsi="ＭＳ Ｐ明朝" w:cs="Arial" w:hint="eastAsia"/>
-          <w:sz w:val="22"/>
-          <w:szCs w:val="22"/>
         </w:rPr>
         <w:t xml:space="preserve">社長　</w:t>
       </w:r>
       <w:r>
         <w:rPr>
           <w:rFonts w:ascii="ＭＳ Ｐ明朝" w:eastAsia="ＭＳ Ｐ明朝" w:hAnsi="ＭＳ Ｐ明朝" w:cs="Arial" w:hint="eastAsia"/>
-          <w:sz w:val="22"/>
-          <w:szCs w:val="22"/>
         </w:rPr>
         <w:t xml:space="preserve">宮崎　明　</w:t>
       </w:r>
@@ -436,8 +456,6 @@
           <w:rFonts w:ascii="ＭＳ Ｐ明朝" w:eastAsia="ＭＳ Ｐ明朝" w:hAnsi="ＭＳ Ｐ明朝" w:cs="Arial" w:hint="eastAsia"/>
           <w:color w:val="000000"/>
           <w:lang w:eastAsia="zh-CN"/>
-          <w:sz w:val="22"/>
-          <w:szCs w:val="22"/>
         </w:rPr>
         <w:t>殿</w:t>
       </w:r>
@@ -445,8 +463,6 @@
         <w:rPr>
           <w:rFonts w:ascii="ＭＳ Ｐ明朝" w:eastAsia="ＭＳ Ｐ明朝" w:hAnsi="ＭＳ Ｐ明朝" w:cs="Arial"/>
           <w:lang w:eastAsia="zh-CN"/>
-          <w:sz w:val="22"/>
-          <w:szCs w:val="22"/>
         </w:rPr>
       </w:r>
     </w:p>
@@ -471,8 +487,6 @@
         <w:rPr>
           <w:rFonts w:ascii="ＭＳ Ｐ明朝" w:eastAsia="ＭＳ Ｐ明朝" w:hAnsi="ＭＳ Ｐ明朝" w:cs="Arial"/>
           <w:lang w:eastAsia="zh-CN"/>
-          <w:sz w:val="22"/>
-          <w:szCs w:val="22"/>
         </w:rPr>
         <w:t>東京都千代田区永田町1丁目11番28号</w:t>
       </w:r>
@@ -488,24 +502,18 @@
       <w:r>
         <w:rPr>
           <w:rFonts w:ascii="ＭＳ Ｐ明朝" w:eastAsia="ＭＳ Ｐ明朝" w:hAnsi="ＭＳ Ｐ明朝" w:cs="Arial" w:hint="eastAsia"/>
-          <w:sz w:val="22"/>
-          <w:szCs w:val="22"/>
         </w:rPr>
         <w:t>合人社東京</w:t>
       </w:r>
       <w:r>
         <w:rPr>
           <w:rFonts w:ascii="ＭＳ Ｐ明朝" w:eastAsia="ＭＳ Ｐ明朝" w:hAnsi="ＭＳ Ｐ明朝" w:cs="Arial" w:hint="eastAsia"/>
-          <w:sz w:val="22"/>
-          <w:szCs w:val="22"/>
         </w:rPr>
         <w:t>永田町</w:t>
       </w:r>
       <w:r>
         <w:rPr>
           <w:rFonts w:ascii="ＭＳ Ｐ明朝" w:eastAsia="ＭＳ Ｐ明朝" w:hAnsi="ＭＳ Ｐ明朝" w:cs="Arial"/>
-          <w:sz w:val="22"/>
-          <w:szCs w:val="22"/>
         </w:rPr>
         <w:t>ビル9階</w:t>
       </w:r>
@@ -521,8 +529,6 @@
         <w:rPr>
           <w:rFonts w:ascii="ＭＳ Ｐ明朝" w:eastAsia="ＭＳ Ｐ明朝" w:hAnsi="ＭＳ Ｐ明朝" w:cs="Arial"/>
           <w:spacing w:val="1"/>
-          <w:sz w:val="22"/>
-          <w:szCs w:val="22"/>
         </w:rPr>
         <w:t>東京フィナンシャル・アドバイザーズ株式会社</w:t>
       </w:r>
@@ -538,40 +544,30 @@
       <w:r>
         <w:rPr>
           <w:rFonts w:ascii="ＭＳ Ｐ明朝" w:eastAsia="ＭＳ Ｐ明朝" w:hAnsi="ＭＳ Ｐ明朝" w:cs="Arial"/>
-          <w:sz w:val="22"/>
-          <w:szCs w:val="22"/>
         </w:rPr>
         <w:t>代表取締役　 能</w:t>
       </w:r>
       <w:r>
         <w:rPr>
           <w:rFonts w:ascii="ＭＳ Ｐ明朝" w:eastAsia="ＭＳ Ｐ明朝" w:hAnsi="ＭＳ Ｐ明朝" w:cs="Arial" w:hint="eastAsia"/>
-          <w:sz w:val="22"/>
-          <w:szCs w:val="22"/>
         </w:rPr>
         <w:t xml:space="preserve">　</w:t>
       </w:r>
       <w:r>
         <w:rPr>
           <w:rFonts w:ascii="ＭＳ Ｐ明朝" w:eastAsia="ＭＳ Ｐ明朝" w:hAnsi="ＭＳ Ｐ明朝" w:cs="Arial"/>
-          <w:sz w:val="22"/>
-          <w:szCs w:val="22"/>
         </w:rPr>
         <w:t>勢</w:t>
       </w:r>
       <w:r>
         <w:rPr>
           <w:rFonts w:ascii="ＭＳ Ｐ明朝" w:eastAsia="ＭＳ Ｐ明朝" w:hAnsi="ＭＳ Ｐ明朝" w:cs="Arial" w:hint="eastAsia"/>
-          <w:sz w:val="22"/>
-          <w:szCs w:val="22"/>
         </w:rPr>
         <w:t xml:space="preserve">　　</w:t>
       </w:r>
       <w:r>
         <w:rPr>
           <w:rFonts w:ascii="ＭＳ Ｐ明朝" w:eastAsia="ＭＳ Ｐ明朝" w:hAnsi="ＭＳ Ｐ明朝" w:cs="Arial"/>
-          <w:sz w:val="22"/>
-          <w:szCs w:val="22"/>
         </w:rPr>
         <w:t>元</w:t>
       </w:r>
@@ -843,6 +839,7 @@
     <w:p>
       <w:pPr>
         <w:ind w:firstLineChars="100" w:firstLine="220"/>
+        <w:jc w:val="center"/>
         <w:rPr>
           <w:rFonts w:ascii="ＭＳ Ｐ明朝" w:eastAsia="ＭＳ Ｐ明朝" w:hAnsi="ＭＳ Ｐ明朝" w:cs="Arial"/>
           <w:sz w:val="22"/>
@@ -850,6 +847,33 @@
         </w:rPr>
         <w:pageBreakBefore/>
       </w:pPr>
+      <w:r>
+        <w:rPr>
+          <w:rFonts w:ascii="ＭＳ Ｐ明朝" w:hAnsi="ＭＳ Ｐ明朝" w:eastAsia="ＭＳ Ｐ明朝"/>
+          <w:b/>
+          <w:sz w:val="32"/>
+        </w:rPr>
+        <w:t>目次</w:t>
+      </w:r>
+    </w:p>
+    <w:p>
+      <w:pPr>
+        <w:ind w:left="240" w:firstLineChars="50" w:firstLine="110"/>
+        <w:rPr>
+          <w:rFonts w:ascii="ＭＳ Ｐ明朝" w:eastAsia="ＭＳ Ｐ明朝" w:hAnsi="ＭＳ Ｐ明朝" w:cs="メイリオ"/>
+          <w:sz w:val="22"/>
+          <w:szCs w:val="22"/>
+        </w:rPr>
+        <w:pageBreakBefore/>
+      </w:pPr>
+      <w:r>
+        <w:rPr>
+          <w:rFonts w:ascii="ＭＳ Ｐ明朝" w:eastAsia="ＭＳ Ｐ明朝" w:hAnsi="ＭＳ Ｐ明朝" w:cs="メイリオ"/>
+          <w:sz w:val="22"/>
+          <w:szCs w:val="22"/>
+        </w:rPr>
+        <w:fldChar w:fldCharType="end"/>
+      </w:r>
     </w:p>
     <w:p>
       <w:pPr>
@@ -1835,37 +1859,17 @@
     </w:p>
     <w:p>
       <w:pPr>
-        <w:ind w:left="240" w:firstLineChars="50" w:firstLine="110"/>
-        <w:rPr>
-          <w:rFonts w:ascii="ＭＳ Ｐ明朝" w:eastAsia="ＭＳ Ｐ明朝" w:hAnsi="ＭＳ Ｐ明朝" w:cs="メイリオ"/>
-          <w:sz w:val="22"/>
-          <w:szCs w:val="22"/>
+        <w:pStyle w:val="1"/>
+        <w:rPr>
+          <w:rFonts w:ascii="ＭＳ Ｐ明朝" w:eastAsia="ＭＳ Ｐ明朝" w:hAnsi="ＭＳ Ｐ明朝" w:cs="Arial Unicode MS"/>
         </w:rPr>
         <w:pageBreakBefore/>
-      </w:pPr>
-      <w:r>
-        <w:rPr>
-          <w:rFonts w:ascii="ＭＳ Ｐ明朝" w:eastAsia="ＭＳ Ｐ明朝" w:hAnsi="ＭＳ Ｐ明朝" w:cs="メイリオ"/>
-          <w:sz w:val="22"/>
-          <w:szCs w:val="22"/>
-        </w:rPr>
-        <w:fldChar w:fldCharType="end"/>
-      </w:r>
-    </w:p>
-    <w:p>
-      <w:pPr>
-        <w:pStyle w:val="1"/>
-        <w:rPr>
-          <w:rFonts w:ascii="ＭＳ Ｐ明朝" w:eastAsia="ＭＳ Ｐ明朝" w:hAnsi="ＭＳ Ｐ明朝" w:cs="Arial Unicode MS"/>
-        </w:rPr>
       </w:pPr>
       <w:bookmarkStart w:id="0" w:name="_Toc179738835"/>
       <w:bookmarkStart w:id="1" w:name="_Toc223971637"/>
       <w:r>
         <w:rPr>
           <w:rFonts w:ascii="ＭＳ Ｐ明朝" w:eastAsia="ＭＳ Ｐ明朝" w:hAnsi="ＭＳ Ｐ明朝" w:cs="Arial Unicode MS" w:hint="eastAsia"/>
-          <w:sz w:val="22"/>
-          <w:szCs w:val="22"/>
         </w:rPr>
         <w:lastRenderedPageBreak/>
         <w:t>Ⅰ</w:t>
@@ -1873,8 +1877,6 @@
       <w:r>
         <w:rPr>
           <w:rFonts w:ascii="ＭＳ Ｐ明朝" w:eastAsia="ＭＳ Ｐ明朝" w:hAnsi="ＭＳ Ｐ明朝" w:cs="Arial Unicode MS"/>
-          <w:sz w:val="22"/>
-          <w:szCs w:val="22"/>
         </w:rPr>
         <w:t xml:space="preserve">　新株予約権の評価</w:t>
       </w:r>
@@ -1882,8 +1884,6 @@
       <w:r>
         <w:rPr>
           <w:rFonts w:ascii="ＭＳ Ｐ明朝" w:eastAsia="ＭＳ Ｐ明朝" w:hAnsi="ＭＳ Ｐ明朝" w:cs="Arial Unicode MS" w:hint="eastAsia"/>
-          <w:sz w:val="22"/>
-          <w:szCs w:val="22"/>
         </w:rPr>
         <w:t>概要</w:t>
       </w:r>
@@ -1904,8 +1904,6 @@
       <w:r>
         <w:rPr>
           <w:rFonts w:ascii="ＭＳ Ｐ明朝" w:eastAsia="ＭＳ Ｐ明朝" w:hAnsi="ＭＳ Ｐ明朝" w:cs="Arial" w:hint="eastAsia"/>
-          <w:sz w:val="22"/>
-          <w:szCs w:val="22"/>
         </w:rPr>
         <w:t xml:space="preserve">1. </w:t>
       </w:r>
@@ -1945,8 +1943,6 @@
           <w:rFonts w:ascii="ＭＳ Ｐ明朝" w:eastAsia="ＭＳ Ｐ明朝" w:hAnsi="ＭＳ Ｐ明朝" w:cs="Arial"/>
           <w:b/>
           <w:u w:val="single"/>
-          <w:sz w:val="22"/>
-          <w:szCs w:val="22"/>
         </w:rPr>
         <w:t>公</w:t>
       </w:r>
@@ -1956,8 +1952,6 @@
           <w:b/>
           <w:color w:val="000000"/>
           <w:u w:val="single"/>
-          <w:sz w:val="22"/>
-          <w:szCs w:val="22"/>
         </w:rPr>
         <w:t>正価値</w:t>
       </w:r>
@@ -1967,8 +1961,6 @@
           <w:b/>
           <w:color w:val="000000"/>
           <w:u w:val="single"/>
-          <w:sz w:val="22"/>
-          <w:szCs w:val="22"/>
         </w:rPr>
         <w:t>：</w:t>
       </w:r>
@@ -1978,8 +1970,6 @@
           <w:b/>
           <w:color w:val="000000"/>
           <w:u w:val="single"/>
-          <w:sz w:val="22"/>
-          <w:szCs w:val="22"/>
         </w:rPr>
         <w:t>●</w:t>
       </w:r>
@@ -1989,8 +1979,6 @@
           <w:b/>
           <w:color w:val="000000"/>
           <w:u w:val="single"/>
-          <w:sz w:val="22"/>
-          <w:szCs w:val="22"/>
         </w:rPr>
         <w:t>円</w:t>
       </w:r>
@@ -2000,8 +1988,6 @@
           <w:b/>
           <w:color w:val="000000"/>
           <w:u w:val="single"/>
-          <w:sz w:val="22"/>
-          <w:szCs w:val="22"/>
         </w:rPr>
         <w:t>（</w:t>
       </w:r>
@@ -2011,8 +1997,6 @@
           <w:b/>
           <w:color w:val="000000"/>
           <w:u w:val="single"/>
-          <w:sz w:val="22"/>
-          <w:szCs w:val="22"/>
         </w:rPr>
         <w:t>●</w:t>
       </w:r>
@@ -2022,8 +2006,6 @@
           <w:b/>
           <w:color w:val="000000"/>
           <w:u w:val="single"/>
-          <w:sz w:val="22"/>
-          <w:szCs w:val="22"/>
         </w:rPr>
         <w:t>円/株　当初株価の</w:t>
       </w:r>
@@ -2033,8 +2015,6 @@
           <w:b/>
           <w:color w:val="000000"/>
           <w:u w:val="single"/>
-          <w:sz w:val="22"/>
-          <w:szCs w:val="22"/>
         </w:rPr>
         <w:t>●</w:t>
       </w:r>
@@ -2044,8 +2024,6 @@
           <w:b/>
           <w:color w:val="000000"/>
           <w:u w:val="single"/>
-          <w:sz w:val="22"/>
-          <w:szCs w:val="22"/>
         </w:rPr>
         <w:t>%</w:t>
       </w:r>
@@ -2055,8 +2033,6 @@
           <w:b/>
           <w:color w:val="000000"/>
           <w:u w:val="single"/>
-          <w:sz w:val="22"/>
-          <w:szCs w:val="22"/>
         </w:rPr>
         <w:t>）</w:t>
       </w:r>
@@ -2297,7 +2273,6 @@
           <w:sz w:val="22"/>
           <w:szCs w:val="22"/>
         </w:rPr>
-        <w:br w:type="page"/>
       </w:r>
     </w:p>
     <w:p>
@@ -2578,17 +2553,6 @@
     </w:p>
     <w:p>
       <w:pPr>
-        <w:ind w:left="360" w:firstLineChars="75" w:firstLine="165"/>
-        <w:rPr>
-          <w:rFonts w:ascii="ＭＳ Ｐ明朝" w:eastAsia="ＭＳ Ｐ明朝" w:hAnsi="ＭＳ Ｐ明朝" w:cs="Arial"/>
-          <w:sz w:val="22"/>
-          <w:szCs w:val="22"/>
-        </w:rPr>
-        <w:pageBreakBefore/>
-      </w:pPr>
-    </w:p>
-    <w:p>
-      <w:pPr>
         <w:pStyle w:val="2"/>
         <w:ind w:firstLineChars="100" w:firstLine="220"/>
         <w:rPr>
@@ -2596,6 +2560,7 @@
           <w:sz w:val="22"/>
           <w:szCs w:val="22"/>
         </w:rPr>
+        <w:pageBreakBefore/>
       </w:pPr>
       <w:bookmarkStart w:id="8" w:name="_Toc223971642"/>
       <w:r>
@@ -5136,7 +5101,7 @@
                 <w:sz w:val="21"/>
                 <w:szCs w:val="21"/>
               </w:rPr>
-              <w:t>12月</w:t>
+              <w:t>12</w:t>
             </w:r>
             <w:r>
               <w:rPr>
@@ -5144,7 +5109,7 @@
                 <w:sz w:val="21"/>
                 <w:szCs w:val="21"/>
               </w:rPr>
-              <w:t>末</w:t>
+              <w:t>月</w:t>
             </w:r>
             <w:r>
               <w:rPr>
@@ -5152,7 +5117,7 @@
                 <w:sz w:val="21"/>
                 <w:szCs w:val="21"/>
               </w:rPr>
-              <w:t>版)」 J</w:t>
+              <w:t xml:space="preserve">末版)」 </w:t>
             </w:r>
             <w:r>
               <w:rPr>
@@ -5160,7 +5125,7 @@
                 <w:sz w:val="21"/>
                 <w:szCs w:val="21"/>
               </w:rPr>
-              <w:t>apan L</w:t>
+              <w:t xml:space="preserve">Japan </w:t>
             </w:r>
             <w:r>
               <w:rPr>
@@ -5168,7 +5133,7 @@
                 <w:sz w:val="21"/>
                 <w:szCs w:val="21"/>
               </w:rPr>
-              <w:t>ong-</w:t>
+              <w:t>Long</w:t>
             </w:r>
             <w:r>
               <w:rPr>
@@ -5176,7 +5141,7 @@
                 <w:sz w:val="21"/>
                 <w:szCs w:val="21"/>
               </w:rPr>
-              <w:t>Horizon Equity R</w:t>
+              <w:t xml:space="preserve">-Horizon Equity </w:t>
             </w:r>
             <w:r>
               <w:rPr>
@@ -5184,7 +5149,7 @@
                 <w:sz w:val="21"/>
                 <w:szCs w:val="21"/>
               </w:rPr>
-              <w:t>isk Premia (</w:t>
+              <w:t xml:space="preserve">Risk Premia </w:t>
             </w:r>
             <w:r>
               <w:rPr>
@@ -5192,7 +5157,7 @@
                 <w:sz w:val="21"/>
                 <w:szCs w:val="21"/>
               </w:rPr>
-              <w:t>1</w:t>
+              <w:t>(</w:t>
             </w:r>
             <w:r>
               <w:rPr>
@@ -5200,7 +5165,7 @@
                 <w:sz w:val="21"/>
                 <w:szCs w:val="21"/>
               </w:rPr>
-              <w:t>952.1</w:t>
+              <w:t>1952.</w:t>
             </w:r>
             <w:r>
               <w:rPr>
@@ -5208,7 +5173,7 @@
                 <w:sz w:val="21"/>
                 <w:szCs w:val="21"/>
               </w:rPr>
-              <w:t>～</w:t>
+              <w:t>1</w:t>
             </w:r>
             <w:r>
               <w:rPr>
@@ -5216,7 +5181,7 @@
                 <w:sz w:val="21"/>
                 <w:szCs w:val="21"/>
               </w:rPr>
-              <w:t>2</w:t>
+              <w:t>～</w:t>
             </w:r>
             <w:r>
               <w:rPr>
@@ -5224,7 +5189,7 @@
                 <w:sz w:val="21"/>
                 <w:szCs w:val="21"/>
               </w:rPr>
-              <w:t>025</w:t>
+              <w:t>202</w:t>
             </w:r>
             <w:r>
               <w:rPr>
@@ -5232,7 +5197,7 @@
                 <w:sz w:val="21"/>
                 <w:szCs w:val="21"/>
               </w:rPr>
-              <w:t>.</w:t>
+              <w:t>5</w:t>
             </w:r>
             <w:r>
               <w:rPr>
@@ -5240,7 +5205,7 @@
                 <w:sz w:val="21"/>
                 <w:szCs w:val="21"/>
               </w:rPr>
-              <w:t>1</w:t>
+              <w:t>.</w:t>
             </w:r>
             <w:r>
               <w:rPr>
@@ -5248,7 +5213,7 @@
                 <w:sz w:val="21"/>
                 <w:szCs w:val="21"/>
               </w:rPr>
-              <w:t>2)</w:t>
+              <w:t>12</w:t>
             </w:r>
             <w:r>
               <w:rPr>
@@ -5256,7 +5221,7 @@
                 <w:sz w:val="21"/>
                 <w:szCs w:val="21"/>
               </w:rPr>
-              <w:t>。C</w:t>
+              <w:t>)。</w:t>
             </w:r>
             <w:r>
               <w:rPr>
@@ -5264,7 +5229,7 @@
                 <w:sz w:val="21"/>
                 <w:szCs w:val="21"/>
               </w:rPr>
-              <w:t>opyright © 2</w:t>
+              <w:t xml:space="preserve">Copyright © </w:t>
             </w:r>
             <w:r>
               <w:rPr>
@@ -5272,7 +5237,7 @@
                 <w:sz w:val="21"/>
                 <w:szCs w:val="21"/>
               </w:rPr>
-              <w:t xml:space="preserve">026 </w:t>
+              <w:t>2026</w:t>
             </w:r>
             <w:r>
               <w:rPr>
@@ -5280,7 +5245,7 @@
                 <w:sz w:val="21"/>
                 <w:szCs w:val="21"/>
               </w:rPr>
-              <w:t>I</w:t>
+              <w:t xml:space="preserve"> </w:t>
             </w:r>
             <w:r>
               <w:rPr>
@@ -5288,7 +5253,7 @@
                 <w:sz w:val="21"/>
                 <w:szCs w:val="21"/>
               </w:rPr>
-              <w:t>bbotson Associates Japan, Inc.(</w:t>
+              <w:t>Ibbotson Associates Japan, Inc.</w:t>
             </w:r>
             <w:r>
               <w:rPr>
@@ -5296,23 +5261,23 @@
                 <w:sz w:val="22"/>
                 <w:szCs w:val="22"/>
               </w:rPr>
-              <w:t>もしくは C</w:t>
-            </w:r>
-            <w:r>
-              <w:rPr>
-                <w:rFonts w:ascii="ＭＳ Ｐ明朝" w:eastAsia="ＭＳ Ｐ明朝" w:hAnsi="ＭＳ Ｐ明朝" w:cs="Arial"/>
-                <w:sz w:val="22"/>
-                <w:szCs w:val="22"/>
-              </w:rPr>
-              <w:t>opyright © 2</w:t>
-            </w:r>
-            <w:r>
-              <w:rPr>
-                <w:rFonts w:ascii="ＭＳ Ｐ明朝" w:eastAsia="ＭＳ Ｐ明朝" w:hAnsi="ＭＳ Ｐ明朝" w:cs="Arial"/>
-                <w:sz w:val="22"/>
-                <w:szCs w:val="22"/>
-              </w:rPr>
-              <w:t>026イ</w:t>
+              <w:t xml:space="preserve">(もしくは </w:t>
+            </w:r>
+            <w:r>
+              <w:rPr>
+                <w:rFonts w:ascii="ＭＳ Ｐ明朝" w:eastAsia="ＭＳ Ｐ明朝" w:hAnsi="ＭＳ Ｐ明朝" w:cs="Arial"/>
+                <w:sz w:val="22"/>
+                <w:szCs w:val="22"/>
+              </w:rPr>
+              <w:t xml:space="preserve">Copyright © </w:t>
+            </w:r>
+            <w:r>
+              <w:rPr>
+                <w:rFonts w:ascii="ＭＳ Ｐ明朝" w:eastAsia="ＭＳ Ｐ明朝" w:hAnsi="ＭＳ Ｐ明朝" w:cs="Arial"/>
+                <w:sz w:val="22"/>
+                <w:szCs w:val="22"/>
+              </w:rPr>
+              <w:t>2026</w:t>
             </w:r>
             <w:r>
               <w:rPr>
@@ -5320,23 +5285,23 @@
                 <w:sz w:val="22"/>
                 <w:szCs w:val="22"/>
               </w:rPr>
+              <w:t>イ</w:t>
+            </w:r>
+            <w:r>
+              <w:rPr>
+                <w:rFonts w:ascii="ＭＳ Ｐ明朝" w:eastAsia="ＭＳ Ｐ明朝" w:hAnsi="ＭＳ Ｐ明朝" w:cs="Times" w:hint="eastAsia"/>
+                <w:sz w:val="22"/>
+                <w:szCs w:val="22"/>
+              </w:rPr>
               <w:t>ボ</w:t>
             </w:r>
             <w:r>
               <w:rPr>
-                <w:rFonts w:ascii="ＭＳ Ｐ明朝" w:eastAsia="ＭＳ Ｐ明朝" w:hAnsi="ＭＳ Ｐ明朝" w:cs="Times" w:hint="eastAsia"/>
-                <w:sz w:val="22"/>
-                <w:szCs w:val="22"/>
-              </w:rPr>
-              <w:t>ッ</w:t>
-            </w:r>
-            <w:r>
-              <w:rPr>
                 <w:rFonts w:ascii="ＭＳ Ｐ明朝" w:eastAsia="ＭＳ Ｐ明朝" w:hAnsi="ＭＳ Ｐ明朝" w:cs="ＭＳ 明朝" w:hint="eastAsia"/>
                 <w:sz w:val="22"/>
                 <w:szCs w:val="22"/>
               </w:rPr>
-              <w:t>トソン・アソシエイツ・ジャパン株式会社)</w:t>
+              <w:t>ットソン・アソシエイツ・ジャパン株式会社</w:t>
             </w:r>
             <w:r>
               <w:rPr>
@@ -5344,7 +5309,7 @@
                 <w:sz w:val="22"/>
                 <w:szCs w:val="22"/>
               </w:rPr>
-              <w:t>全ての著作権等の権利を有する同社からの許諾を得て使用。</w:t>
+              <w:t>)全ての著作権等の権利を有する同社からの許諾を得て使用。</w:t>
             </w:r>
           </w:p>
           <w:p>
@@ -5982,7 +5947,8 @@
     </w:p>
     <w:p>
       <w:pPr>
-        <w:ind w:leftChars="342" w:left="821" w:firstLineChars="75" w:firstLine="165"/>
+        <w:pStyle w:val="2"/>
+        <w:ind w:firstLineChars="100" w:firstLine="220"/>
         <w:rPr>
           <w:rFonts w:ascii="ＭＳ Ｐ明朝" w:eastAsia="ＭＳ Ｐ明朝" w:hAnsi="ＭＳ Ｐ明朝" w:cs="Arial"/>
           <w:sz w:val="22"/>
@@ -5990,9 +5956,512 @@
         </w:rPr>
         <w:pageBreakBefore/>
       </w:pPr>
+      <w:bookmarkStart w:id="9" w:name="_Toc179738840"/>
+      <w:bookmarkStart w:id="10" w:name="_Toc223971643"/>
+      <w:r>
+        <w:rPr>
+          <w:rFonts w:ascii="ＭＳ Ｐ明朝" w:eastAsia="ＭＳ Ｐ明朝" w:hAnsi="ＭＳ Ｐ明朝" w:cs="Arial"/>
+          <w:sz w:val="22"/>
+          <w:szCs w:val="22"/>
+        </w:rPr>
+        <w:lastRenderedPageBreak/>
+        <w:t>6</w:t>
+      </w:r>
+      <w:r>
+        <w:rPr>
+          <w:rFonts w:ascii="ＭＳ Ｐ明朝" w:eastAsia="ＭＳ Ｐ明朝" w:hAnsi="ＭＳ Ｐ明朝" w:cs="Arial" w:hint="eastAsia"/>
+          <w:sz w:val="22"/>
+          <w:szCs w:val="22"/>
+        </w:rPr>
+        <w:t xml:space="preserve">. </w:t>
+      </w:r>
+      <w:r>
+        <w:rPr>
+          <w:rFonts w:ascii="ＭＳ Ｐ明朝" w:eastAsia="ＭＳ Ｐ明朝" w:hAnsi="ＭＳ Ｐ明朝" w:cs="Arial"/>
+          <w:sz w:val="22"/>
+          <w:szCs w:val="22"/>
+        </w:rPr>
+        <w:t>新株予約権の評価額の算定に当たって採用した</w:t>
+      </w:r>
+      <w:r>
+        <w:rPr>
+          <w:rFonts w:ascii="ＭＳ Ｐ明朝" w:eastAsia="ＭＳ Ｐ明朝" w:hAnsi="ＭＳ Ｐ明朝" w:cs="Arial" w:hint="eastAsia"/>
+          <w:sz w:val="22"/>
+          <w:szCs w:val="22"/>
+        </w:rPr>
+        <w:t>仮定</w:t>
+      </w:r>
+      <w:bookmarkEnd w:id="10"/>
     </w:p>
     <w:p>
       <w:pPr>
+        <w:ind w:left="360" w:firstLineChars="75" w:firstLine="165"/>
+        <w:rPr>
+          <w:rFonts w:ascii="ＭＳ Ｐ明朝" w:eastAsia="ＭＳ Ｐ明朝" w:hAnsi="ＭＳ Ｐ明朝" w:cs="Arial"/>
+          <w:sz w:val="22"/>
+          <w:szCs w:val="22"/>
+        </w:rPr>
+      </w:pPr>
+      <w:r>
+        <w:rPr>
+          <w:rFonts w:ascii="ＭＳ Ｐ明朝" w:eastAsia="ＭＳ Ｐ明朝" w:hAnsi="ＭＳ Ｐ明朝" w:cs="Arial"/>
+          <w:sz w:val="22"/>
+          <w:szCs w:val="22"/>
+        </w:rPr>
+        <w:t>新株予約権の評価額の算定を行う上で必要な</w:t>
+      </w:r>
+      <w:r>
+        <w:rPr>
+          <w:rFonts w:ascii="ＭＳ Ｐ明朝" w:eastAsia="ＭＳ Ｐ明朝" w:hAnsi="ＭＳ Ｐ明朝" w:cs="Arial" w:hint="eastAsia"/>
+          <w:sz w:val="22"/>
+          <w:szCs w:val="22"/>
+        </w:rPr>
+        <w:t>仮定を下記のとおり設定しました。</w:t>
+      </w:r>
+    </w:p>
+    <w:p>
+      <w:pPr>
+        <w:ind w:leftChars="270" w:left="648"/>
+        <w:rPr>
+          <w:rFonts w:ascii="ＭＳ Ｐ明朝" w:eastAsia="ＭＳ Ｐ明朝" w:hAnsi="ＭＳ Ｐ明朝" w:cs="Arial"/>
+          <w:sz w:val="22"/>
+          <w:szCs w:val="22"/>
+        </w:rPr>
+      </w:pPr>
+    </w:p>
+    <w:p>
+      <w:pPr>
+        <w:ind w:leftChars="270" w:left="648"/>
+        <w:rPr>
+          <w:rFonts w:ascii="ＭＳ Ｐ明朝" w:eastAsia="ＭＳ Ｐ明朝" w:hAnsi="ＭＳ Ｐ明朝" w:cs="Arial"/>
+          <w:sz w:val="22"/>
+          <w:szCs w:val="22"/>
+        </w:rPr>
+      </w:pPr>
+      <w:r>
+        <w:rPr>
+          <w:rFonts w:ascii="ＭＳ Ｐ明朝" w:eastAsia="ＭＳ Ｐ明朝" w:hAnsi="ＭＳ Ｐ明朝" w:cs="Arial"/>
+          <w:sz w:val="22"/>
+          <w:szCs w:val="22"/>
+        </w:rPr>
+        <w:t>・短期金利は時間を通じて既知であり、一定である。</w:t>
+      </w:r>
+    </w:p>
+    <w:p>
+      <w:pPr>
+        <w:ind w:leftChars="270" w:left="648"/>
+        <w:rPr>
+          <w:rFonts w:ascii="ＭＳ Ｐ明朝" w:eastAsia="ＭＳ Ｐ明朝" w:hAnsi="ＭＳ Ｐ明朝" w:cs="Arial"/>
+          <w:sz w:val="22"/>
+          <w:szCs w:val="22"/>
+        </w:rPr>
+      </w:pPr>
+      <w:r>
+        <w:rPr>
+          <w:rFonts w:ascii="ＭＳ Ｐ明朝" w:eastAsia="ＭＳ Ｐ明朝" w:hAnsi="ＭＳ Ｐ明朝" w:cs="Arial" w:hint="eastAsia"/>
+          <w:sz w:val="22"/>
+          <w:szCs w:val="22"/>
+        </w:rPr>
+        <w:t>・</w:t>
+      </w:r>
+      <w:r>
+        <w:rPr>
+          <w:rFonts w:ascii="ＭＳ Ｐ明朝" w:eastAsia="ＭＳ Ｐ明朝" w:hAnsi="ＭＳ Ｐ明朝" w:cs="Arial"/>
+          <w:sz w:val="22"/>
+          <w:szCs w:val="22"/>
+        </w:rPr>
+        <w:t>ボラティリティは時間を通じて一定である。</w:t>
+      </w:r>
+    </w:p>
+    <w:p>
+      <w:pPr>
+        <w:ind w:leftChars="270" w:left="648"/>
+        <w:rPr>
+          <w:rFonts w:ascii="ＭＳ Ｐ明朝" w:eastAsia="ＭＳ Ｐ明朝" w:hAnsi="ＭＳ Ｐ明朝" w:cs="Arial"/>
+          <w:sz w:val="22"/>
+          <w:szCs w:val="22"/>
+        </w:rPr>
+      </w:pPr>
+      <w:r>
+        <w:rPr>
+          <w:rFonts w:ascii="ＭＳ Ｐ明朝" w:eastAsia="ＭＳ Ｐ明朝" w:hAnsi="ＭＳ Ｐ明朝" w:cs="Arial" w:hint="eastAsia"/>
+          <w:sz w:val="22"/>
+          <w:szCs w:val="22"/>
+        </w:rPr>
+        <w:t>・</w:t>
+      </w:r>
+      <w:r>
+        <w:rPr>
+          <w:rFonts w:ascii="ＭＳ Ｐ明朝" w:eastAsia="ＭＳ Ｐ明朝" w:hAnsi="ＭＳ Ｐ明朝" w:cs="Arial"/>
+          <w:sz w:val="22"/>
+          <w:szCs w:val="22"/>
+        </w:rPr>
+        <w:t>株、オプションの売買に取引コストは発生しない。</w:t>
+      </w:r>
+    </w:p>
+    <w:p>
+      <w:pPr>
+        <w:ind w:leftChars="270" w:left="648"/>
+        <w:rPr>
+          <w:rFonts w:ascii="ＭＳ Ｐ明朝" w:eastAsia="ＭＳ Ｐ明朝" w:hAnsi="ＭＳ Ｐ明朝" w:cs="Arial"/>
+          <w:sz w:val="22"/>
+          <w:szCs w:val="22"/>
+        </w:rPr>
+      </w:pPr>
+      <w:r>
+        <w:rPr>
+          <w:rFonts w:ascii="ＭＳ Ｐ明朝" w:eastAsia="ＭＳ Ｐ明朝" w:hAnsi="ＭＳ Ｐ明朝" w:cs="Arial" w:hint="eastAsia"/>
+          <w:sz w:val="22"/>
+          <w:szCs w:val="22"/>
+        </w:rPr>
+        <w:t>・</w:t>
+      </w:r>
+      <w:r>
+        <w:rPr>
+          <w:rFonts w:ascii="ＭＳ Ｐ明朝" w:eastAsia="ＭＳ Ｐ明朝" w:hAnsi="ＭＳ Ｐ明朝" w:cs="Arial"/>
+          <w:sz w:val="22"/>
+          <w:szCs w:val="22"/>
+        </w:rPr>
+        <w:t>株の購入をするために、短期金利で有価証券の価格の一部を借入できる。</w:t>
+      </w:r>
+    </w:p>
+    <w:p>
+      <w:pPr>
+        <w:tabs>
+          <w:tab w:val="num" w:pos="1637"/>
+        </w:tabs>
+        <w:ind w:leftChars="270" w:left="648"/>
+        <w:rPr>
+          <w:rFonts w:ascii="ＭＳ Ｐ明朝" w:eastAsia="ＭＳ Ｐ明朝" w:hAnsi="ＭＳ Ｐ明朝" w:cs="Arial"/>
+          <w:sz w:val="22"/>
+          <w:szCs w:val="22"/>
+        </w:rPr>
+      </w:pPr>
+      <w:r>
+        <w:rPr>
+          <w:rFonts w:ascii="ＭＳ Ｐ明朝" w:eastAsia="ＭＳ Ｐ明朝" w:hAnsi="ＭＳ Ｐ明朝" w:cs="Arial" w:hint="eastAsia"/>
+          <w:sz w:val="22"/>
+          <w:szCs w:val="22"/>
+        </w:rPr>
+        <w:t>・</w:t>
+      </w:r>
+      <w:r>
+        <w:rPr>
+          <w:rFonts w:ascii="ＭＳ Ｐ明朝" w:eastAsia="ＭＳ Ｐ明朝" w:hAnsi="ＭＳ Ｐ明朝" w:cs="Arial"/>
+          <w:sz w:val="22"/>
+          <w:szCs w:val="22"/>
+        </w:rPr>
+        <w:t>株式の空売り</w:t>
+      </w:r>
+      <w:r>
+        <w:rPr>
+          <w:rFonts w:ascii="ＭＳ Ｐ明朝" w:eastAsia="ＭＳ Ｐ明朝" w:hAnsi="ＭＳ Ｐ明朝" w:cs="Arial" w:hint="eastAsia"/>
+          <w:sz w:val="22"/>
+          <w:szCs w:val="22"/>
+        </w:rPr>
+        <w:t>に対してペナルティはないものとする</w:t>
+      </w:r>
+      <w:r>
+        <w:rPr>
+          <w:rFonts w:ascii="ＭＳ Ｐ明朝" w:eastAsia="ＭＳ Ｐ明朝" w:hAnsi="ＭＳ Ｐ明朝" w:cs="Arial"/>
+          <w:sz w:val="22"/>
+          <w:szCs w:val="22"/>
+        </w:rPr>
+        <w:t>。</w:t>
+      </w:r>
+    </w:p>
+    <w:p>
+      <w:pPr>
+        <w:ind w:leftChars="270" w:left="648"/>
+        <w:rPr>
+          <w:rFonts w:ascii="ＭＳ Ｐ明朝" w:eastAsia="ＭＳ Ｐ明朝" w:hAnsi="ＭＳ Ｐ明朝" w:cs="Arial"/>
+          <w:sz w:val="22"/>
+          <w:szCs w:val="22"/>
+        </w:rPr>
+      </w:pPr>
+      <w:r>
+        <w:rPr>
+          <w:rFonts w:ascii="ＭＳ Ｐ明朝" w:eastAsia="ＭＳ Ｐ明朝" w:hAnsi="ＭＳ Ｐ明朝" w:cs="Arial" w:hint="eastAsia"/>
+          <w:sz w:val="22"/>
+          <w:szCs w:val="22"/>
+        </w:rPr>
+        <w:t>・株式の流動性については、新株予約権の行使により取得した株式を1営業日あた</w:t>
+      </w:r>
+      <w:r>
+        <w:rPr>
+          <w:rFonts w:ascii="ＭＳ Ｐ明朝" w:eastAsia="ＭＳ Ｐ明朝" w:hAnsi="ＭＳ Ｐ明朝" w:cs="Arial"/>
+          <w:sz w:val="22"/>
+          <w:szCs w:val="22"/>
+        </w:rPr>
+        <w:t>1</w:t>
+      </w:r>
+      <w:r>
+        <w:rPr>
+          <w:rFonts w:ascii="ＭＳ Ｐ明朝" w:eastAsia="ＭＳ Ｐ明朝" w:hAnsi="ＭＳ Ｐ明朝" w:cs="Arial"/>
+          <w:sz w:val="22"/>
+          <w:szCs w:val="22"/>
+        </w:rPr>
+        <w:t>48,31</w:t>
+      </w:r>
+      <w:r>
+        <w:rPr>
+          <w:rFonts w:ascii="ＭＳ Ｐ明朝" w:eastAsia="ＭＳ Ｐ明朝" w:hAnsi="ＭＳ Ｐ明朝" w:cs="Arial" w:hint="eastAsia"/>
+          <w:sz w:val="22"/>
+          <w:szCs w:val="22"/>
+        </w:rPr>
+        <w:t>3株（2</w:t>
+      </w:r>
+      <w:r>
+        <w:rPr>
+          <w:rFonts w:ascii="ＭＳ Ｐ明朝" w:eastAsia="ＭＳ Ｐ明朝" w:hAnsi="ＭＳ Ｐ明朝" w:cs="Arial"/>
+          <w:sz w:val="22"/>
+          <w:szCs w:val="22"/>
+        </w:rPr>
+        <w:t>0</w:t>
+      </w:r>
+      <w:r>
+        <w:rPr>
+          <w:rFonts w:ascii="ＭＳ Ｐ明朝" w:eastAsia="ＭＳ Ｐ明朝" w:hAnsi="ＭＳ Ｐ明朝" w:cs="Arial"/>
+          <w:sz w:val="22"/>
+          <w:szCs w:val="22"/>
+        </w:rPr>
+        <w:t>2</w:t>
+      </w:r>
+      <w:r>
+        <w:rPr>
+          <w:rFonts w:ascii="ＭＳ Ｐ明朝" w:eastAsia="ＭＳ Ｐ明朝" w:hAnsi="ＭＳ Ｐ明朝" w:cs="Arial" w:hint="eastAsia"/>
+          <w:sz w:val="22"/>
+          <w:szCs w:val="22"/>
+        </w:rPr>
+        <w:t>1</w:t>
+      </w:r>
+      <w:r>
+        <w:rPr>
+          <w:rFonts w:ascii="ＭＳ Ｐ明朝" w:eastAsia="ＭＳ Ｐ明朝" w:hAnsi="ＭＳ Ｐ明朝" w:cs="Arial"/>
+          <w:sz w:val="22"/>
+          <w:szCs w:val="22"/>
+        </w:rPr>
+        <w:t>年</w:t>
+      </w:r>
+      <w:r>
+        <w:rPr>
+          <w:rFonts w:ascii="ＭＳ Ｐ明朝" w:eastAsia="ＭＳ Ｐ明朝" w:hAnsi="ＭＳ Ｐ明朝" w:cs="Arial" w:hint="eastAsia"/>
+          <w:sz w:val="22"/>
+          <w:szCs w:val="22"/>
+        </w:rPr>
+        <w:t>3</w:t>
+      </w:r>
+      <w:r>
+        <w:rPr>
+          <w:rFonts w:ascii="ＭＳ Ｐ明朝" w:eastAsia="ＭＳ Ｐ明朝" w:hAnsi="ＭＳ Ｐ明朝" w:cs="Arial"/>
+          <w:sz w:val="22"/>
+          <w:szCs w:val="22"/>
+        </w:rPr>
+        <w:t>月3</w:t>
+      </w:r>
+      <w:r>
+        <w:rPr>
+          <w:rFonts w:ascii="ＭＳ Ｐ明朝" w:eastAsia="ＭＳ Ｐ明朝" w:hAnsi="ＭＳ Ｐ明朝" w:cs="Arial" w:hint="eastAsia"/>
+          <w:sz w:val="22"/>
+          <w:szCs w:val="22"/>
+        </w:rPr>
+        <w:t>日から</w:t>
+      </w:r>
+      <w:r>
+        <w:rPr>
+          <w:rFonts w:ascii="ＭＳ Ｐ明朝" w:eastAsia="ＭＳ Ｐ明朝" w:hAnsi="ＭＳ Ｐ明朝" w:cs="Arial" w:hint="eastAsia"/>
+          <w:sz w:val="22"/>
+          <w:szCs w:val="22"/>
+        </w:rPr>
+        <w:t>2026</w:t>
+      </w:r>
+      <w:r>
+        <w:rPr>
+          <w:rFonts w:ascii="ＭＳ Ｐ明朝" w:eastAsia="ＭＳ Ｐ明朝" w:hAnsi="ＭＳ Ｐ明朝" w:cs="Arial" w:hint="eastAsia"/>
+          <w:sz w:val="22"/>
+          <w:szCs w:val="22"/>
+        </w:rPr>
+        <w:t>年</w:t>
+      </w:r>
+      <w:r>
+        <w:rPr>
+          <w:rFonts w:ascii="ＭＳ Ｐ明朝" w:eastAsia="ＭＳ Ｐ明朝" w:hAnsi="ＭＳ Ｐ明朝" w:cs="Arial"/>
+          <w:sz w:val="22"/>
+          <w:szCs w:val="22"/>
+        </w:rPr>
+        <w:t>3</w:t>
+      </w:r>
+      <w:r>
+        <w:rPr>
+          <w:rFonts w:ascii="ＭＳ Ｐ明朝" w:eastAsia="ＭＳ Ｐ明朝" w:hAnsi="ＭＳ Ｐ明朝" w:cs="Arial" w:hint="eastAsia"/>
+          <w:sz w:val="22"/>
+          <w:szCs w:val="22"/>
+        </w:rPr>
+        <w:t>月</w:t>
+      </w:r>
+      <w:r>
+        <w:rPr>
+          <w:rFonts w:ascii="ＭＳ Ｐ明朝" w:eastAsia="ＭＳ Ｐ明朝" w:hAnsi="ＭＳ Ｐ明朝" w:cs="Arial"/>
+          <w:sz w:val="22"/>
+          <w:szCs w:val="22"/>
+        </w:rPr>
+        <w:t>2</w:t>
+      </w:r>
+      <w:r>
+        <w:rPr>
+          <w:rFonts w:ascii="ＭＳ Ｐ明朝" w:eastAsia="ＭＳ Ｐ明朝" w:hAnsi="ＭＳ Ｐ明朝" w:cs="Arial" w:hint="eastAsia"/>
+          <w:sz w:val="22"/>
+          <w:szCs w:val="22"/>
+        </w:rPr>
+        <w:t>日までの日次売買高の中央値である</w:t>
+      </w:r>
+      <w:r>
+        <w:rPr>
+          <w:rFonts w:ascii="ＭＳ Ｐ明朝" w:eastAsia="ＭＳ Ｐ明朝" w:hAnsi="ＭＳ Ｐ明朝" w:cs="Arial"/>
+          <w:sz w:val="22"/>
+          <w:szCs w:val="22"/>
+        </w:rPr>
+        <w:t>1</w:t>
+      </w:r>
+      <w:r>
+        <w:rPr>
+          <w:rFonts w:ascii="ＭＳ Ｐ明朝" w:eastAsia="ＭＳ Ｐ明朝" w:hAnsi="ＭＳ Ｐ明朝" w:cs="Arial"/>
+          <w:sz w:val="22"/>
+          <w:szCs w:val="22"/>
+        </w:rPr>
+        <w:t>,483,1</w:t>
+      </w:r>
+      <w:r>
+        <w:rPr>
+          <w:rFonts w:ascii="ＭＳ Ｐ明朝" w:eastAsia="ＭＳ Ｐ明朝" w:hAnsi="ＭＳ Ｐ明朝" w:cs="Arial" w:hint="eastAsia"/>
+          <w:sz w:val="22"/>
+          <w:szCs w:val="22"/>
+        </w:rPr>
+        <w:t>23株の10％</w:t>
+      </w:r>
+      <w:r>
+        <w:rPr>
+          <w:rFonts w:ascii="ＭＳ Ｐ明朝" w:eastAsia="ＭＳ Ｐ明朝" w:hAnsi="ＭＳ Ｐ明朝" w:cs="Arial"/>
+          <w:sz w:val="22"/>
+          <w:szCs w:val="22"/>
+        </w:rPr>
+        <w:t xml:space="preserve"> 小数点第一</w:t>
+      </w:r>
+      <w:r>
+        <w:rPr>
+          <w:rFonts w:ascii="ＭＳ Ｐ明朝" w:eastAsia="ＭＳ Ｐ明朝" w:hAnsi="ＭＳ Ｐ明朝" w:cs="Arial" w:hint="eastAsia"/>
+          <w:sz w:val="22"/>
+          <w:szCs w:val="22"/>
+        </w:rPr>
+        <w:t>位を切り</w:t>
+      </w:r>
+      <w:r>
+        <w:rPr>
+          <w:rFonts w:ascii="ＭＳ Ｐ明朝" w:eastAsia="ＭＳ Ｐ明朝" w:hAnsi="ＭＳ Ｐ明朝" w:cs="Arial"/>
+          <w:sz w:val="22"/>
+          <w:szCs w:val="22"/>
+        </w:rPr>
+        <w:t>上</w:t>
+      </w:r>
+      <w:r>
+        <w:rPr>
+          <w:rFonts w:ascii="ＭＳ Ｐ明朝" w:eastAsia="ＭＳ Ｐ明朝" w:hAnsi="ＭＳ Ｐ明朝" w:cs="Arial" w:hint="eastAsia"/>
+          <w:sz w:val="22"/>
+          <w:szCs w:val="22"/>
+        </w:rPr>
+        <w:t>げ</w:t>
+      </w:r>
+      <w:r>
+        <w:rPr>
+          <w:rFonts w:ascii="ＭＳ Ｐ明朝" w:eastAsia="ＭＳ Ｐ明朝" w:hAnsi="ＭＳ Ｐ明朝" w:cs="Arial"/>
+          <w:sz w:val="22"/>
+          <w:szCs w:val="22"/>
+        </w:rPr>
+        <w:t>）ずつ売却できるものと</w:t>
+      </w:r>
+      <w:r>
+        <w:rPr>
+          <w:rFonts w:ascii="ＭＳ Ｐ明朝" w:eastAsia="ＭＳ Ｐ明朝" w:hAnsi="ＭＳ Ｐ明朝" w:cs="Arial" w:hint="eastAsia"/>
+          <w:sz w:val="22"/>
+          <w:szCs w:val="22"/>
+        </w:rPr>
+        <w:t>す</w:t>
+      </w:r>
+      <w:r>
+        <w:rPr>
+          <w:rFonts w:ascii="ＭＳ Ｐ明朝" w:eastAsia="ＭＳ Ｐ明朝" w:hAnsi="ＭＳ Ｐ明朝" w:cs="Arial"/>
+          <w:sz w:val="22"/>
+          <w:szCs w:val="22"/>
+        </w:rPr>
+        <w:t>る（日次売</w:t>
+      </w:r>
+      <w:r>
+        <w:rPr>
+          <w:rFonts w:ascii="ＭＳ Ｐ明朝" w:eastAsia="ＭＳ Ｐ明朝" w:hAnsi="ＭＳ Ｐ明朝" w:cs="Arial" w:hint="eastAsia"/>
+          <w:sz w:val="22"/>
+          <w:szCs w:val="22"/>
+        </w:rPr>
+        <w:t>買</w:t>
+      </w:r>
+      <w:r>
+        <w:rPr>
+          <w:rFonts w:ascii="ＭＳ Ｐ明朝" w:eastAsia="ＭＳ Ｐ明朝" w:hAnsi="ＭＳ Ｐ明朝" w:cs="Arial"/>
+          <w:sz w:val="22"/>
+          <w:szCs w:val="22"/>
+        </w:rPr>
+        <w:t>高の10%という数値につきましては、市場環境への影響を鑑</w:t>
+      </w:r>
+      <w:r>
+        <w:rPr>
+          <w:rFonts w:ascii="ＭＳ Ｐ明朝" w:eastAsia="ＭＳ Ｐ明朝" w:hAnsi="ＭＳ Ｐ明朝" w:cs="Arial" w:hint="eastAsia"/>
+          <w:sz w:val="22"/>
+          <w:szCs w:val="22"/>
+        </w:rPr>
+        <w:t>みて取引高上限である100％のうち平均してその1</w:t>
+      </w:r>
+      <w:r>
+        <w:rPr>
+          <w:rFonts w:ascii="ＭＳ Ｐ明朝" w:eastAsia="ＭＳ Ｐ明朝" w:hAnsi="ＭＳ Ｐ明朝" w:cs="Arial"/>
+          <w:sz w:val="22"/>
+          <w:szCs w:val="22"/>
+        </w:rPr>
+        <w:t>0％の自己株式の取引が市場でなされると想定し、その水準の取引高は市場価格への影響が軽微であること、</w:t>
+      </w:r>
+      <w:r>
+        <w:rPr>
+          <w:rFonts w:ascii="ＭＳ Ｐ明朝" w:eastAsia="ＭＳ Ｐ明朝" w:hAnsi="ＭＳ Ｐ明朝" w:cs="Arial" w:hint="eastAsia"/>
+          <w:sz w:val="22"/>
+          <w:szCs w:val="22"/>
+        </w:rPr>
+        <w:t>また新株予</w:t>
+      </w:r>
+      <w:r>
+        <w:rPr>
+          <w:rFonts w:ascii="ＭＳ Ｐ明朝" w:eastAsia="ＭＳ Ｐ明朝" w:hAnsi="ＭＳ Ｐ明朝" w:cs="Arial"/>
+          <w:sz w:val="22"/>
+          <w:szCs w:val="22"/>
+        </w:rPr>
+        <w:t>約権の評価を行う一般的な算定機関において通常利用している数値でもあることから日次売買高の10%という数値を採用したことは妥当であると考えておりま</w:t>
+      </w:r>
+      <w:r>
+        <w:rPr>
+          <w:rFonts w:ascii="ＭＳ Ｐ明朝" w:eastAsia="ＭＳ Ｐ明朝" w:hAnsi="ＭＳ Ｐ明朝" w:cs="Arial" w:hint="eastAsia"/>
+          <w:sz w:val="22"/>
+          <w:szCs w:val="22"/>
+        </w:rPr>
+        <w:t>す</w:t>
+      </w:r>
+      <w:r>
+        <w:rPr>
+          <w:rFonts w:ascii="ＭＳ Ｐ明朝" w:eastAsia="ＭＳ Ｐ明朝" w:hAnsi="ＭＳ Ｐ明朝" w:cs="Arial" w:hint="eastAsia"/>
+          <w:szCs w:val="21"/>
+          <w:sz w:val="22"/>
+        </w:rPr>
+        <w:t>。）。</w:t>
+      </w:r>
+    </w:p>
+    <w:p>
+      <w:pPr>
         <w:pStyle w:val="2"/>
         <w:ind w:firstLineChars="100" w:firstLine="220"/>
         <w:rPr>
@@ -6000,529 +6469,7 @@
           <w:sz w:val="22"/>
           <w:szCs w:val="22"/>
         </w:rPr>
-      </w:pPr>
-      <w:bookmarkStart w:id="9" w:name="_Toc223971643"/>
-      <w:bookmarkStart w:id="10" w:name="_Toc179738840"/>
-      <w:r>
-        <w:rPr>
-          <w:rFonts w:ascii="ＭＳ Ｐ明朝" w:eastAsia="ＭＳ Ｐ明朝" w:hAnsi="ＭＳ Ｐ明朝" w:cs="Arial"/>
-          <w:sz w:val="22"/>
-          <w:szCs w:val="22"/>
-        </w:rPr>
-        <w:lastRenderedPageBreak/>
-        <w:t>6</w:t>
-      </w:r>
-      <w:r>
-        <w:rPr>
-          <w:rFonts w:ascii="ＭＳ Ｐ明朝" w:eastAsia="ＭＳ Ｐ明朝" w:hAnsi="ＭＳ Ｐ明朝" w:cs="Arial" w:hint="eastAsia"/>
-          <w:sz w:val="22"/>
-          <w:szCs w:val="22"/>
-        </w:rPr>
-        <w:t xml:space="preserve">. </w:t>
-      </w:r>
-      <w:r>
-        <w:rPr>
-          <w:rFonts w:ascii="ＭＳ Ｐ明朝" w:eastAsia="ＭＳ Ｐ明朝" w:hAnsi="ＭＳ Ｐ明朝" w:cs="Arial"/>
-          <w:sz w:val="22"/>
-          <w:szCs w:val="22"/>
-        </w:rPr>
-        <w:t>新株予約権の評価額の算定に当たって採用した</w:t>
-      </w:r>
-      <w:r>
-        <w:rPr>
-          <w:rFonts w:ascii="ＭＳ Ｐ明朝" w:eastAsia="ＭＳ Ｐ明朝" w:hAnsi="ＭＳ Ｐ明朝" w:cs="Arial" w:hint="eastAsia"/>
-          <w:sz w:val="22"/>
-          <w:szCs w:val="22"/>
-        </w:rPr>
-        <w:t>仮定</w:t>
-      </w:r>
-      <w:bookmarkEnd w:id="9"/>
-    </w:p>
-    <w:p>
-      <w:pPr>
-        <w:ind w:left="360" w:firstLineChars="75" w:firstLine="165"/>
-        <w:rPr>
-          <w:rFonts w:ascii="ＭＳ Ｐ明朝" w:eastAsia="ＭＳ Ｐ明朝" w:hAnsi="ＭＳ Ｐ明朝" w:cs="Arial"/>
-          <w:sz w:val="22"/>
-          <w:szCs w:val="22"/>
-        </w:rPr>
-      </w:pPr>
-      <w:r>
-        <w:rPr>
-          <w:rFonts w:ascii="ＭＳ Ｐ明朝" w:eastAsia="ＭＳ Ｐ明朝" w:hAnsi="ＭＳ Ｐ明朝" w:cs="Arial"/>
-          <w:sz w:val="22"/>
-          <w:szCs w:val="22"/>
-        </w:rPr>
-        <w:t>新株予約権の評価額の算定を行う上で必要な</w:t>
-      </w:r>
-      <w:r>
-        <w:rPr>
-          <w:rFonts w:ascii="ＭＳ Ｐ明朝" w:eastAsia="ＭＳ Ｐ明朝" w:hAnsi="ＭＳ Ｐ明朝" w:cs="Arial" w:hint="eastAsia"/>
-          <w:sz w:val="22"/>
-          <w:szCs w:val="22"/>
-        </w:rPr>
-        <w:t>仮定を下記のとおり設定しました。</w:t>
-      </w:r>
-    </w:p>
-    <w:p>
-      <w:pPr>
-        <w:ind w:leftChars="270" w:left="648"/>
-        <w:rPr>
-          <w:rFonts w:ascii="ＭＳ Ｐ明朝" w:eastAsia="ＭＳ Ｐ明朝" w:hAnsi="ＭＳ Ｐ明朝" w:cs="Arial"/>
-          <w:sz w:val="22"/>
-          <w:szCs w:val="22"/>
-        </w:rPr>
-      </w:pPr>
-    </w:p>
-    <w:p>
-      <w:pPr>
-        <w:ind w:leftChars="270" w:left="648"/>
-        <w:rPr>
-          <w:rFonts w:ascii="ＭＳ Ｐ明朝" w:eastAsia="ＭＳ Ｐ明朝" w:hAnsi="ＭＳ Ｐ明朝" w:cs="Arial"/>
-          <w:sz w:val="22"/>
-          <w:szCs w:val="22"/>
-        </w:rPr>
-      </w:pPr>
-      <w:r>
-        <w:rPr>
-          <w:rFonts w:ascii="ＭＳ Ｐ明朝" w:eastAsia="ＭＳ Ｐ明朝" w:hAnsi="ＭＳ Ｐ明朝" w:cs="Arial"/>
-          <w:sz w:val="22"/>
-          <w:szCs w:val="22"/>
-        </w:rPr>
-        <w:t>・短期金利は時間を通じて既知であり、一定である。</w:t>
-      </w:r>
-    </w:p>
-    <w:p>
-      <w:pPr>
-        <w:ind w:leftChars="270" w:left="648"/>
-        <w:rPr>
-          <w:rFonts w:ascii="ＭＳ Ｐ明朝" w:eastAsia="ＭＳ Ｐ明朝" w:hAnsi="ＭＳ Ｐ明朝" w:cs="Arial"/>
-          <w:sz w:val="22"/>
-          <w:szCs w:val="22"/>
-        </w:rPr>
-      </w:pPr>
-      <w:r>
-        <w:rPr>
-          <w:rFonts w:ascii="ＭＳ Ｐ明朝" w:eastAsia="ＭＳ Ｐ明朝" w:hAnsi="ＭＳ Ｐ明朝" w:cs="Arial" w:hint="eastAsia"/>
-          <w:sz w:val="22"/>
-          <w:szCs w:val="22"/>
-        </w:rPr>
-        <w:t>・</w:t>
-      </w:r>
-      <w:r>
-        <w:rPr>
-          <w:rFonts w:ascii="ＭＳ Ｐ明朝" w:eastAsia="ＭＳ Ｐ明朝" w:hAnsi="ＭＳ Ｐ明朝" w:cs="Arial"/>
-          <w:sz w:val="22"/>
-          <w:szCs w:val="22"/>
-        </w:rPr>
-        <w:t>ボラティリティは時間を通じて一定である。</w:t>
-      </w:r>
-    </w:p>
-    <w:p>
-      <w:pPr>
-        <w:ind w:leftChars="270" w:left="648"/>
-        <w:rPr>
-          <w:rFonts w:ascii="ＭＳ Ｐ明朝" w:eastAsia="ＭＳ Ｐ明朝" w:hAnsi="ＭＳ Ｐ明朝" w:cs="Arial"/>
-          <w:sz w:val="22"/>
-          <w:szCs w:val="22"/>
-        </w:rPr>
-      </w:pPr>
-      <w:r>
-        <w:rPr>
-          <w:rFonts w:ascii="ＭＳ Ｐ明朝" w:eastAsia="ＭＳ Ｐ明朝" w:hAnsi="ＭＳ Ｐ明朝" w:cs="Arial" w:hint="eastAsia"/>
-          <w:sz w:val="22"/>
-          <w:szCs w:val="22"/>
-        </w:rPr>
-        <w:t>・</w:t>
-      </w:r>
-      <w:r>
-        <w:rPr>
-          <w:rFonts w:ascii="ＭＳ Ｐ明朝" w:eastAsia="ＭＳ Ｐ明朝" w:hAnsi="ＭＳ Ｐ明朝" w:cs="Arial"/>
-          <w:sz w:val="22"/>
-          <w:szCs w:val="22"/>
-        </w:rPr>
-        <w:t>株、オプションの売買に取引コストは発生しない。</w:t>
-      </w:r>
-    </w:p>
-    <w:p>
-      <w:pPr>
-        <w:ind w:leftChars="270" w:left="648"/>
-        <w:rPr>
-          <w:rFonts w:ascii="ＭＳ Ｐ明朝" w:eastAsia="ＭＳ Ｐ明朝" w:hAnsi="ＭＳ Ｐ明朝" w:cs="Arial"/>
-          <w:sz w:val="22"/>
-          <w:szCs w:val="22"/>
-        </w:rPr>
-      </w:pPr>
-      <w:r>
-        <w:rPr>
-          <w:rFonts w:ascii="ＭＳ Ｐ明朝" w:eastAsia="ＭＳ Ｐ明朝" w:hAnsi="ＭＳ Ｐ明朝" w:cs="Arial" w:hint="eastAsia"/>
-          <w:sz w:val="22"/>
-          <w:szCs w:val="22"/>
-        </w:rPr>
-        <w:t>・</w:t>
-      </w:r>
-      <w:r>
-        <w:rPr>
-          <w:rFonts w:ascii="ＭＳ Ｐ明朝" w:eastAsia="ＭＳ Ｐ明朝" w:hAnsi="ＭＳ Ｐ明朝" w:cs="Arial"/>
-          <w:sz w:val="22"/>
-          <w:szCs w:val="22"/>
-        </w:rPr>
-        <w:t>株の購入をするために、短期金利で有価証券の価格の一部を借入できる。</w:t>
-      </w:r>
-    </w:p>
-    <w:p>
-      <w:pPr>
-        <w:tabs>
-          <w:tab w:val="num" w:pos="1637"/>
-        </w:tabs>
-        <w:ind w:leftChars="270" w:left="648"/>
-        <w:rPr>
-          <w:rFonts w:ascii="ＭＳ Ｐ明朝" w:eastAsia="ＭＳ Ｐ明朝" w:hAnsi="ＭＳ Ｐ明朝" w:cs="Arial"/>
-          <w:sz w:val="22"/>
-          <w:szCs w:val="22"/>
-        </w:rPr>
-      </w:pPr>
-      <w:r>
-        <w:rPr>
-          <w:rFonts w:ascii="ＭＳ Ｐ明朝" w:eastAsia="ＭＳ Ｐ明朝" w:hAnsi="ＭＳ Ｐ明朝" w:cs="Arial" w:hint="eastAsia"/>
-          <w:sz w:val="22"/>
-          <w:szCs w:val="22"/>
-        </w:rPr>
-        <w:t>・</w:t>
-      </w:r>
-      <w:r>
-        <w:rPr>
-          <w:rFonts w:ascii="ＭＳ Ｐ明朝" w:eastAsia="ＭＳ Ｐ明朝" w:hAnsi="ＭＳ Ｐ明朝" w:cs="Arial"/>
-          <w:sz w:val="22"/>
-          <w:szCs w:val="22"/>
-        </w:rPr>
-        <w:t>株式の空売り</w:t>
-      </w:r>
-      <w:r>
-        <w:rPr>
-          <w:rFonts w:ascii="ＭＳ Ｐ明朝" w:eastAsia="ＭＳ Ｐ明朝" w:hAnsi="ＭＳ Ｐ明朝" w:cs="Arial" w:hint="eastAsia"/>
-          <w:sz w:val="22"/>
-          <w:szCs w:val="22"/>
-        </w:rPr>
-        <w:t>に対してペナルティはないものとする</w:t>
-      </w:r>
-      <w:r>
-        <w:rPr>
-          <w:rFonts w:ascii="ＭＳ Ｐ明朝" w:eastAsia="ＭＳ Ｐ明朝" w:hAnsi="ＭＳ Ｐ明朝" w:cs="Arial"/>
-          <w:sz w:val="22"/>
-          <w:szCs w:val="22"/>
-        </w:rPr>
-        <w:t>。</w:t>
-      </w:r>
-    </w:p>
-    <w:p>
-      <w:pPr>
-        <w:ind w:leftChars="270" w:left="648"/>
-        <w:rPr>
-          <w:rFonts w:ascii="ＭＳ Ｐ明朝" w:eastAsia="ＭＳ Ｐ明朝" w:hAnsi="ＭＳ Ｐ明朝" w:cs="Arial"/>
-          <w:sz w:val="22"/>
-          <w:szCs w:val="22"/>
-        </w:rPr>
-      </w:pPr>
-      <w:r>
-        <w:rPr>
-          <w:rFonts w:ascii="ＭＳ Ｐ明朝" w:eastAsia="ＭＳ Ｐ明朝" w:hAnsi="ＭＳ Ｐ明朝" w:cs="Arial" w:hint="eastAsia"/>
-          <w:sz w:val="22"/>
-          <w:szCs w:val="22"/>
-        </w:rPr>
-        <w:t>・株式の流動性については、新株予約権の行使により取得した株式を1営業日あた</w:t>
-      </w:r>
-      <w:r>
-        <w:rPr>
-          <w:rFonts w:ascii="ＭＳ Ｐ明朝" w:eastAsia="ＭＳ Ｐ明朝" w:hAnsi="ＭＳ Ｐ明朝" w:cs="Arial"/>
-          <w:sz w:val="22"/>
-          <w:szCs w:val="22"/>
-        </w:rPr>
-        <w:t>1</w:t>
-      </w:r>
-      <w:r>
-        <w:rPr>
-          <w:rFonts w:ascii="ＭＳ Ｐ明朝" w:eastAsia="ＭＳ Ｐ明朝" w:hAnsi="ＭＳ Ｐ明朝" w:cs="Arial"/>
-          <w:sz w:val="22"/>
-          <w:szCs w:val="22"/>
-        </w:rPr>
-        <w:t>48,31</w:t>
-      </w:r>
-      <w:r>
-        <w:rPr>
-          <w:rFonts w:ascii="ＭＳ Ｐ明朝" w:eastAsia="ＭＳ Ｐ明朝" w:hAnsi="ＭＳ Ｐ明朝" w:cs="Arial" w:hint="eastAsia"/>
-          <w:sz w:val="22"/>
-          <w:szCs w:val="22"/>
-        </w:rPr>
-        <w:t>3株（2</w:t>
-      </w:r>
-      <w:r>
-        <w:rPr>
-          <w:rFonts w:ascii="ＭＳ Ｐ明朝" w:eastAsia="ＭＳ Ｐ明朝" w:hAnsi="ＭＳ Ｐ明朝" w:cs="Arial"/>
-          <w:sz w:val="22"/>
-          <w:szCs w:val="22"/>
-        </w:rPr>
-        <w:t>0</w:t>
-      </w:r>
-      <w:r>
-        <w:rPr>
-          <w:rFonts w:ascii="ＭＳ Ｐ明朝" w:eastAsia="ＭＳ Ｐ明朝" w:hAnsi="ＭＳ Ｐ明朝" w:cs="Arial"/>
-          <w:sz w:val="22"/>
-          <w:szCs w:val="22"/>
-        </w:rPr>
-        <w:t>2</w:t>
-      </w:r>
-      <w:r>
-        <w:rPr>
-          <w:rFonts w:ascii="ＭＳ Ｐ明朝" w:eastAsia="ＭＳ Ｐ明朝" w:hAnsi="ＭＳ Ｐ明朝" w:cs="Arial" w:hint="eastAsia"/>
-          <w:sz w:val="22"/>
-          <w:szCs w:val="22"/>
-        </w:rPr>
-        <w:t>1</w:t>
-      </w:r>
-      <w:r>
-        <w:rPr>
-          <w:rFonts w:ascii="ＭＳ Ｐ明朝" w:eastAsia="ＭＳ Ｐ明朝" w:hAnsi="ＭＳ Ｐ明朝" w:cs="Arial"/>
-          <w:sz w:val="22"/>
-          <w:szCs w:val="22"/>
-        </w:rPr>
-        <w:t>年</w:t>
-      </w:r>
-      <w:r>
-        <w:rPr>
-          <w:rFonts w:ascii="ＭＳ Ｐ明朝" w:eastAsia="ＭＳ Ｐ明朝" w:hAnsi="ＭＳ Ｐ明朝" w:cs="Arial" w:hint="eastAsia"/>
-          <w:sz w:val="22"/>
-          <w:szCs w:val="22"/>
-        </w:rPr>
-        <w:t>3</w:t>
-      </w:r>
-      <w:r>
-        <w:rPr>
-          <w:rFonts w:ascii="ＭＳ Ｐ明朝" w:eastAsia="ＭＳ Ｐ明朝" w:hAnsi="ＭＳ Ｐ明朝" w:cs="Arial"/>
-          <w:sz w:val="22"/>
-          <w:szCs w:val="22"/>
-        </w:rPr>
-        <w:t>月3</w:t>
-      </w:r>
-      <w:r>
-        <w:rPr>
-          <w:rFonts w:ascii="ＭＳ Ｐ明朝" w:eastAsia="ＭＳ Ｐ明朝" w:hAnsi="ＭＳ Ｐ明朝" w:cs="Arial" w:hint="eastAsia"/>
-          <w:sz w:val="22"/>
-          <w:szCs w:val="22"/>
-        </w:rPr>
-        <w:t>日から</w:t>
-      </w:r>
-      <w:r>
-        <w:rPr>
-          <w:rFonts w:ascii="ＭＳ Ｐ明朝" w:eastAsia="ＭＳ Ｐ明朝" w:hAnsi="ＭＳ Ｐ明朝" w:cs="Arial" w:hint="eastAsia"/>
-          <w:sz w:val="22"/>
-          <w:szCs w:val="22"/>
-        </w:rPr>
-        <w:t>2026</w:t>
-      </w:r>
-      <w:r>
-        <w:rPr>
-          <w:rFonts w:ascii="ＭＳ Ｐ明朝" w:eastAsia="ＭＳ Ｐ明朝" w:hAnsi="ＭＳ Ｐ明朝" w:cs="Arial" w:hint="eastAsia"/>
-          <w:sz w:val="22"/>
-          <w:szCs w:val="22"/>
-        </w:rPr>
-        <w:t>年</w:t>
-      </w:r>
-      <w:r>
-        <w:rPr>
-          <w:rFonts w:ascii="ＭＳ Ｐ明朝" w:eastAsia="ＭＳ Ｐ明朝" w:hAnsi="ＭＳ Ｐ明朝" w:cs="Arial"/>
-          <w:sz w:val="22"/>
-          <w:szCs w:val="22"/>
-        </w:rPr>
-        <w:t>3</w:t>
-      </w:r>
-      <w:r>
-        <w:rPr>
-          <w:rFonts w:ascii="ＭＳ Ｐ明朝" w:eastAsia="ＭＳ Ｐ明朝" w:hAnsi="ＭＳ Ｐ明朝" w:cs="Arial" w:hint="eastAsia"/>
-          <w:sz w:val="22"/>
-          <w:szCs w:val="22"/>
-        </w:rPr>
-        <w:t>月</w:t>
-      </w:r>
-      <w:r>
-        <w:rPr>
-          <w:rFonts w:ascii="ＭＳ Ｐ明朝" w:eastAsia="ＭＳ Ｐ明朝" w:hAnsi="ＭＳ Ｐ明朝" w:cs="Arial"/>
-          <w:sz w:val="22"/>
-          <w:szCs w:val="22"/>
-        </w:rPr>
-        <w:t>2</w:t>
-      </w:r>
-      <w:r>
-        <w:rPr>
-          <w:rFonts w:ascii="ＭＳ Ｐ明朝" w:eastAsia="ＭＳ Ｐ明朝" w:hAnsi="ＭＳ Ｐ明朝" w:cs="Arial" w:hint="eastAsia"/>
-          <w:sz w:val="22"/>
-          <w:szCs w:val="22"/>
-        </w:rPr>
-        <w:t>日までの日次売買高の中央値である</w:t>
-      </w:r>
-      <w:r>
-        <w:rPr>
-          <w:rFonts w:ascii="ＭＳ Ｐ明朝" w:eastAsia="ＭＳ Ｐ明朝" w:hAnsi="ＭＳ Ｐ明朝" w:cs="Arial"/>
-          <w:sz w:val="22"/>
-          <w:szCs w:val="22"/>
-        </w:rPr>
-        <w:t>1</w:t>
-      </w:r>
-      <w:r>
-        <w:rPr>
-          <w:rFonts w:ascii="ＭＳ Ｐ明朝" w:eastAsia="ＭＳ Ｐ明朝" w:hAnsi="ＭＳ Ｐ明朝" w:cs="Arial"/>
-          <w:sz w:val="22"/>
-          <w:szCs w:val="22"/>
-        </w:rPr>
-        <w:t>,483,1</w:t>
-      </w:r>
-      <w:r>
-        <w:rPr>
-          <w:rFonts w:ascii="ＭＳ Ｐ明朝" w:eastAsia="ＭＳ Ｐ明朝" w:hAnsi="ＭＳ Ｐ明朝" w:cs="Arial" w:hint="eastAsia"/>
-          <w:sz w:val="22"/>
-          <w:szCs w:val="22"/>
-        </w:rPr>
-        <w:t>23株の10％</w:t>
-      </w:r>
-      <w:r>
-        <w:rPr>
-          <w:rFonts w:ascii="ＭＳ Ｐ明朝" w:eastAsia="ＭＳ Ｐ明朝" w:hAnsi="ＭＳ Ｐ明朝" w:cs="Arial"/>
-          <w:sz w:val="22"/>
-          <w:szCs w:val="22"/>
-        </w:rPr>
-        <w:t xml:space="preserve"> 小数点第一</w:t>
-      </w:r>
-      <w:r>
-        <w:rPr>
-          <w:rFonts w:ascii="ＭＳ Ｐ明朝" w:eastAsia="ＭＳ Ｐ明朝" w:hAnsi="ＭＳ Ｐ明朝" w:cs="Arial" w:hint="eastAsia"/>
-          <w:sz w:val="22"/>
-          <w:szCs w:val="22"/>
-        </w:rPr>
-        <w:t>位を切り</w:t>
-      </w:r>
-      <w:r>
-        <w:rPr>
-          <w:rFonts w:ascii="ＭＳ Ｐ明朝" w:eastAsia="ＭＳ Ｐ明朝" w:hAnsi="ＭＳ Ｐ明朝" w:cs="Arial"/>
-          <w:sz w:val="22"/>
-          <w:szCs w:val="22"/>
-        </w:rPr>
-        <w:t>上</w:t>
-      </w:r>
-      <w:r>
-        <w:rPr>
-          <w:rFonts w:ascii="ＭＳ Ｐ明朝" w:eastAsia="ＭＳ Ｐ明朝" w:hAnsi="ＭＳ Ｐ明朝" w:cs="Arial" w:hint="eastAsia"/>
-          <w:sz w:val="22"/>
-          <w:szCs w:val="22"/>
-        </w:rPr>
-        <w:t>げ</w:t>
-      </w:r>
-      <w:r>
-        <w:rPr>
-          <w:rFonts w:ascii="ＭＳ Ｐ明朝" w:eastAsia="ＭＳ Ｐ明朝" w:hAnsi="ＭＳ Ｐ明朝" w:cs="Arial"/>
-          <w:sz w:val="22"/>
-          <w:szCs w:val="22"/>
-        </w:rPr>
-        <w:t>）ずつ売却できるものと</w:t>
-      </w:r>
-      <w:r>
-        <w:rPr>
-          <w:rFonts w:ascii="ＭＳ Ｐ明朝" w:eastAsia="ＭＳ Ｐ明朝" w:hAnsi="ＭＳ Ｐ明朝" w:cs="Arial" w:hint="eastAsia"/>
-          <w:sz w:val="22"/>
-          <w:szCs w:val="22"/>
-        </w:rPr>
-        <w:t>す</w:t>
-      </w:r>
-      <w:r>
-        <w:rPr>
-          <w:rFonts w:ascii="ＭＳ Ｐ明朝" w:eastAsia="ＭＳ Ｐ明朝" w:hAnsi="ＭＳ Ｐ明朝" w:cs="Arial"/>
-          <w:sz w:val="22"/>
-          <w:szCs w:val="22"/>
-        </w:rPr>
-        <w:t>る（日次売</w:t>
-      </w:r>
-      <w:r>
-        <w:rPr>
-          <w:rFonts w:ascii="ＭＳ Ｐ明朝" w:eastAsia="ＭＳ Ｐ明朝" w:hAnsi="ＭＳ Ｐ明朝" w:cs="Arial" w:hint="eastAsia"/>
-          <w:sz w:val="22"/>
-          <w:szCs w:val="22"/>
-        </w:rPr>
-        <w:t>買</w:t>
-      </w:r>
-      <w:r>
-        <w:rPr>
-          <w:rFonts w:ascii="ＭＳ Ｐ明朝" w:eastAsia="ＭＳ Ｐ明朝" w:hAnsi="ＭＳ Ｐ明朝" w:cs="Arial"/>
-          <w:sz w:val="22"/>
-          <w:szCs w:val="22"/>
-        </w:rPr>
-        <w:t>高の10%という数値につきましては、市場環境への影響を鑑</w:t>
-      </w:r>
-      <w:r>
-        <w:rPr>
-          <w:rFonts w:ascii="ＭＳ Ｐ明朝" w:eastAsia="ＭＳ Ｐ明朝" w:hAnsi="ＭＳ Ｐ明朝" w:cs="Arial" w:hint="eastAsia"/>
-          <w:sz w:val="22"/>
-          <w:szCs w:val="22"/>
-        </w:rPr>
-        <w:t>みて取引高上限である100％のうち平均してその1</w:t>
-      </w:r>
-      <w:r>
-        <w:rPr>
-          <w:rFonts w:ascii="ＭＳ Ｐ明朝" w:eastAsia="ＭＳ Ｐ明朝" w:hAnsi="ＭＳ Ｐ明朝" w:cs="Arial"/>
-          <w:sz w:val="22"/>
-          <w:szCs w:val="22"/>
-        </w:rPr>
-        <w:t>0％の自己株式の取引が市場でなされると想定し、その水準の取引高は市場価格への影響が軽微であること、</w:t>
-      </w:r>
-      <w:r>
-        <w:rPr>
-          <w:rFonts w:ascii="ＭＳ Ｐ明朝" w:eastAsia="ＭＳ Ｐ明朝" w:hAnsi="ＭＳ Ｐ明朝" w:cs="Arial" w:hint="eastAsia"/>
-          <w:sz w:val="22"/>
-          <w:szCs w:val="22"/>
-        </w:rPr>
-        <w:t>また新株予</w:t>
-      </w:r>
-      <w:r>
-        <w:rPr>
-          <w:rFonts w:ascii="ＭＳ Ｐ明朝" w:eastAsia="ＭＳ Ｐ明朝" w:hAnsi="ＭＳ Ｐ明朝" w:cs="Arial"/>
-          <w:sz w:val="22"/>
-          <w:szCs w:val="22"/>
-        </w:rPr>
-        <w:t>約権の評価を行う一般的な算定機関において通常利用している数値でもあることから日次売買高の10%という数値を採用したことは妥当であると考えておりま</w:t>
-      </w:r>
-      <w:r>
-        <w:rPr>
-          <w:rFonts w:ascii="ＭＳ Ｐ明朝" w:eastAsia="ＭＳ Ｐ明朝" w:hAnsi="ＭＳ Ｐ明朝" w:cs="Arial" w:hint="eastAsia"/>
-          <w:sz w:val="22"/>
-          <w:szCs w:val="22"/>
-        </w:rPr>
-        <w:t>す</w:t>
-      </w:r>
-      <w:r>
-        <w:rPr>
-          <w:rFonts w:ascii="ＭＳ Ｐ明朝" w:eastAsia="ＭＳ Ｐ明朝" w:hAnsi="ＭＳ Ｐ明朝" w:cs="Arial" w:hint="eastAsia"/>
-          <w:szCs w:val="21"/>
-          <w:sz w:val="22"/>
-        </w:rPr>
-        <w:t>。）。</w:t>
-      </w:r>
-    </w:p>
-    <w:p>
-      <w:pPr>
-        <w:ind w:firstLine="210"/>
-        <w:rPr>
-          <w:rFonts w:ascii="ＭＳ Ｐ明朝" w:eastAsia="ＭＳ Ｐ明朝" w:hAnsi="ＭＳ Ｐ明朝"/>
-        </w:rPr>
         <w:pageBreakBefore/>
-      </w:pPr>
-    </w:p>
-    <w:p>
-      <w:pPr>
-        <w:pStyle w:val="2"/>
-        <w:ind w:firstLineChars="100" w:firstLine="220"/>
-        <w:rPr>
-          <w:rFonts w:ascii="ＭＳ Ｐ明朝" w:eastAsia="ＭＳ Ｐ明朝" w:hAnsi="ＭＳ Ｐ明朝" w:cs="Arial"/>
-          <w:sz w:val="22"/>
-          <w:szCs w:val="22"/>
-        </w:rPr>
       </w:pPr>
       <w:bookmarkStart w:id="11" w:name="_Toc223971644"/>
       <w:r>
@@ -6574,7 +6521,7 @@
         </w:rPr>
         <w:t>現在）</w:t>
       </w:r>
-      <w:bookmarkEnd w:id="10"/>
+      <w:bookmarkEnd w:id="9"/>
       <w:bookmarkEnd w:id="11"/>
     </w:p>
     <w:p>
@@ -7037,17 +6984,6 @@
     </w:p>
     <w:p>
       <w:pPr>
-        <w:ind w:leftChars="-1" w:left="-2" w:firstLineChars="363" w:firstLine="799"/>
-        <w:rPr>
-          <w:rFonts w:ascii="ＭＳ Ｐ明朝" w:eastAsia="ＭＳ Ｐ明朝" w:hAnsi="ＭＳ Ｐ明朝" w:cs="Arial"/>
-          <w:sz w:val="22"/>
-          <w:szCs w:val="22"/>
-        </w:rPr>
-        <w:pageBreakBefore/>
-      </w:pPr>
-    </w:p>
-    <w:p>
-      <w:pPr>
         <w:pStyle w:val="2"/>
         <w:ind w:firstLineChars="100" w:firstLine="240"/>
         <w:rPr>
@@ -7055,21 +6991,17 @@
           <w:sz w:val="22"/>
           <w:szCs w:val="22"/>
         </w:rPr>
+        <w:pageBreakBefore/>
       </w:pPr>
       <w:r>
         <w:rPr>
           <w:rFonts w:ascii="ＭＳ Ｐ明朝" w:eastAsia="ＭＳ Ｐ明朝" w:hAnsi="ＭＳ Ｐ明朝"/>
-          <w:sz w:val="22"/>
-          <w:szCs w:val="22"/>
-        </w:rPr>
-        <w:br w:type="page"/>
+        </w:rPr>
       </w:r>
       <w:bookmarkStart w:id="12" w:name="_Toc223971645"/>
       <w:r>
         <w:rPr>
           <w:rFonts w:ascii="ＭＳ Ｐ明朝" w:eastAsia="ＭＳ Ｐ明朝" w:hAnsi="ＭＳ Ｐ明朝" w:hint="eastAsia"/>
-          <w:sz w:val="22"/>
-          <w:szCs w:val="22"/>
         </w:rPr>
         <w:lastRenderedPageBreak/>
         <w:t>8</w:t>
@@ -7077,8 +7009,6 @@
       <w:r>
         <w:rPr>
           <w:rFonts w:ascii="ＭＳ Ｐ明朝" w:eastAsia="ＭＳ Ｐ明朝" w:hAnsi="ＭＳ Ｐ明朝" w:hint="eastAsia"/>
-          <w:sz w:val="22"/>
-          <w:szCs w:val="22"/>
         </w:rPr>
         <w:t xml:space="preserve">. </w:t>
       </w:r>
@@ -7788,28 +7718,16 @@
     </w:tbl>
     <w:p>
       <w:pPr>
-        <w:rPr>
-          <w:rFonts w:ascii="ＭＳ Ｐ明朝" w:eastAsia="ＭＳ Ｐ明朝" w:hAnsi="ＭＳ Ｐ明朝"/>
-          <w:sz w:val="21"/>
-          <w:szCs w:val="21"/>
+        <w:pStyle w:val="1"/>
+        <w:rPr>
+          <w:rFonts w:ascii="ＭＳ Ｐ明朝" w:eastAsia="ＭＳ Ｐ明朝" w:hAnsi="ＭＳ Ｐ明朝" w:cs="Arial"/>
         </w:rPr>
         <w:pageBreakBefore/>
       </w:pPr>
-      <w:bookmarkStart w:id="13" w:name="_Toc179738843"/>
-    </w:p>
-    <w:p>
-      <w:pPr>
-        <w:pStyle w:val="1"/>
-        <w:rPr>
-          <w:rFonts w:ascii="ＭＳ Ｐ明朝" w:eastAsia="ＭＳ Ｐ明朝" w:hAnsi="ＭＳ Ｐ明朝" w:cs="Arial"/>
-        </w:rPr>
-      </w:pPr>
       <w:bookmarkStart w:id="14" w:name="_Toc223971646"/>
       <w:r>
         <w:rPr>
           <w:rFonts w:ascii="ＭＳ Ｐ明朝" w:eastAsia="ＭＳ Ｐ明朝" w:hAnsi="ＭＳ Ｐ明朝" w:cs="ＭＳ ゴシック" w:hint="eastAsia"/>
-          <w:sz w:val="22"/>
-          <w:szCs w:val="22"/>
         </w:rPr>
         <w:lastRenderedPageBreak/>
         <w:t>Ⅱ</w:t>
@@ -7817,16 +7735,12 @@
       <w:r>
         <w:rPr>
           <w:rFonts w:ascii="ＭＳ Ｐ明朝" w:eastAsia="ＭＳ Ｐ明朝" w:hAnsi="ＭＳ Ｐ明朝" w:cs="Arial"/>
-          <w:sz w:val="22"/>
-          <w:szCs w:val="22"/>
         </w:rPr>
         <w:t xml:space="preserve">　新株予約権の評価額</w:t>
       </w:r>
       <w:r>
         <w:rPr>
           <w:rFonts w:ascii="ＭＳ Ｐ明朝" w:eastAsia="ＭＳ Ｐ明朝" w:hAnsi="ＭＳ Ｐ明朝" w:cs="Arial"/>
-          <w:sz w:val="22"/>
-          <w:szCs w:val="22"/>
         </w:rPr>
         <w:t>算定の内容</w:t>
       </w:r>
@@ -8579,7 +8493,7 @@
           <w:sz w:val="22"/>
           <w:szCs w:val="22"/>
         </w:rPr>
-        <w:object w:dxaOrig="3260" w:dyaOrig="640" w14:anchorId="5FDB6589">
+        <w:object w:dxaOrig="3260" w:dyaOrig="640" w14:anchorId="610B483B">
           <v:shapetype id="_x0000_t75" coordsize="21600,21600" o:spt="75" o:preferrelative="t" path="m@4@5l@4@11@9@11@9@5xe" filled="f" stroked="f">
             <v:stroke joinstyle="miter"/>
             <v:formulas>
@@ -8602,7 +8516,7 @@
           <v:shape id="_x0000_i1027" type="#_x0000_t75" alt="" style="width:163pt;height:31pt;mso-width-percent:0;mso-height-percent:0;mso-width-percent:0;mso-height-percent:0" o:ole="">
             <v:imagedata r:id="rId13" o:title=""/>
           </v:shape>
-          <o:OLEObject Type="Embed" ProgID="Equation.3" ShapeID="_x0000_i1027" DrawAspect="Content" ObjectID="_1834591869" r:id="rId14"/>
+          <o:OLEObject Type="Embed" ProgID="Equation.3" ShapeID="_x0000_i1027" DrawAspect="Content" ObjectID="_1834584540" r:id="rId14"/>
         </w:object>
       </w:r>
     </w:p>
@@ -9237,8 +9151,6 @@
           <w:rFonts w:ascii="ＭＳ Ｐ明朝" w:eastAsia="ＭＳ Ｐ明朝" w:hAnsi="ＭＳ Ｐ明朝" w:cs="Arial" w:hint="eastAsia"/>
           <w:iCs/>
           <w:noProof/>
-          <w:sz w:val="22"/>
-          <w:szCs w:val="22"/>
         </w:rPr>
         <w:t xml:space="preserve"> </w:t>
       </w:r>
@@ -9275,8 +9187,6 @@
         <w:rPr>
           <w:rFonts w:ascii="ＭＳ Ｐ明朝" w:eastAsia="ＭＳ Ｐ明朝" w:hAnsi="ＭＳ Ｐ明朝" w:cs="Arial" w:hint="eastAsia"/>
           <w:iCs/>
-          <w:sz w:val="22"/>
-          <w:szCs w:val="22"/>
         </w:rPr>
         <w:t xml:space="preserve"> </w:t>
       </w:r>
@@ -10080,7 +9990,6 @@
           <w:sz w:val="22"/>
           <w:szCs w:val="22"/>
         </w:rPr>
-        <w:pageBreakBefore/>
       </w:pPr>
       <w:r>
         <w:rPr>
@@ -10090,11 +9999,11 @@
           <w:sz w:val="22"/>
           <w:szCs w:val="22"/>
         </w:rPr>
-        <w:object w:dxaOrig="13" w:dyaOrig="13" w14:anchorId="5C98AF11">
+        <w:object w:dxaOrig="13" w:dyaOrig="13" w14:anchorId="21754F30">
           <v:shape id="_x0000_i1026" type="#_x0000_t75" alt="" style="width:1pt;height:1pt;mso-width-percent:0;mso-height-percent:0;mso-width-percent:0;mso-height-percent:0" o:ole="">
             <v:imagedata r:id="rId15" o:title=""/>
           </v:shape>
-          <o:OLEObject Type="Embed" ProgID="Equation.3" ShapeID="_x0000_i1026" DrawAspect="Content" ObjectID="_1834591870" r:id="rId16"/>
+          <o:OLEObject Type="Embed" ProgID="Equation.3" ShapeID="_x0000_i1026" DrawAspect="Content" ObjectID="_1834584541" r:id="rId16"/>
         </w:object>
       </w:r>
       <w:r>
@@ -10105,11 +10014,11 @@
           <w:sz w:val="22"/>
           <w:szCs w:val="22"/>
         </w:rPr>
-        <w:object w:dxaOrig="13" w:dyaOrig="13" w14:anchorId="3D63DD3E">
+        <w:object w:dxaOrig="13" w:dyaOrig="13" w14:anchorId="3F2C4B38">
           <v:shape id="_x0000_i1025" type="#_x0000_t75" alt="" style="width:1pt;height:1pt;mso-width-percent:0;mso-height-percent:0;mso-width-percent:0;mso-height-percent:0" o:ole="">
             <v:imagedata r:id="rId17" o:title=""/>
           </v:shape>
-          <o:OLEObject Type="Embed" ProgID="Equation.3" ShapeID="_x0000_i1025" DrawAspect="Content" ObjectID="_1834591871" r:id="rId18"/>
+          <o:OLEObject Type="Embed" ProgID="Equation.3" ShapeID="_x0000_i1025" DrawAspect="Content" ObjectID="_1834584542" r:id="rId18"/>
         </w:object>
       </w:r>
     </w:p>
@@ -10159,21 +10068,11 @@
     </w:p>
     <w:p>
       <w:pPr>
-        <w:ind w:firstLineChars="100" w:firstLine="220"/>
-        <w:rPr>
-          <w:rFonts w:ascii="ＭＳ Ｐ明朝" w:eastAsia="ＭＳ Ｐ明朝" w:hAnsi="ＭＳ Ｐ明朝" w:cs="Arial"/>
-          <w:sz w:val="22"/>
-          <w:szCs w:val="22"/>
+        <w:pStyle w:val="1"/>
+        <w:rPr>
+          <w:rFonts w:ascii="ＭＳ Ｐ明朝" w:eastAsia="ＭＳ Ｐ明朝" w:hAnsi="ＭＳ Ｐ明朝"/>
         </w:rPr>
         <w:pageBreakBefore/>
-      </w:pPr>
-    </w:p>
-    <w:p>
-      <w:pPr>
-        <w:pStyle w:val="1"/>
-        <w:rPr>
-          <w:rFonts w:ascii="ＭＳ Ｐ明朝" w:eastAsia="ＭＳ Ｐ明朝" w:hAnsi="ＭＳ Ｐ明朝"/>
-        </w:rPr>
       </w:pPr>
       <w:bookmarkStart w:id="21" w:name="_Toc179738849"/>
       <w:bookmarkStart w:id="22" w:name="_Toc179738850"/>
@@ -10194,8 +10093,6 @@
       <w:r>
         <w:rPr>
           <w:rFonts w:ascii="ＭＳ Ｐ明朝" w:eastAsia="ＭＳ Ｐ明朝" w:hAnsi="ＭＳ Ｐ明朝" w:cs="ＭＳ ゴシック" w:hint="eastAsia"/>
-          <w:sz w:val="22"/>
-          <w:szCs w:val="22"/>
         </w:rPr>
         <w:lastRenderedPageBreak/>
         <w:t>Ⅲ</w:t>
@@ -10203,8 +10100,6 @@
       <w:r>
         <w:rPr>
           <w:rFonts w:ascii="ＭＳ Ｐ明朝" w:eastAsia="ＭＳ Ｐ明朝" w:hAnsi="ＭＳ Ｐ明朝"/>
-          <w:sz w:val="22"/>
-          <w:szCs w:val="22"/>
         </w:rPr>
         <w:t xml:space="preserve">　本報告書の利用に当たっての留意事項</w:t>
       </w:r>
@@ -10269,17 +10164,6 @@
         </w:rPr>
         <w:t>以　上</w:t>
       </w:r>
-    </w:p>
-    <w:p>
-      <w:pPr>
-        <w:ind w:left="240" w:firstLineChars="50" w:firstLine="110"/>
-        <w:rPr>
-          <w:rFonts w:ascii="ＭＳ Ｐ明朝" w:eastAsia="ＭＳ Ｐ明朝" w:hAnsi="ＭＳ Ｐ明朝" w:cs="Arial"/>
-          <w:sz w:val="22"/>
-          <w:szCs w:val="22"/>
-        </w:rPr>
-        <w:pageBreakBefore/>
-      </w:pPr>
     </w:p>
     <w:sectPr>
       <w:headerReference w:type="even" r:id="rId19"/>
@@ -10437,7 +10321,7 @@
       <w:rPr>
         <w:noProof/>
       </w:rPr>
-      <w:pict w14:anchorId="41EE3317">
+      <w:pict w14:anchorId="65F466BF">
         <v:shapetype id="_x0000_t136" coordsize="21600,21600" o:spt="136" adj="10800" path="m@7,l@8,m@5,21600l@6,21600e">
           <v:formulas>
             <v:f eqn="sum #0 0 10800"/>
@@ -10483,7 +10367,7 @@
       <w:rPr>
         <w:noProof/>
       </w:rPr>
-      <w:pict w14:anchorId="63E27442">
+      <w:pict w14:anchorId="4AEB168F">
         <v:shapetype id="_x0000_t136" coordsize="21600,21600" o:spt="136" adj="10800" path="m@7,l@8,m@5,21600l@6,21600e">
           <v:formulas>
             <v:f eqn="sum #0 0 10800"/>
@@ -10553,7 +10437,7 @@
       <w:rPr>
         <w:noProof/>
       </w:rPr>
-      <w:pict w14:anchorId="2EBBE74F">
+      <w:pict w14:anchorId="14EE537D">
         <v:shapetype id="_x0000_t136" coordsize="21600,21600" o:spt="136" adj="10800" path="m@7,l@8,m@5,21600l@6,21600e">
           <v:formulas>
             <v:f eqn="sum #0 0 10800"/>
@@ -10599,7 +10483,7 @@
       <w:rPr>
         <w:noProof/>
       </w:rPr>
-      <w:pict w14:anchorId="1C7B4D21">
+      <w:pict w14:anchorId="7F8219A3">
         <v:shapetype id="_x0000_t136" coordsize="21600,21600" o:spt="136" adj="10800" path="m@7,l@8,m@5,21600l@6,21600e">
           <v:formulas>
             <v:f eqn="sum #0 0 10800"/>
@@ -10645,7 +10529,7 @@
       <w:rPr>
         <w:noProof/>
       </w:rPr>
-      <w:pict w14:anchorId="458F8BD0">
+      <w:pict w14:anchorId="47524EB7">
         <v:shapetype id="_x0000_t136" coordsize="21600,21600" o:spt="136" adj="10800" path="m@7,l@8,m@5,21600l@6,21600e">
           <v:formulas>
             <v:f eqn="sum #0 0 10800"/>
@@ -10715,7 +10599,7 @@
       <w:rPr>
         <w:noProof/>
       </w:rPr>
-      <w:pict w14:anchorId="466A574F">
+      <w:pict w14:anchorId="3E0618C1">
         <v:shapetype id="_x0000_t136" coordsize="21600,21600" o:spt="136" adj="10800" path="m@7,l@8,m@5,21600l@6,21600e">
           <v:formulas>
             <v:f eqn="sum #0 0 10800"/>

</xml_diff>

<commit_message>
Fix TOC structure, add warrant round to report cover
- Fix TOC field: move begin/instrText/separate to own paragraph
- Add fldChar end after last TOC entry
- Remove duplicate pageBreakBefore causing blank page after 目次
- Extract warrant round from issuance text via AI
- Replace 第●回 on report cover with extracted round number

Co-Authored-By: Claude Opus 4.6 <noreply@anthropic.com>
</commit_message>
<xml_diff>
--- a/template.docx
+++ b/template.docx
@@ -864,7 +864,6 @@
           <w:sz w:val="22"/>
           <w:szCs w:val="22"/>
         </w:rPr>
-        <w:pageBreakBefore/>
       </w:pPr>
       <w:r>
         <w:rPr>
@@ -872,7 +871,23 @@
           <w:sz w:val="22"/>
           <w:szCs w:val="22"/>
         </w:rPr>
-        <w:fldChar w:fldCharType="end"/>
+        <w:fldChar w:fldCharType="begin"/>
+      </w:r>
+      <w:r>
+        <w:rPr>
+          <w:rFonts w:ascii="ＭＳ Ｐ明朝" w:eastAsia="ＭＳ Ｐ明朝" w:hAnsi="ＭＳ Ｐ明朝" w:cs="メイリオ"/>
+          <w:sz w:val="22"/>
+          <w:szCs w:val="22"/>
+        </w:rPr>
+        <w:instrText xml:space="preserve"> TOC \o "1-2" \h \z \u </w:instrText>
+      </w:r>
+      <w:r>
+        <w:rPr>
+          <w:rFonts w:ascii="ＭＳ Ｐ明朝" w:eastAsia="ＭＳ Ｐ明朝" w:hAnsi="ＭＳ Ｐ明朝" w:cs="メイリオ"/>
+          <w:sz w:val="22"/>
+          <w:szCs w:val="22"/>
+        </w:rPr>
+        <w:fldChar w:fldCharType="separate"/>
       </w:r>
     </w:p>
     <w:p>
@@ -886,30 +901,6 @@
           <w14:ligatures w14:val="standardContextual"/>
         </w:rPr>
       </w:pPr>
-      <w:r>
-        <w:rPr>
-          <w:rFonts w:ascii="ＭＳ Ｐ明朝" w:eastAsia="ＭＳ Ｐ明朝" w:hAnsi="ＭＳ Ｐ明朝" w:cs="メイリオ"/>
-          <w:sz w:val="22"/>
-          <w:szCs w:val="22"/>
-        </w:rPr>
-        <w:fldChar w:fldCharType="begin"/>
-      </w:r>
-      <w:r>
-        <w:rPr>
-          <w:rFonts w:ascii="ＭＳ Ｐ明朝" w:eastAsia="ＭＳ Ｐ明朝" w:hAnsi="ＭＳ Ｐ明朝" w:cs="メイリオ"/>
-          <w:sz w:val="22"/>
-          <w:szCs w:val="22"/>
-        </w:rPr>
-        <w:instrText xml:space="preserve"> TOC \o "1-2" \h \z \u </w:instrText>
-      </w:r>
-      <w:r>
-        <w:rPr>
-          <w:rFonts w:ascii="ＭＳ Ｐ明朝" w:eastAsia="ＭＳ Ｐ明朝" w:hAnsi="ＭＳ Ｐ明朝" w:cs="メイリオ"/>
-          <w:sz w:val="22"/>
-          <w:szCs w:val="22"/>
-        </w:rPr>
-        <w:fldChar w:fldCharType="separate"/>
-      </w:r>
       <w:hyperlink w:anchor="_Toc223971637" w:history="1">
         <w:r>
           <w:rPr>
@@ -1856,6 +1847,11 @@
           <w:fldChar w:fldCharType="end"/>
         </w:r>
       </w:hyperlink>
+    </w:p>
+    <w:p>
+      <w:r>
+        <w:fldChar w:fldCharType="end"/>
+      </w:r>
     </w:p>
     <w:p>
       <w:pPr>

</xml_diff>

<commit_message>
Update report template text
Co-Authored-By: Claude Opus 4.6 <noreply@anthropic.com>
</commit_message>
<xml_diff>
--- a/template.docx
+++ b/template.docx
@@ -329,11 +329,11 @@
     </w:p>
     <w:p>
       <w:pPr>
+        <w:pageBreakBefore/>
         <w:jc w:val="center"/>
         <w:rPr>
           <w:rFonts w:ascii="ＭＳ Ｐ明朝" w:eastAsia="ＭＳ Ｐ明朝" w:hAnsi="ＭＳ Ｐ明朝" w:cs="Arial"/>
         </w:rPr>
-        <w:pageBreakBefore/>
       </w:pPr>
     </w:p>
     <w:p>
@@ -459,12 +459,6 @@
         </w:rPr>
         <w:t>殿</w:t>
       </w:r>
-      <w:r>
-        <w:rPr>
-          <w:rFonts w:ascii="ＭＳ Ｐ明朝" w:eastAsia="ＭＳ Ｐ明朝" w:hAnsi="ＭＳ Ｐ明朝" w:cs="Arial"/>
-          <w:lang w:eastAsia="zh-CN"/>
-        </w:rPr>
-      </w:r>
     </w:p>
     <w:p>
       <w:pPr>
@@ -838,21 +832,22 @@
     </w:p>
     <w:p>
       <w:pPr>
-        <w:ind w:firstLineChars="100" w:firstLine="220"/>
+        <w:pageBreakBefore/>
+        <w:ind w:firstLineChars="100" w:firstLine="321"/>
         <w:jc w:val="center"/>
         <w:rPr>
           <w:rFonts w:ascii="ＭＳ Ｐ明朝" w:eastAsia="ＭＳ Ｐ明朝" w:hAnsi="ＭＳ Ｐ明朝" w:cs="Arial"/>
           <w:sz w:val="22"/>
           <w:szCs w:val="22"/>
         </w:rPr>
-        <w:pageBreakBefore/>
-      </w:pPr>
-      <w:r>
-        <w:rPr>
-          <w:rFonts w:ascii="ＭＳ Ｐ明朝" w:hAnsi="ＭＳ Ｐ明朝" w:eastAsia="ＭＳ Ｐ明朝"/>
+      </w:pPr>
+      <w:r>
+        <w:rPr>
+          <w:rFonts w:ascii="ＭＳ Ｐ明朝" w:eastAsia="ＭＳ Ｐ明朝" w:hAnsi="ＭＳ Ｐ明朝"/>
           <w:b/>
           <w:sz w:val="32"/>
         </w:rPr>
+        <w:lastRenderedPageBreak/>
         <w:t>目次</w:t>
       </w:r>
     </w:p>
@@ -1856,10 +1851,10 @@
     <w:p>
       <w:pPr>
         <w:pStyle w:val="1"/>
+        <w:pageBreakBefore/>
         <w:rPr>
           <w:rFonts w:ascii="ＭＳ Ｐ明朝" w:eastAsia="ＭＳ Ｐ明朝" w:hAnsi="ＭＳ Ｐ明朝" w:cs="Arial Unicode MS"/>
         </w:rPr>
-        <w:pageBreakBefore/>
       </w:pPr>
       <w:bookmarkStart w:id="0" w:name="_Toc179738835"/>
       <w:bookmarkStart w:id="1" w:name="_Toc223971637"/>
@@ -2204,23 +2199,7 @@
           <w:sz w:val="22"/>
           <w:szCs w:val="22"/>
         </w:rPr>
-        <w:t>論上</w:t>
-      </w:r>
-      <w:r>
-        <w:rPr>
-          <w:rFonts w:ascii="ＭＳ Ｐ明朝" w:eastAsia="ＭＳ Ｐ明朝" w:hAnsi="ＭＳ Ｐ明朝" w:cs="Arial" w:hint="eastAsia"/>
-          <w:sz w:val="22"/>
-          <w:szCs w:val="22"/>
-        </w:rPr>
-        <w:t>の</w:t>
-      </w:r>
-      <w:r>
-        <w:rPr>
-          <w:rFonts w:ascii="ＭＳ Ｐ明朝" w:eastAsia="ＭＳ Ｐ明朝" w:hAnsi="ＭＳ Ｐ明朝" w:cs="Arial" w:hint="eastAsia"/>
-          <w:sz w:val="22"/>
-          <w:szCs w:val="22"/>
-        </w:rPr>
-        <w:t>想定しているものであり、</w:t>
+        <w:t>論上想定しているものであり、</w:t>
       </w:r>
       <w:r>
         <w:rPr>
@@ -2263,13 +2242,6 @@
           <w:szCs w:val="22"/>
         </w:rPr>
       </w:pPr>
-      <w:r>
-        <w:rPr>
-          <w:rFonts w:ascii="ＭＳ Ｐ明朝" w:eastAsia="ＭＳ Ｐ明朝" w:hAnsi="ＭＳ Ｐ明朝" w:cs="Arial"/>
-          <w:sz w:val="22"/>
-          <w:szCs w:val="22"/>
-        </w:rPr>
-      </w:r>
     </w:p>
     <w:p>
       <w:pPr>
@@ -2477,6 +2449,7 @@
           <w:sz w:val="22"/>
           <w:szCs w:val="22"/>
         </w:rPr>
+        <w:lastRenderedPageBreak/>
         <w:t>4</w:t>
       </w:r>
       <w:r>
@@ -2550,13 +2523,13 @@
     <w:p>
       <w:pPr>
         <w:pStyle w:val="2"/>
+        <w:pageBreakBefore/>
         <w:ind w:firstLineChars="100" w:firstLine="220"/>
         <w:rPr>
           <w:rFonts w:ascii="ＭＳ Ｐ明朝" w:eastAsia="ＭＳ Ｐ明朝" w:hAnsi="ＭＳ Ｐ明朝" w:cs="Arial"/>
           <w:sz w:val="22"/>
           <w:szCs w:val="22"/>
         </w:rPr>
-        <w:pageBreakBefore/>
       </w:pPr>
       <w:bookmarkStart w:id="8" w:name="_Toc223971642"/>
       <w:r>
@@ -3989,13 +3962,6 @@
               </w:rPr>
               <w:t>円</w:t>
             </w:r>
-            <w:r>
-              <w:rPr>
-                <w:rFonts w:ascii="ＭＳ Ｐ明朝" w:eastAsia="ＭＳ Ｐ明朝" w:hAnsi="ＭＳ Ｐ明朝" w:cs="Arial"/>
-                <w:sz w:val="22"/>
-                <w:szCs w:val="22"/>
-              </w:rPr>
-            </w:r>
           </w:p>
           <w:p>
             <w:pPr>
@@ -4168,13 +4134,6 @@
                 <w:szCs w:val="22"/>
               </w:rPr>
               <w:t>日</w:t>
-            </w:r>
-            <w:r>
-              <w:rPr>
-                <w:rFonts w:ascii="ＭＳ Ｐ明朝" w:eastAsia="ＭＳ Ｐ明朝" w:hAnsi="ＭＳ Ｐ明朝" w:cs="Arial" w:hint="eastAsia"/>
-                <w:sz w:val="22"/>
-                <w:szCs w:val="22"/>
-              </w:rPr>
             </w:r>
           </w:p>
           <w:p>
@@ -5479,14 +5438,6 @@
               </w:rPr>
               <w:t>β）</w:t>
             </w:r>
-            <w:r>
-              <w:rPr>
-                <w:rFonts w:ascii="ＭＳ Ｐ明朝" w:eastAsia="ＭＳ Ｐ明朝" w:hAnsi="ＭＳ Ｐ明朝" w:cs="Arial" w:hint="eastAsia"/>
-                <w:color w:val="000000"/>
-                <w:sz w:val="22"/>
-                <w:szCs w:val="22"/>
-              </w:rPr>
-            </w:r>
           </w:p>
           <w:p>
             <w:pPr>
@@ -5944,16 +5895,16 @@
     <w:p>
       <w:pPr>
         <w:pStyle w:val="2"/>
+        <w:pageBreakBefore/>
         <w:ind w:firstLineChars="100" w:firstLine="220"/>
         <w:rPr>
           <w:rFonts w:ascii="ＭＳ Ｐ明朝" w:eastAsia="ＭＳ Ｐ明朝" w:hAnsi="ＭＳ Ｐ明朝" w:cs="Arial"/>
           <w:sz w:val="22"/>
           <w:szCs w:val="22"/>
         </w:rPr>
-        <w:pageBreakBefore/>
-      </w:pPr>
-      <w:bookmarkStart w:id="9" w:name="_Toc179738840"/>
-      <w:bookmarkStart w:id="10" w:name="_Toc223971643"/>
+      </w:pPr>
+      <w:bookmarkStart w:id="9" w:name="_Toc223971643"/>
+      <w:bookmarkStart w:id="10" w:name="_Toc179738840"/>
       <w:r>
         <w:rPr>
           <w:rFonts w:ascii="ＭＳ Ｐ明朝" w:eastAsia="ＭＳ Ｐ明朝" w:hAnsi="ＭＳ Ｐ明朝" w:cs="Arial"/>
@@ -5987,7 +5938,7 @@
         </w:rPr>
         <w:t>仮定</w:t>
       </w:r>
-      <w:bookmarkEnd w:id="10"/>
+      <w:bookmarkEnd w:id="9"/>
     </w:p>
     <w:p>
       <w:pPr>
@@ -6185,6 +6136,14 @@
       </w:r>
       <w:r>
         <w:rPr>
+          <w:rFonts w:ascii="ＭＳ Ｐ明朝" w:eastAsia="ＭＳ Ｐ明朝" w:hAnsi="ＭＳ Ｐ明朝" w:cs="Arial" w:hint="eastAsia"/>
+          <w:sz w:val="22"/>
+          <w:szCs w:val="22"/>
+        </w:rPr>
+        <w:t>り</w:t>
+      </w:r>
+      <w:r>
+        <w:rPr>
           <w:rFonts w:ascii="ＭＳ Ｐ明朝" w:eastAsia="ＭＳ Ｐ明朝" w:hAnsi="ＭＳ Ｐ明朝" w:cs="Arial"/>
           <w:sz w:val="22"/>
           <w:szCs w:val="22"/>
@@ -6450,8 +6409,8 @@
       <w:r>
         <w:rPr>
           <w:rFonts w:ascii="ＭＳ Ｐ明朝" w:eastAsia="ＭＳ Ｐ明朝" w:hAnsi="ＭＳ Ｐ明朝" w:cs="Arial" w:hint="eastAsia"/>
+          <w:sz w:val="22"/>
           <w:szCs w:val="21"/>
-          <w:sz w:val="22"/>
         </w:rPr>
         <w:t>。）。</w:t>
       </w:r>
@@ -6459,13 +6418,13 @@
     <w:p>
       <w:pPr>
         <w:pStyle w:val="2"/>
+        <w:pageBreakBefore/>
         <w:ind w:firstLineChars="100" w:firstLine="220"/>
         <w:rPr>
           <w:rFonts w:ascii="ＭＳ Ｐ明朝" w:eastAsia="ＭＳ Ｐ明朝" w:hAnsi="ＭＳ Ｐ明朝" w:cs="Arial"/>
           <w:sz w:val="22"/>
           <w:szCs w:val="22"/>
         </w:rPr>
-        <w:pageBreakBefore/>
       </w:pPr>
       <w:bookmarkStart w:id="11" w:name="_Toc223971644"/>
       <w:r>
@@ -6517,7 +6476,7 @@
         </w:rPr>
         <w:t>現在）</w:t>
       </w:r>
-      <w:bookmarkEnd w:id="9"/>
+      <w:bookmarkEnd w:id="10"/>
       <w:bookmarkEnd w:id="11"/>
     </w:p>
     <w:p>
@@ -6608,6 +6567,13 @@
           <w:szCs w:val="22"/>
         </w:rPr>
         <w:t>グループ</w:t>
+      </w:r>
+      <w:r>
+        <w:rPr>
+          <w:rFonts w:ascii="ＭＳ Ｐ明朝" w:eastAsia="ＭＳ Ｐ明朝" w:hAnsi="ＭＳ Ｐ明朝" w:cs="Arial" w:hint="eastAsia"/>
+          <w:sz w:val="22"/>
+          <w:szCs w:val="22"/>
+        </w:rPr>
         <w:br/>
       </w:r>
       <w:r>
@@ -6981,19 +6947,14 @@
     <w:p>
       <w:pPr>
         <w:pStyle w:val="2"/>
+        <w:pageBreakBefore/>
         <w:ind w:firstLineChars="100" w:firstLine="240"/>
         <w:rPr>
           <w:rFonts w:ascii="ＭＳ Ｐ明朝" w:eastAsia="ＭＳ Ｐ明朝" w:hAnsi="ＭＳ Ｐ明朝" w:cs="Arial"/>
           <w:sz w:val="22"/>
           <w:szCs w:val="22"/>
         </w:rPr>
-        <w:pageBreakBefore/>
-      </w:pPr>
-      <w:r>
-        <w:rPr>
-          <w:rFonts w:ascii="ＭＳ Ｐ明朝" w:eastAsia="ＭＳ Ｐ明朝" w:hAnsi="ＭＳ Ｐ明朝"/>
-        </w:rPr>
-      </w:r>
+      </w:pPr>
       <w:bookmarkStart w:id="12" w:name="_Toc223971645"/>
       <w:r>
         <w:rPr>
@@ -7145,13 +7106,6 @@
               </w:rPr>
               <w:t>●日</w:t>
             </w:r>
-            <w:r>
-              <w:rPr>
-                <w:rFonts w:ascii="ＭＳ Ｐ明朝" w:eastAsia="ＭＳ Ｐ明朝" w:hAnsi="ＭＳ Ｐ明朝" w:cs="Arial" w:hint="eastAsia"/>
-                <w:sz w:val="22"/>
-                <w:szCs w:val="22"/>
-              </w:rPr>
-            </w:r>
           </w:p>
         </w:tc>
       </w:tr>
@@ -7281,13 +7235,6 @@
               </w:rPr>
               <w:t>●個</w:t>
             </w:r>
-            <w:r>
-              <w:rPr>
-                <w:rFonts w:ascii="ＭＳ Ｐ明朝" w:eastAsia="ＭＳ Ｐ明朝" w:hAnsi="ＭＳ Ｐ明朝" w:cs="Arial" w:hint="eastAsia"/>
-                <w:sz w:val="22"/>
-                <w:szCs w:val="22"/>
-              </w:rPr>
-            </w:r>
           </w:p>
         </w:tc>
       </w:tr>
@@ -7353,13 +7300,6 @@
               </w:rPr>
               <w:t>●株</w:t>
             </w:r>
-            <w:r>
-              <w:rPr>
-                <w:rFonts w:ascii="ＭＳ Ｐ明朝" w:eastAsia="ＭＳ Ｐ明朝" w:hAnsi="ＭＳ Ｐ明朝" w:cs="Arial" w:hint="eastAsia"/>
-                <w:sz w:val="22"/>
-                <w:szCs w:val="22"/>
-              </w:rPr>
-            </w:r>
           </w:p>
         </w:tc>
       </w:tr>
@@ -7425,20 +7365,6 @@
               </w:rPr>
               <w:t>●円</w:t>
             </w:r>
-            <w:r>
-              <w:rPr>
-                <w:rFonts w:ascii="ＭＳ Ｐ明朝" w:eastAsia="ＭＳ Ｐ明朝" w:hAnsi="ＭＳ Ｐ明朝" w:cs="Arial"/>
-                <w:sz w:val="22"/>
-                <w:szCs w:val="22"/>
-              </w:rPr>
-            </w:r>
-            <w:r>
-              <w:rPr>
-                <w:rFonts w:ascii="ＭＳ Ｐ明朝" w:eastAsia="ＭＳ Ｐ明朝" w:hAnsi="ＭＳ Ｐ明朝" w:cs="Arial" w:hint="eastAsia"/>
-                <w:sz w:val="22"/>
-                <w:szCs w:val="22"/>
-              </w:rPr>
-            </w:r>
           </w:p>
         </w:tc>
       </w:tr>
@@ -7611,13 +7537,6 @@
               </w:rPr>
               <w:t>日</w:t>
             </w:r>
-            <w:r>
-              <w:rPr>
-                <w:rFonts w:ascii="ＭＳ Ｐ明朝" w:eastAsia="ＭＳ Ｐ明朝" w:hAnsi="ＭＳ Ｐ明朝" w:cs="Arial" w:hint="eastAsia"/>
-                <w:sz w:val="22"/>
-                <w:szCs w:val="22"/>
-              </w:rPr>
-            </w:r>
           </w:p>
         </w:tc>
       </w:tr>
@@ -7715,12 +7634,12 @@
     <w:p>
       <w:pPr>
         <w:pStyle w:val="1"/>
-        <w:rPr>
-          <w:rFonts w:ascii="ＭＳ Ｐ明朝" w:eastAsia="ＭＳ Ｐ明朝" w:hAnsi="ＭＳ Ｐ明朝" w:cs="Arial"/>
-        </w:rPr>
         <w:pageBreakBefore/>
-      </w:pPr>
-      <w:bookmarkStart w:id="14" w:name="_Toc223971646"/>
+        <w:rPr>
+          <w:rFonts w:ascii="ＭＳ Ｐ明朝" w:eastAsia="ＭＳ Ｐ明朝" w:hAnsi="ＭＳ Ｐ明朝" w:cs="Arial"/>
+        </w:rPr>
+      </w:pPr>
+      <w:bookmarkStart w:id="13" w:name="_Toc223971646"/>
       <w:r>
         <w:rPr>
           <w:rFonts w:ascii="ＭＳ Ｐ明朝" w:eastAsia="ＭＳ Ｐ明朝" w:hAnsi="ＭＳ Ｐ明朝" w:cs="ＭＳ ゴシック" w:hint="eastAsia"/>
@@ -7741,7 +7660,6 @@
         <w:t>算定の内容</w:t>
       </w:r>
       <w:bookmarkEnd w:id="13"/>
-      <w:bookmarkEnd w:id="14"/>
     </w:p>
     <w:p>
       <w:pPr>
@@ -7753,8 +7671,8 @@
           <w:szCs w:val="22"/>
         </w:rPr>
       </w:pPr>
-      <w:bookmarkStart w:id="15" w:name="_Toc179738844"/>
-      <w:bookmarkStart w:id="16" w:name="_Toc223971647"/>
+      <w:bookmarkStart w:id="14" w:name="_Toc179738844"/>
+      <w:bookmarkStart w:id="15" w:name="_Toc223971647"/>
       <w:r>
         <w:rPr>
           <w:rFonts w:ascii="ＭＳ Ｐ明朝" w:eastAsia="ＭＳ Ｐ明朝" w:hAnsi="ＭＳ Ｐ明朝" w:cs="Arial" w:hint="eastAsia"/>
@@ -7771,8 +7689,8 @@
         </w:rPr>
         <w:t>算定方法の選択</w:t>
       </w:r>
+      <w:bookmarkEnd w:id="14"/>
       <w:bookmarkEnd w:id="15"/>
-      <w:bookmarkEnd w:id="16"/>
     </w:p>
     <w:p>
       <w:pPr>
@@ -8234,8 +8152,8 @@
           <w:szCs w:val="22"/>
         </w:rPr>
       </w:pPr>
-      <w:bookmarkStart w:id="17" w:name="_Toc179738845"/>
-      <w:bookmarkStart w:id="18" w:name="_Toc223971648"/>
+      <w:bookmarkStart w:id="16" w:name="_Toc179738845"/>
+      <w:bookmarkStart w:id="17" w:name="_Toc223971648"/>
       <w:r>
         <w:rPr>
           <w:rFonts w:ascii="ＭＳ Ｐ明朝" w:eastAsia="ＭＳ Ｐ明朝" w:hAnsi="ＭＳ Ｐ明朝" w:cs="Arial" w:hint="eastAsia"/>
@@ -8252,8 +8170,8 @@
         </w:rPr>
         <w:t>モンテカルロ・シミュレーションによる算定方法</w:t>
       </w:r>
+      <w:bookmarkEnd w:id="16"/>
       <w:bookmarkEnd w:id="17"/>
-      <w:bookmarkEnd w:id="18"/>
     </w:p>
     <w:p>
       <w:pPr>
@@ -8289,7 +8207,7 @@
         </w:rPr>
         <w:t>につき、モンテカルロ・シミュレーションを利用し新株予約権の公正価値を算出いたしました。</w:t>
       </w:r>
-      <w:bookmarkStart w:id="19" w:name="_Toc179738846"/>
+      <w:bookmarkStart w:id="18" w:name="_Toc179738846"/>
     </w:p>
     <w:p>
       <w:pPr>
@@ -8489,7 +8407,7 @@
           <w:sz w:val="22"/>
           <w:szCs w:val="22"/>
         </w:rPr>
-        <w:object w:dxaOrig="3260" w:dyaOrig="640" w14:anchorId="610B483B">
+        <w:object w:dxaOrig="3260" w:dyaOrig="640" w14:anchorId="2B4AC6C9">
           <v:shapetype id="_x0000_t75" coordsize="21600,21600" o:spt="75" o:preferrelative="t" path="m@4@5l@4@11@9@11@9@5xe" filled="f" stroked="f">
             <v:stroke joinstyle="miter"/>
             <v:formulas>
@@ -8510,9 +8428,9 @@
             <o:lock v:ext="edit" aspectratio="t"/>
           </v:shapetype>
           <v:shape id="_x0000_i1027" type="#_x0000_t75" alt="" style="width:163pt;height:31pt;mso-width-percent:0;mso-height-percent:0;mso-width-percent:0;mso-height-percent:0" o:ole="">
-            <v:imagedata r:id="rId13" o:title=""/>
+            <v:imagedata r:id="rId9" o:title=""/>
           </v:shape>
-          <o:OLEObject Type="Embed" ProgID="Equation.3" ShapeID="_x0000_i1027" DrawAspect="Content" ObjectID="_1834584540" r:id="rId14"/>
+          <o:OLEObject Type="Embed" ProgID="Equation.3" ShapeID="_x0000_i1027" DrawAspect="Content" ObjectID="_1834645527" r:id="rId10"/>
         </w:object>
       </w:r>
     </w:p>
@@ -9571,7 +9489,23 @@
           <w:sz w:val="22"/>
           <w:szCs w:val="22"/>
         </w:rPr>
-        <w:t>任意取得請求（コーラブル）の行使タイミングをシミュレーションに組込みます。任意取得条項は、オプションの引受人が発行体に対して行使価格を異にするオプションを付与していることと同一であり、オプション料の公正価値を減ずる方向に働きます。また、新株予約権の行使により生じるキャシュフローの割引率として代替的資金調達コストを採用するものとし、その代替的資金調達コストを修正CAPMにより算出します。</w:t>
+        <w:t>任意取得請求（コーラブル）の行使タイミングをシミュレーションに組込みます。任意取得条項は、オプションの引受人が発行体に対して行使価格を異にするオプションを付与していることと同一であり、オプション料の公正価値を減ずる方向に働きます。また、新株予約権の行使により生じる</w:t>
+      </w:r>
+      <w:r>
+        <w:rPr>
+          <w:rFonts w:ascii="ＭＳ Ｐ明朝" w:eastAsia="ＭＳ Ｐ明朝" w:hAnsi="ＭＳ Ｐ明朝" w:cs="Arial" w:hint="eastAsia"/>
+          <w:sz w:val="22"/>
+          <w:szCs w:val="22"/>
+        </w:rPr>
+        <w:t>キャッ</w:t>
+      </w:r>
+      <w:r>
+        <w:rPr>
+          <w:rFonts w:ascii="ＭＳ Ｐ明朝" w:eastAsia="ＭＳ Ｐ明朝" w:hAnsi="ＭＳ Ｐ明朝" w:cs="Arial" w:hint="eastAsia"/>
+          <w:sz w:val="22"/>
+          <w:szCs w:val="22"/>
+        </w:rPr>
+        <w:t>シュフローの割引率として代替的資金調達コストを採用するものとし、その代替的資金調達コストを修正CAPMにより算出します。</w:t>
       </w:r>
       <w:r>
         <w:rPr>
@@ -9726,13 +9660,6 @@
           <w:szCs w:val="22"/>
         </w:rPr>
         <w:t>.83%</w:t>
-      </w:r>
-      <w:r>
-        <w:rPr>
-          <w:rFonts w:ascii="ＭＳ Ｐ明朝" w:eastAsia="ＭＳ Ｐ明朝" w:hAnsi="ＭＳ Ｐ明朝" w:cs="Arial"/>
-          <w:sz w:val="22"/>
-          <w:szCs w:val="22"/>
-        </w:rPr>
       </w:r>
     </w:p>
     <w:p>
@@ -9885,8 +9812,8 @@
           <w:szCs w:val="22"/>
         </w:rPr>
       </w:pPr>
-      <w:bookmarkStart w:id="20" w:name="_Toc179738848"/>
-      <w:bookmarkEnd w:id="19"/>
+      <w:bookmarkStart w:id="19" w:name="_Toc179738848"/>
+      <w:bookmarkEnd w:id="18"/>
       <w:r>
         <w:rPr>
           <w:rFonts w:ascii="ＭＳ Ｐ明朝" w:eastAsia="ＭＳ Ｐ明朝" w:hAnsi="ＭＳ Ｐ明朝" w:cs="Arial" w:hint="eastAsia"/>
@@ -9941,7 +9868,7 @@
           <w:sz w:val="22"/>
           <w:szCs w:val="22"/>
         </w:rPr>
-        <w:t>をモンテカルロ・シミュレーションに組込み</w:t>
+        <w:t>をモンテカルロ・シミュレーションに組込</w:t>
       </w:r>
       <w:r>
         <w:rPr>
@@ -9995,11 +9922,11 @@
           <w:sz w:val="22"/>
           <w:szCs w:val="22"/>
         </w:rPr>
-        <w:object w:dxaOrig="13" w:dyaOrig="13" w14:anchorId="21754F30">
+        <w:object w:dxaOrig="13" w:dyaOrig="13" w14:anchorId="2B92C374">
           <v:shape id="_x0000_i1026" type="#_x0000_t75" alt="" style="width:1pt;height:1pt;mso-width-percent:0;mso-height-percent:0;mso-width-percent:0;mso-height-percent:0" o:ole="">
-            <v:imagedata r:id="rId15" o:title=""/>
+            <v:imagedata r:id="rId11" o:title=""/>
           </v:shape>
-          <o:OLEObject Type="Embed" ProgID="Equation.3" ShapeID="_x0000_i1026" DrawAspect="Content" ObjectID="_1834584541" r:id="rId16"/>
+          <o:OLEObject Type="Embed" ProgID="Equation.3" ShapeID="_x0000_i1026" DrawAspect="Content" ObjectID="_1834645528" r:id="rId12"/>
         </w:object>
       </w:r>
       <w:r>
@@ -10010,11 +9937,11 @@
           <w:sz w:val="22"/>
           <w:szCs w:val="22"/>
         </w:rPr>
-        <w:object w:dxaOrig="13" w:dyaOrig="13" w14:anchorId="3F2C4B38">
+        <w:object w:dxaOrig="13" w:dyaOrig="13" w14:anchorId="315FD9B2">
           <v:shape id="_x0000_i1025" type="#_x0000_t75" alt="" style="width:1pt;height:1pt;mso-width-percent:0;mso-height-percent:0;mso-width-percent:0;mso-height-percent:0" o:ole="">
-            <v:imagedata r:id="rId17" o:title=""/>
+            <v:imagedata r:id="rId13" o:title=""/>
           </v:shape>
-          <o:OLEObject Type="Embed" ProgID="Equation.3" ShapeID="_x0000_i1025" DrawAspect="Content" ObjectID="_1834584542" r:id="rId18"/>
+          <o:OLEObject Type="Embed" ProgID="Equation.3" ShapeID="_x0000_i1025" DrawAspect="Content" ObjectID="_1834645529" r:id="rId14"/>
         </w:object>
       </w:r>
     </w:p>
@@ -10065,27 +9992,27 @@
     <w:p>
       <w:pPr>
         <w:pStyle w:val="1"/>
+        <w:pageBreakBefore/>
         <w:rPr>
           <w:rFonts w:ascii="ＭＳ Ｐ明朝" w:eastAsia="ＭＳ Ｐ明朝" w:hAnsi="ＭＳ Ｐ明朝"/>
         </w:rPr>
-        <w:pageBreakBefore/>
-      </w:pPr>
-      <w:bookmarkStart w:id="21" w:name="_Toc179738849"/>
-      <w:bookmarkStart w:id="22" w:name="_Toc179738850"/>
-      <w:bookmarkStart w:id="23" w:name="_Toc179739051"/>
-      <w:bookmarkStart w:id="24" w:name="_Toc179739556"/>
-      <w:bookmarkStart w:id="25" w:name="_Toc179740020"/>
-      <w:bookmarkStart w:id="26" w:name="_Toc179820944"/>
-      <w:bookmarkStart w:id="27" w:name="_Toc202953394"/>
-      <w:bookmarkStart w:id="28" w:name="_Toc214512983"/>
-      <w:bookmarkStart w:id="29" w:name="_Toc214972817"/>
-      <w:bookmarkStart w:id="30" w:name="_Toc215363632"/>
-      <w:bookmarkStart w:id="31" w:name="_Toc302701031"/>
-      <w:bookmarkStart w:id="32" w:name="_Toc304998013"/>
-      <w:bookmarkStart w:id="33" w:name="_Toc305032218"/>
-      <w:bookmarkStart w:id="34" w:name="_Toc305037235"/>
-      <w:bookmarkStart w:id="35" w:name="_Toc223971649"/>
-      <w:bookmarkEnd w:id="20"/>
+      </w:pPr>
+      <w:bookmarkStart w:id="20" w:name="_Toc179738849"/>
+      <w:bookmarkStart w:id="21" w:name="_Toc179738850"/>
+      <w:bookmarkStart w:id="22" w:name="_Toc179739051"/>
+      <w:bookmarkStart w:id="23" w:name="_Toc179739556"/>
+      <w:bookmarkStart w:id="24" w:name="_Toc179740020"/>
+      <w:bookmarkStart w:id="25" w:name="_Toc179820944"/>
+      <w:bookmarkStart w:id="26" w:name="_Toc202953394"/>
+      <w:bookmarkStart w:id="27" w:name="_Toc214512983"/>
+      <w:bookmarkStart w:id="28" w:name="_Toc214972817"/>
+      <w:bookmarkStart w:id="29" w:name="_Toc215363632"/>
+      <w:bookmarkStart w:id="30" w:name="_Toc302701031"/>
+      <w:bookmarkStart w:id="31" w:name="_Toc304998013"/>
+      <w:bookmarkStart w:id="32" w:name="_Toc305032218"/>
+      <w:bookmarkStart w:id="33" w:name="_Toc305037235"/>
+      <w:bookmarkStart w:id="34" w:name="_Toc223971649"/>
+      <w:bookmarkEnd w:id="19"/>
       <w:r>
         <w:rPr>
           <w:rFonts w:ascii="ＭＳ Ｐ明朝" w:eastAsia="ＭＳ Ｐ明朝" w:hAnsi="ＭＳ Ｐ明朝" w:cs="ＭＳ ゴシック" w:hint="eastAsia"/>
@@ -10099,6 +10026,7 @@
         </w:rPr>
         <w:t xml:space="preserve">　本報告書の利用に当たっての留意事項</w:t>
       </w:r>
+      <w:bookmarkEnd w:id="20"/>
       <w:bookmarkEnd w:id="21"/>
       <w:bookmarkEnd w:id="22"/>
       <w:bookmarkEnd w:id="23"/>
@@ -10113,7 +10041,6 @@
       <w:bookmarkEnd w:id="32"/>
       <w:bookmarkEnd w:id="33"/>
       <w:bookmarkEnd w:id="34"/>
-      <w:bookmarkEnd w:id="35"/>
     </w:p>
     <w:p>
       <w:pPr>
@@ -10162,10 +10089,10 @@
       </w:r>
     </w:p>
     <w:sectPr>
-      <w:headerReference w:type="even" r:id="rId19"/>
-      <w:headerReference w:type="default" r:id="rId20"/>
-      <w:footerReference w:type="default" r:id="rId21"/>
-      <w:headerReference w:type="first" r:id="rId22"/>
+      <w:headerReference w:type="even" r:id="rId15"/>
+      <w:headerReference w:type="default" r:id="rId16"/>
+      <w:footerReference w:type="default" r:id="rId17"/>
+      <w:headerReference w:type="first" r:id="rId18"/>
       <w:pgSz w:w="11906" w:h="16838" w:code="9"/>
       <w:pgMar w:top="1985" w:right="1701" w:bottom="1701" w:left="1701" w:header="851" w:footer="992" w:gutter="0"/>
       <w:pgNumType w:start="1"/>
@@ -10196,43 +10123,6 @@
 </file>
 
 <file path=word/footer1.xml><?xml version="1.0" encoding="utf-8"?>
-<w:ftr xmlns:wpc="http://schemas.microsoft.com/office/word/2010/wordprocessingCanvas" xmlns:cx="http://schemas.microsoft.com/office/drawing/2014/chartex" xmlns:cx1="http://schemas.microsoft.com/office/drawing/2015/9/8/chartex" xmlns:cx2="http://schemas.microsoft.com/office/drawing/2015/10/21/chartex" xmlns:cx3="http://schemas.microsoft.com/office/drawing/2016/5/9/chartex" xmlns:cx4="http://schemas.microsoft.com/office/drawing/2016/5/10/chartex" xmlns:cx5="http://schemas.microsoft.com/office/drawing/2016/5/11/chartex" xmlns:cx6="http://schemas.microsoft.com/office/drawing/2016/5/12/chartex" xmlns:cx7="http://schemas.microsoft.com/office/drawing/2016/5/13/chartex" xmlns:cx8="http://schemas.microsoft.com/office/drawing/2016/5/14/chartex" xmlns:mc="http://schemas.openxmlformats.org/markup-compatibility/2006" xmlns:aink="http://schemas.microsoft.com/office/drawing/2016/ink" xmlns:am3d="http://schemas.microsoft.com/office/drawing/2017/model3d" xmlns:o="urn:schemas-microsoft-com:office:office" xmlns:oel="http://schemas.microsoft.com/office/2019/extlst" xmlns:r="http://schemas.openxmlformats.org/officeDocument/2006/relationships" xmlns:m="http://schemas.openxmlformats.org/officeDocument/2006/math" xmlns:v="urn:schemas-microsoft-com:vml" xmlns:wp14="http://schemas.microsoft.com/office/word/2010/wordprocessingDrawing" xmlns:wp="http://schemas.openxmlformats.org/drawingml/2006/wordprocessingDrawing" xmlns:w10="urn:schemas-microsoft-com:office:word" xmlns:w="http://schemas.openxmlformats.org/wordprocessingml/2006/main" xmlns:w14="http://schemas.microsoft.com/office/word/2010/wordml" xmlns:w15="http://schemas.microsoft.com/office/word/2012/wordml" xmlns:w16cex="http://schemas.microsoft.com/office/word/2018/wordml/cex" xmlns:w16cid="http://schemas.microsoft.com/office/word/2016/wordml/cid" xmlns:w16="http://schemas.microsoft.com/office/word/2018/wordml" xmlns:w16du="http://schemas.microsoft.com/office/word/2023/wordml/word16du" xmlns:w16sdtdh="http://schemas.microsoft.com/office/word/2020/wordml/sdtdatahash" xmlns:w16sdtfl="http://schemas.microsoft.com/office/word/2024/wordml/sdtformatlock" xmlns:w16se="http://schemas.microsoft.com/office/word/2015/wordml/symex" xmlns:wpg="http://schemas.microsoft.com/office/word/2010/wordprocessingGroup" xmlns:wpi="http://schemas.microsoft.com/office/word/2010/wordprocessingInk" xmlns:wne="http://schemas.microsoft.com/office/word/2006/wordml" xmlns:wps="http://schemas.microsoft.com/office/word/2010/wordprocessingShape" mc:Ignorable="w14 w15 w16se w16cid w16 w16cex w16sdtdh w16sdtfl w16du wp14">
-  <w:p>
-    <w:pPr>
-      <w:pStyle w:val="ad"/>
-      <w:framePr w:wrap="around" w:vAnchor="text" w:hAnchor="margin" w:xAlign="center" w:y="1"/>
-      <w:rPr>
-        <w:rStyle w:val="ae"/>
-      </w:rPr>
-    </w:pPr>
-    <w:r>
-      <w:rPr>
-        <w:rStyle w:val="ae"/>
-      </w:rPr>
-      <w:fldChar w:fldCharType="begin"/>
-    </w:r>
-    <w:r>
-      <w:rPr>
-        <w:rStyle w:val="ae"/>
-      </w:rPr>
-      <w:instrText xml:space="preserve">PAGE  </w:instrText>
-    </w:r>
-    <w:r>
-      <w:rPr>
-        <w:rStyle w:val="ae"/>
-      </w:rPr>
-      <w:fldChar w:fldCharType="end"/>
-    </w:r>
-  </w:p>
-  <w:p>
-    <w:pPr>
-      <w:pStyle w:val="ad"/>
-    </w:pPr>
-  </w:p>
-</w:ftr>
-</file>
-
-<file path=word/footer2.xml><?xml version="1.0" encoding="utf-8"?>
 <w:ftr xmlns:wpc="http://schemas.microsoft.com/office/word/2010/wordprocessingCanvas" xmlns:cx="http://schemas.microsoft.com/office/drawing/2014/chartex" xmlns:cx1="http://schemas.microsoft.com/office/drawing/2015/9/8/chartex" xmlns:cx2="http://schemas.microsoft.com/office/drawing/2015/10/21/chartex" xmlns:cx3="http://schemas.microsoft.com/office/drawing/2016/5/9/chartex" xmlns:cx4="http://schemas.microsoft.com/office/drawing/2016/5/10/chartex" xmlns:cx5="http://schemas.microsoft.com/office/drawing/2016/5/11/chartex" xmlns:cx6="http://schemas.microsoft.com/office/drawing/2016/5/12/chartex" xmlns:cx7="http://schemas.microsoft.com/office/drawing/2016/5/13/chartex" xmlns:cx8="http://schemas.microsoft.com/office/drawing/2016/5/14/chartex" xmlns:mc="http://schemas.openxmlformats.org/markup-compatibility/2006" xmlns:aink="http://schemas.microsoft.com/office/drawing/2016/ink" xmlns:am3d="http://schemas.microsoft.com/office/drawing/2017/model3d" xmlns:o="urn:schemas-microsoft-com:office:office" xmlns:oel="http://schemas.microsoft.com/office/2019/extlst" xmlns:r="http://schemas.openxmlformats.org/officeDocument/2006/relationships" xmlns:m="http://schemas.openxmlformats.org/officeDocument/2006/math" xmlns:v="urn:schemas-microsoft-com:vml" xmlns:wp14="http://schemas.microsoft.com/office/word/2010/wordprocessingDrawing" xmlns:wp="http://schemas.openxmlformats.org/drawingml/2006/wordprocessingDrawing" xmlns:w10="urn:schemas-microsoft-com:office:word" xmlns:w="http://schemas.openxmlformats.org/wordprocessingml/2006/main" xmlns:w14="http://schemas.microsoft.com/office/word/2010/wordml" xmlns:w15="http://schemas.microsoft.com/office/word/2012/wordml" xmlns:w16cex="http://schemas.microsoft.com/office/word/2018/wordml/cex" xmlns:w16cid="http://schemas.microsoft.com/office/word/2016/wordml/cid" xmlns:w16="http://schemas.microsoft.com/office/word/2018/wordml" xmlns:w16du="http://schemas.microsoft.com/office/word/2023/wordml/word16du" xmlns:w16sdtdh="http://schemas.microsoft.com/office/word/2020/wordml/sdtdatahash" xmlns:w16sdtfl="http://schemas.microsoft.com/office/word/2024/wordml/sdtformatlock" xmlns:w16se="http://schemas.microsoft.com/office/word/2015/wordml/symex" xmlns:wpg="http://schemas.microsoft.com/office/word/2010/wordprocessingGroup" xmlns:wpi="http://schemas.microsoft.com/office/word/2010/wordprocessingInk" xmlns:wne="http://schemas.microsoft.com/office/word/2006/wordml" xmlns:wps="http://schemas.microsoft.com/office/word/2010/wordprocessingShape" mc:Ignorable="w14 w15 w16se w16cid w16 w16cex w16sdtdh w16sdtfl w16du wp14">
   <w:p>
     <w:pPr>
@@ -10317,169 +10207,7 @@
       <w:rPr>
         <w:noProof/>
       </w:rPr>
-      <w:pict w14:anchorId="65F466BF">
-        <v:shapetype id="_x0000_t136" coordsize="21600,21600" o:spt="136" adj="10800" path="m@7,l@8,m@5,21600l@6,21600e">
-          <v:formulas>
-            <v:f eqn="sum #0 0 10800"/>
-            <v:f eqn="prod #0 2 1"/>
-            <v:f eqn="sum 21600 0 @1"/>
-            <v:f eqn="sum 0 0 @2"/>
-            <v:f eqn="sum 21600 0 @3"/>
-            <v:f eqn="if @0 @3 0"/>
-            <v:f eqn="if @0 21600 @1"/>
-            <v:f eqn="if @0 0 @2"/>
-            <v:f eqn="if @0 @4 21600"/>
-            <v:f eqn="mid @5 @6"/>
-            <v:f eqn="mid @8 @5"/>
-            <v:f eqn="mid @7 @8"/>
-            <v:f eqn="mid @6 @7"/>
-            <v:f eqn="sum @6 0 @5"/>
-          </v:formulas>
-          <v:path textpathok="t" o:connecttype="custom" o:connectlocs="@9,0;@10,10800;@11,21600;@12,10800" o:connectangles="270,180,90,0"/>
-          <v:textpath on="t" fitshape="t"/>
-          <v:handles>
-            <v:h position="#0,bottomRight" xrange="6629,14971"/>
-          </v:handles>
-          <o:lock v:ext="edit" text="t" shapetype="t"/>
-        </v:shapetype>
-        <v:shape id="PowerPlusWaterMarkObject15238563" o:spid="_x0000_s1030" type="#_x0000_t136" alt="" style="position:absolute;margin-left:0;margin-top:0;width:428.2pt;height:171.25pt;rotation:315;z-index:-251655168;mso-wrap-edited:f;mso-width-percent:0;mso-height-percent:0;mso-position-horizontal:center;mso-position-horizontal-relative:margin;mso-position-vertical:center;mso-position-vertical-relative:margin;mso-width-percent:0;mso-height-percent:0" o:allowincell="f" fillcolor="silver" stroked="f">
-          <v:fill opacity=".5"/>
-          <v:textpath style="font-family:&quot;ＭＳ 明朝&quot;;font-size:1pt;v-text-reverse:t" string="DRAFT"/>
-          <w10:wrap anchorx="margin" anchory="margin"/>
-        </v:shape>
-      </w:pict>
-    </w:r>
-  </w:p>
-</w:hdr>
-</file>
-
-<file path=word/header2.xml><?xml version="1.0" encoding="utf-8"?>
-<w:hdr xmlns:wpc="http://schemas.microsoft.com/office/word/2010/wordprocessingCanvas" xmlns:cx="http://schemas.microsoft.com/office/drawing/2014/chartex" xmlns:cx1="http://schemas.microsoft.com/office/drawing/2015/9/8/chartex" xmlns:cx2="http://schemas.microsoft.com/office/drawing/2015/10/21/chartex" xmlns:cx3="http://schemas.microsoft.com/office/drawing/2016/5/9/chartex" xmlns:cx4="http://schemas.microsoft.com/office/drawing/2016/5/10/chartex" xmlns:cx5="http://schemas.microsoft.com/office/drawing/2016/5/11/chartex" xmlns:cx6="http://schemas.microsoft.com/office/drawing/2016/5/12/chartex" xmlns:cx7="http://schemas.microsoft.com/office/drawing/2016/5/13/chartex" xmlns:cx8="http://schemas.microsoft.com/office/drawing/2016/5/14/chartex" xmlns:mc="http://schemas.openxmlformats.org/markup-compatibility/2006" xmlns:aink="http://schemas.microsoft.com/office/drawing/2016/ink" xmlns:am3d="http://schemas.microsoft.com/office/drawing/2017/model3d" xmlns:o="urn:schemas-microsoft-com:office:office" xmlns:oel="http://schemas.microsoft.com/office/2019/extlst" xmlns:r="http://schemas.openxmlformats.org/officeDocument/2006/relationships" xmlns:m="http://schemas.openxmlformats.org/officeDocument/2006/math" xmlns:v="urn:schemas-microsoft-com:vml" xmlns:wp14="http://schemas.microsoft.com/office/word/2010/wordprocessingDrawing" xmlns:wp="http://schemas.openxmlformats.org/drawingml/2006/wordprocessingDrawing" xmlns:w10="urn:schemas-microsoft-com:office:word" xmlns:w="http://schemas.openxmlformats.org/wordprocessingml/2006/main" xmlns:w14="http://schemas.microsoft.com/office/word/2010/wordml" xmlns:w15="http://schemas.microsoft.com/office/word/2012/wordml" xmlns:w16cex="http://schemas.microsoft.com/office/word/2018/wordml/cex" xmlns:w16cid="http://schemas.microsoft.com/office/word/2016/wordml/cid" xmlns:w16="http://schemas.microsoft.com/office/word/2018/wordml" xmlns:w16du="http://schemas.microsoft.com/office/word/2023/wordml/word16du" xmlns:w16sdtdh="http://schemas.microsoft.com/office/word/2020/wordml/sdtdatahash" xmlns:w16sdtfl="http://schemas.microsoft.com/office/word/2024/wordml/sdtformatlock" xmlns:w16se="http://schemas.microsoft.com/office/word/2015/wordml/symex" xmlns:wpg="http://schemas.microsoft.com/office/word/2010/wordprocessingGroup" xmlns:wpi="http://schemas.microsoft.com/office/word/2010/wordprocessingInk" xmlns:wne="http://schemas.microsoft.com/office/word/2006/wordml" xmlns:wps="http://schemas.microsoft.com/office/word/2010/wordprocessingShape" mc:Ignorable="w14 w15 w16se w16cid w16 w16cex w16sdtdh w16sdtfl w16du wp14">
-  <w:p>
-    <w:pPr>
-      <w:pStyle w:val="ab"/>
-    </w:pPr>
-    <w:r>
-      <w:rPr>
-        <w:noProof/>
-      </w:rPr>
-      <w:pict w14:anchorId="4AEB168F">
-        <v:shapetype id="_x0000_t136" coordsize="21600,21600" o:spt="136" adj="10800" path="m@7,l@8,m@5,21600l@6,21600e">
-          <v:formulas>
-            <v:f eqn="sum #0 0 10800"/>
-            <v:f eqn="prod #0 2 1"/>
-            <v:f eqn="sum 21600 0 @1"/>
-            <v:f eqn="sum 0 0 @2"/>
-            <v:f eqn="sum 21600 0 @3"/>
-            <v:f eqn="if @0 @3 0"/>
-            <v:f eqn="if @0 21600 @1"/>
-            <v:f eqn="if @0 0 @2"/>
-            <v:f eqn="if @0 @4 21600"/>
-            <v:f eqn="mid @5 @6"/>
-            <v:f eqn="mid @8 @5"/>
-            <v:f eqn="mid @7 @8"/>
-            <v:f eqn="mid @6 @7"/>
-            <v:f eqn="sum @6 0 @5"/>
-          </v:formulas>
-          <v:path textpathok="t" o:connecttype="custom" o:connectlocs="@9,0;@10,10800;@11,21600;@12,10800" o:connectangles="270,180,90,0"/>
-          <v:textpath on="t" fitshape="t"/>
-          <v:handles>
-            <v:h position="#0,bottomRight" xrange="6629,14971"/>
-          </v:handles>
-          <o:lock v:ext="edit" text="t" shapetype="t"/>
-        </v:shapetype>
-        <v:shape id="PowerPlusWaterMarkObject15238564" o:spid="_x0000_s1029" type="#_x0000_t136" alt="" style="position:absolute;margin-left:0;margin-top:0;width:428.2pt;height:171.25pt;rotation:315;z-index:-251653120;mso-wrap-edited:f;mso-width-percent:0;mso-height-percent:0;mso-position-horizontal:center;mso-position-horizontal-relative:margin;mso-position-vertical:center;mso-position-vertical-relative:margin;mso-width-percent:0;mso-height-percent:0" o:allowincell="f" fillcolor="silver" stroked="f">
-          <v:fill opacity=".5"/>
-          <v:textpath style="font-family:&quot;ＭＳ 明朝&quot;;font-size:1pt;v-text-reverse:t" string="DRAFT"/>
-          <w10:wrap anchorx="margin" anchory="margin"/>
-        </v:shape>
-      </w:pict>
-    </w:r>
-    <w:r>
-      <w:rPr>
-        <w:rFonts w:hint="eastAsia"/>
-      </w:rPr>
-      <w:t xml:space="preserve">　</w:t>
-    </w:r>
-    <w:r>
-      <w:rPr>
-        <w:rFonts w:hint="eastAsia"/>
-      </w:rPr>
-      <w:tab/>
-    </w:r>
-    <w:r>
-      <w:rPr>
-        <w:rFonts w:hint="eastAsia"/>
-      </w:rPr>
-      <w:tab/>
-    </w:r>
-    <w:r>
-      <w:rPr>
-        <w:rFonts w:hint="eastAsia"/>
-      </w:rPr>
-      <w:t xml:space="preserve">　　　　　　　　　</w:t>
-    </w:r>
-  </w:p>
-</w:hdr>
-</file>
-
-<file path=word/header3.xml><?xml version="1.0" encoding="utf-8"?>
-<w:hdr xmlns:wpc="http://schemas.microsoft.com/office/word/2010/wordprocessingCanvas" xmlns:cx="http://schemas.microsoft.com/office/drawing/2014/chartex" xmlns:cx1="http://schemas.microsoft.com/office/drawing/2015/9/8/chartex" xmlns:cx2="http://schemas.microsoft.com/office/drawing/2015/10/21/chartex" xmlns:cx3="http://schemas.microsoft.com/office/drawing/2016/5/9/chartex" xmlns:cx4="http://schemas.microsoft.com/office/drawing/2016/5/10/chartex" xmlns:cx5="http://schemas.microsoft.com/office/drawing/2016/5/11/chartex" xmlns:cx6="http://schemas.microsoft.com/office/drawing/2016/5/12/chartex" xmlns:cx7="http://schemas.microsoft.com/office/drawing/2016/5/13/chartex" xmlns:cx8="http://schemas.microsoft.com/office/drawing/2016/5/14/chartex" xmlns:mc="http://schemas.openxmlformats.org/markup-compatibility/2006" xmlns:aink="http://schemas.microsoft.com/office/drawing/2016/ink" xmlns:am3d="http://schemas.microsoft.com/office/drawing/2017/model3d" xmlns:o="urn:schemas-microsoft-com:office:office" xmlns:oel="http://schemas.microsoft.com/office/2019/extlst" xmlns:r="http://schemas.openxmlformats.org/officeDocument/2006/relationships" xmlns:m="http://schemas.openxmlformats.org/officeDocument/2006/math" xmlns:v="urn:schemas-microsoft-com:vml" xmlns:wp14="http://schemas.microsoft.com/office/word/2010/wordprocessingDrawing" xmlns:wp="http://schemas.openxmlformats.org/drawingml/2006/wordprocessingDrawing" xmlns:w10="urn:schemas-microsoft-com:office:word" xmlns:w="http://schemas.openxmlformats.org/wordprocessingml/2006/main" xmlns:w14="http://schemas.microsoft.com/office/word/2010/wordml" xmlns:w15="http://schemas.microsoft.com/office/word/2012/wordml" xmlns:w16cex="http://schemas.microsoft.com/office/word/2018/wordml/cex" xmlns:w16cid="http://schemas.microsoft.com/office/word/2016/wordml/cid" xmlns:w16="http://schemas.microsoft.com/office/word/2018/wordml" xmlns:w16du="http://schemas.microsoft.com/office/word/2023/wordml/word16du" xmlns:w16sdtdh="http://schemas.microsoft.com/office/word/2020/wordml/sdtdatahash" xmlns:w16sdtfl="http://schemas.microsoft.com/office/word/2024/wordml/sdtformatlock" xmlns:w16se="http://schemas.microsoft.com/office/word/2015/wordml/symex" xmlns:wpg="http://schemas.microsoft.com/office/word/2010/wordprocessingGroup" xmlns:wpi="http://schemas.microsoft.com/office/word/2010/wordprocessingInk" xmlns:wne="http://schemas.microsoft.com/office/word/2006/wordml" xmlns:wps="http://schemas.microsoft.com/office/word/2010/wordprocessingShape" mc:Ignorable="w14 w15 w16se w16cid w16 w16cex w16sdtdh w16sdtfl w16du wp14">
-  <w:p>
-    <w:pPr>
-      <w:pStyle w:val="ab"/>
-    </w:pPr>
-    <w:r>
-      <w:rPr>
-        <w:noProof/>
-      </w:rPr>
-      <w:pict w14:anchorId="14EE537D">
-        <v:shapetype id="_x0000_t136" coordsize="21600,21600" o:spt="136" adj="10800" path="m@7,l@8,m@5,21600l@6,21600e">
-          <v:formulas>
-            <v:f eqn="sum #0 0 10800"/>
-            <v:f eqn="prod #0 2 1"/>
-            <v:f eqn="sum 21600 0 @1"/>
-            <v:f eqn="sum 0 0 @2"/>
-            <v:f eqn="sum 21600 0 @3"/>
-            <v:f eqn="if @0 @3 0"/>
-            <v:f eqn="if @0 21600 @1"/>
-            <v:f eqn="if @0 0 @2"/>
-            <v:f eqn="if @0 @4 21600"/>
-            <v:f eqn="mid @5 @6"/>
-            <v:f eqn="mid @8 @5"/>
-            <v:f eqn="mid @7 @8"/>
-            <v:f eqn="mid @6 @7"/>
-            <v:f eqn="sum @6 0 @5"/>
-          </v:formulas>
-          <v:path textpathok="t" o:connecttype="custom" o:connectlocs="@9,0;@10,10800;@11,21600;@12,10800" o:connectangles="270,180,90,0"/>
-          <v:textpath on="t" fitshape="t"/>
-          <v:handles>
-            <v:h position="#0,bottomRight" xrange="6629,14971"/>
-          </v:handles>
-          <o:lock v:ext="edit" text="t" shapetype="t"/>
-        </v:shapetype>
-        <v:shape id="PowerPlusWaterMarkObject15238562" o:spid="_x0000_s1028" type="#_x0000_t136" alt="" style="position:absolute;margin-left:0;margin-top:0;width:428.2pt;height:171.25pt;rotation:315;z-index:-251657216;mso-wrap-edited:f;mso-width-percent:0;mso-height-percent:0;mso-position-horizontal:center;mso-position-horizontal-relative:margin;mso-position-vertical:center;mso-position-vertical-relative:margin;mso-width-percent:0;mso-height-percent:0" o:allowincell="f" fillcolor="silver" stroked="f">
-          <v:fill opacity=".5"/>
-          <v:textpath style="font-family:&quot;ＭＳ 明朝&quot;;font-size:1pt;v-text-reverse:t" string="DRAFT"/>
-          <w10:wrap anchorx="margin" anchory="margin"/>
-        </v:shape>
-      </w:pict>
-    </w:r>
-  </w:p>
-</w:hdr>
-</file>
-
-<file path=word/header4.xml><?xml version="1.0" encoding="utf-8"?>
-<w:hdr xmlns:wpc="http://schemas.microsoft.com/office/word/2010/wordprocessingCanvas" xmlns:cx="http://schemas.microsoft.com/office/drawing/2014/chartex" xmlns:cx1="http://schemas.microsoft.com/office/drawing/2015/9/8/chartex" xmlns:cx2="http://schemas.microsoft.com/office/drawing/2015/10/21/chartex" xmlns:cx3="http://schemas.microsoft.com/office/drawing/2016/5/9/chartex" xmlns:cx4="http://schemas.microsoft.com/office/drawing/2016/5/10/chartex" xmlns:cx5="http://schemas.microsoft.com/office/drawing/2016/5/11/chartex" xmlns:cx6="http://schemas.microsoft.com/office/drawing/2016/5/12/chartex" xmlns:cx7="http://schemas.microsoft.com/office/drawing/2016/5/13/chartex" xmlns:cx8="http://schemas.microsoft.com/office/drawing/2016/5/14/chartex" xmlns:mc="http://schemas.openxmlformats.org/markup-compatibility/2006" xmlns:aink="http://schemas.microsoft.com/office/drawing/2016/ink" xmlns:am3d="http://schemas.microsoft.com/office/drawing/2017/model3d" xmlns:o="urn:schemas-microsoft-com:office:office" xmlns:oel="http://schemas.microsoft.com/office/2019/extlst" xmlns:r="http://schemas.openxmlformats.org/officeDocument/2006/relationships" xmlns:m="http://schemas.openxmlformats.org/officeDocument/2006/math" xmlns:v="urn:schemas-microsoft-com:vml" xmlns:wp14="http://schemas.microsoft.com/office/word/2010/wordprocessingDrawing" xmlns:wp="http://schemas.openxmlformats.org/drawingml/2006/wordprocessingDrawing" xmlns:w10="urn:schemas-microsoft-com:office:word" xmlns:w="http://schemas.openxmlformats.org/wordprocessingml/2006/main" xmlns:w14="http://schemas.microsoft.com/office/word/2010/wordml" xmlns:w15="http://schemas.microsoft.com/office/word/2012/wordml" xmlns:w16cex="http://schemas.microsoft.com/office/word/2018/wordml/cex" xmlns:w16cid="http://schemas.microsoft.com/office/word/2016/wordml/cid" xmlns:w16="http://schemas.microsoft.com/office/word/2018/wordml" xmlns:w16du="http://schemas.microsoft.com/office/word/2023/wordml/word16du" xmlns:w16sdtdh="http://schemas.microsoft.com/office/word/2020/wordml/sdtdatahash" xmlns:w16sdtfl="http://schemas.microsoft.com/office/word/2024/wordml/sdtformatlock" xmlns:w16se="http://schemas.microsoft.com/office/word/2015/wordml/symex" xmlns:wpg="http://schemas.microsoft.com/office/word/2010/wordprocessingGroup" xmlns:wpi="http://schemas.microsoft.com/office/word/2010/wordprocessingInk" xmlns:wne="http://schemas.microsoft.com/office/word/2006/wordml" xmlns:wps="http://schemas.microsoft.com/office/word/2010/wordprocessingShape" mc:Ignorable="w14 w15 w16se w16cid w16 w16cex w16sdtdh w16sdtfl w16du wp14">
-  <w:p>
-    <w:pPr>
-      <w:pStyle w:val="ab"/>
-    </w:pPr>
-    <w:r>
-      <w:rPr>
-        <w:noProof/>
-      </w:rPr>
-      <w:pict w14:anchorId="7F8219A3">
+      <w:pict w14:anchorId="763EE0CB">
         <v:shapetype id="_x0000_t136" coordsize="21600,21600" o:spt="136" adj="10800" path="m@7,l@8,m@5,21600l@6,21600e">
           <v:formulas>
             <v:f eqn="sum #0 0 10800"/>
@@ -10515,7 +10243,7 @@
 </w:hdr>
 </file>
 
-<file path=word/header5.xml><?xml version="1.0" encoding="utf-8"?>
+<file path=word/header2.xml><?xml version="1.0" encoding="utf-8"?>
 <w:hdr xmlns:wpc="http://schemas.microsoft.com/office/word/2010/wordprocessingCanvas" xmlns:cx="http://schemas.microsoft.com/office/drawing/2014/chartex" xmlns:cx1="http://schemas.microsoft.com/office/drawing/2015/9/8/chartex" xmlns:cx2="http://schemas.microsoft.com/office/drawing/2015/10/21/chartex" xmlns:cx3="http://schemas.microsoft.com/office/drawing/2016/5/9/chartex" xmlns:cx4="http://schemas.microsoft.com/office/drawing/2016/5/10/chartex" xmlns:cx5="http://schemas.microsoft.com/office/drawing/2016/5/11/chartex" xmlns:cx6="http://schemas.microsoft.com/office/drawing/2016/5/12/chartex" xmlns:cx7="http://schemas.microsoft.com/office/drawing/2016/5/13/chartex" xmlns:cx8="http://schemas.microsoft.com/office/drawing/2016/5/14/chartex" xmlns:mc="http://schemas.openxmlformats.org/markup-compatibility/2006" xmlns:aink="http://schemas.microsoft.com/office/drawing/2016/ink" xmlns:am3d="http://schemas.microsoft.com/office/drawing/2017/model3d" xmlns:o="urn:schemas-microsoft-com:office:office" xmlns:oel="http://schemas.microsoft.com/office/2019/extlst" xmlns:r="http://schemas.openxmlformats.org/officeDocument/2006/relationships" xmlns:m="http://schemas.openxmlformats.org/officeDocument/2006/math" xmlns:v="urn:schemas-microsoft-com:vml" xmlns:wp14="http://schemas.microsoft.com/office/word/2010/wordprocessingDrawing" xmlns:wp="http://schemas.openxmlformats.org/drawingml/2006/wordprocessingDrawing" xmlns:w10="urn:schemas-microsoft-com:office:word" xmlns:w="http://schemas.openxmlformats.org/wordprocessingml/2006/main" xmlns:w14="http://schemas.microsoft.com/office/word/2010/wordml" xmlns:w15="http://schemas.microsoft.com/office/word/2012/wordml" xmlns:w16cex="http://schemas.microsoft.com/office/word/2018/wordml/cex" xmlns:w16cid="http://schemas.microsoft.com/office/word/2016/wordml/cid" xmlns:w16="http://schemas.microsoft.com/office/word/2018/wordml" xmlns:w16du="http://schemas.microsoft.com/office/word/2023/wordml/word16du" xmlns:w16sdtdh="http://schemas.microsoft.com/office/word/2020/wordml/sdtdatahash" xmlns:w16sdtfl="http://schemas.microsoft.com/office/word/2024/wordml/sdtformatlock" xmlns:w16se="http://schemas.microsoft.com/office/word/2015/wordml/symex" xmlns:wpg="http://schemas.microsoft.com/office/word/2010/wordprocessingGroup" xmlns:wpi="http://schemas.microsoft.com/office/word/2010/wordprocessingInk" xmlns:wne="http://schemas.microsoft.com/office/word/2006/wordml" xmlns:wps="http://schemas.microsoft.com/office/word/2010/wordprocessingShape" mc:Ignorable="w14 w15 w16se w16cid w16 w16cex w16sdtdh w16sdtfl w16du wp14">
   <w:p>
     <w:pPr>
@@ -10525,7 +10253,7 @@
       <w:rPr>
         <w:noProof/>
       </w:rPr>
-      <w:pict w14:anchorId="47524EB7">
+      <w:pict w14:anchorId="7983B2C8">
         <v:shapetype id="_x0000_t136" coordsize="21600,21600" o:spt="136" adj="10800" path="m@7,l@8,m@5,21600l@6,21600e">
           <v:formulas>
             <v:f eqn="sum #0 0 10800"/>
@@ -10585,7 +10313,7 @@
 </w:hdr>
 </file>
 
-<file path=word/header6.xml><?xml version="1.0" encoding="utf-8"?>
+<file path=word/header3.xml><?xml version="1.0" encoding="utf-8"?>
 <w:hdr xmlns:wpc="http://schemas.microsoft.com/office/word/2010/wordprocessingCanvas" xmlns:cx="http://schemas.microsoft.com/office/drawing/2014/chartex" xmlns:cx1="http://schemas.microsoft.com/office/drawing/2015/9/8/chartex" xmlns:cx2="http://schemas.microsoft.com/office/drawing/2015/10/21/chartex" xmlns:cx3="http://schemas.microsoft.com/office/drawing/2016/5/9/chartex" xmlns:cx4="http://schemas.microsoft.com/office/drawing/2016/5/10/chartex" xmlns:cx5="http://schemas.microsoft.com/office/drawing/2016/5/11/chartex" xmlns:cx6="http://schemas.microsoft.com/office/drawing/2016/5/12/chartex" xmlns:cx7="http://schemas.microsoft.com/office/drawing/2016/5/13/chartex" xmlns:cx8="http://schemas.microsoft.com/office/drawing/2016/5/14/chartex" xmlns:mc="http://schemas.openxmlformats.org/markup-compatibility/2006" xmlns:aink="http://schemas.microsoft.com/office/drawing/2016/ink" xmlns:am3d="http://schemas.microsoft.com/office/drawing/2017/model3d" xmlns:o="urn:schemas-microsoft-com:office:office" xmlns:oel="http://schemas.microsoft.com/office/2019/extlst" xmlns:r="http://schemas.openxmlformats.org/officeDocument/2006/relationships" xmlns:m="http://schemas.openxmlformats.org/officeDocument/2006/math" xmlns:v="urn:schemas-microsoft-com:vml" xmlns:wp14="http://schemas.microsoft.com/office/word/2010/wordprocessingDrawing" xmlns:wp="http://schemas.openxmlformats.org/drawingml/2006/wordprocessingDrawing" xmlns:w10="urn:schemas-microsoft-com:office:word" xmlns:w="http://schemas.openxmlformats.org/wordprocessingml/2006/main" xmlns:w14="http://schemas.microsoft.com/office/word/2010/wordml" xmlns:w15="http://schemas.microsoft.com/office/word/2012/wordml" xmlns:w16cex="http://schemas.microsoft.com/office/word/2018/wordml/cex" xmlns:w16cid="http://schemas.microsoft.com/office/word/2016/wordml/cid" xmlns:w16="http://schemas.microsoft.com/office/word/2018/wordml" xmlns:w16du="http://schemas.microsoft.com/office/word/2023/wordml/word16du" xmlns:w16sdtdh="http://schemas.microsoft.com/office/word/2020/wordml/sdtdatahash" xmlns:w16sdtfl="http://schemas.microsoft.com/office/word/2024/wordml/sdtformatlock" xmlns:w16se="http://schemas.microsoft.com/office/word/2015/wordml/symex" xmlns:wpg="http://schemas.microsoft.com/office/word/2010/wordprocessingGroup" xmlns:wpi="http://schemas.microsoft.com/office/word/2010/wordprocessingInk" xmlns:wne="http://schemas.microsoft.com/office/word/2006/wordml" xmlns:wps="http://schemas.microsoft.com/office/word/2010/wordprocessingShape" mc:Ignorable="w14 w15 w16se w16cid w16 w16cex w16sdtdh w16sdtfl w16du wp14">
   <w:p>
     <w:pPr>
@@ -10595,7 +10323,7 @@
       <w:rPr>
         <w:noProof/>
       </w:rPr>
-      <w:pict w14:anchorId="3E0618C1">
+      <w:pict w14:anchorId="2A3859A6">
         <v:shapetype id="_x0000_t136" coordsize="21600,21600" o:spt="136" adj="10800" path="m@7,l@8,m@5,21600l@6,21600e">
           <v:formulas>
             <v:f eqn="sum #0 0 10800"/>

</xml_diff>